<commit_message>
docs: updated Structure and Design notes
</commit_message>
<xml_diff>
--- a/docs/Design notes.docx
+++ b/docs/Design notes.docx
@@ -3,11 +3,21 @@
 <w:document xmlns:wpc="http://schemas.microsoft.com/office/word/2010/wordprocessingCanvas" xmlns:cx="http://schemas.microsoft.com/office/drawing/2014/chartex" xmlns:cx1="http://schemas.microsoft.com/office/drawing/2015/9/8/chartex" xmlns:cx2="http://schemas.microsoft.com/office/drawing/2015/10/21/chartex" xmlns:cx3="http://schemas.microsoft.com/office/drawing/2016/5/9/chartex" xmlns:cx4="http://schemas.microsoft.com/office/drawing/2016/5/10/chartex" xmlns:cx5="http://schemas.microsoft.com/office/drawing/2016/5/11/chartex" xmlns:cx6="http://schemas.microsoft.com/office/drawing/2016/5/12/chartex" xmlns:cx7="http://schemas.microsoft.com/office/drawing/2016/5/13/chartex" xmlns:cx8="http://schemas.microsoft.com/office/drawing/2016/5/14/chartex" xmlns:mc="http://schemas.openxmlformats.org/markup-compatibility/2006" xmlns:aink="http://schemas.microsoft.com/office/drawing/2016/ink" xmlns:am3d="http://schemas.microsoft.com/office/drawing/2017/model3d" xmlns:o="urn:schemas-microsoft-com:office:office" xmlns:oel="http://schemas.microsoft.com/office/2019/extlst" xmlns:r="http://schemas.openxmlformats.org/officeDocument/2006/relationships" xmlns:m="http://schemas.openxmlformats.org/officeDocument/2006/math" xmlns:v="urn:schemas-microsoft-com:vml" xmlns:wp14="http://schemas.microsoft.com/office/word/2010/wordprocessingDrawing" xmlns:wp="http://schemas.openxmlformats.org/drawingml/2006/wordprocessingDrawing" xmlns:w10="urn:schemas-microsoft-com:office:word" xmlns:w="http://schemas.openxmlformats.org/wordprocessingml/2006/main" xmlns:w14="http://schemas.microsoft.com/office/word/2010/wordml" xmlns:w15="http://schemas.microsoft.com/office/word/2012/wordml" xmlns:w16cex="http://schemas.microsoft.com/office/word/2018/wordml/cex" xmlns:w16cid="http://schemas.microsoft.com/office/word/2016/wordml/cid" xmlns:w16="http://schemas.microsoft.com/office/word/2018/wordml" xmlns:w16du="http://schemas.microsoft.com/office/word/2023/wordml/word16du" xmlns:w16sdtdh="http://schemas.microsoft.com/office/word/2020/wordml/sdtdatahash" xmlns:w16sdtfl="http://schemas.microsoft.com/office/word/2024/wordml/sdtformatlock" xmlns:w16se="http://schemas.microsoft.com/office/word/2015/wordml/symex" xmlns:wpg="http://schemas.microsoft.com/office/word/2010/wordprocessingGroup" xmlns:wpi="http://schemas.microsoft.com/office/word/2010/wordprocessingInk" xmlns:wne="http://schemas.microsoft.com/office/word/2006/wordml" xmlns:wps="http://schemas.microsoft.com/office/word/2010/wordprocessingShape" mc:Ignorable="w14 w15 w16se w16cid w16 w16cex w16sdtdh w16sdtfl w16du wp14">
   <w:body>
     <w:p>
-      <w:r>
-        <w:t xml:space="preserve">Things to </w:t>
-      </w:r>
-      <w:r>
-        <w:t>consider during development:</w:t>
+      <w:pPr>
+        <w:ind w:left="720" w:hanging="360"/>
+        <w:rPr>
+          <w:b/>
+          <w:bCs/>
+          <w:u w:val="single"/>
+        </w:rPr>
+      </w:pPr>
+      <w:r>
+        <w:rPr>
+          <w:b/>
+          <w:bCs/>
+          <w:u w:val="single"/>
+        </w:rPr>
+        <w:t>Overall Design Notes</w:t>
       </w:r>
     </w:p>
     <w:p>
@@ -122,13 +132,7 @@
         </w:numPr>
       </w:pPr>
       <w:r>
-        <w:t xml:space="preserve">Some thought is going to have to be given to how to deal with segmented images. Are segments treated as an image of size y * x with integer values defining segment locations? </w:t>
-      </w:r>
-      <w:r>
-        <w:t>Is each segment treated like its own sub-image (like channels or z-slices)?</w:t>
-      </w:r>
-      <w:r>
-        <w:t xml:space="preserve"> Is a segmented image treated as the original image with an added layer defining the segments? Leaning towards the first option, but the other options may have advantages in specific situations.</w:t>
+        <w:t>Some thought is going to have to be given to how to deal with segmented images. Are segments treated as an image of size y * x with integer values defining segment locations? Is each segment treated like its own sub-image (like channels or z-slices)? Is a segmented image treated as the original image with an added layer defining the segments? Leaning towards the first option, but the other options may have advantages in specific situations.</w:t>
       </w:r>
     </w:p>
     <w:p>
@@ -233,6 +237,296 @@
       <w:proofErr w:type="spellEnd"/>
       <w:r>
         <w:t>, if the user is trying to squeeze a 3 * 1024 * 1024 image into a function that requires a 1 * 1024 * 1024 image, or an integer image into a function that requires a binarized input, highlight potential functions that can be used to fit the image to the required shape).</w:t>
+      </w:r>
+    </w:p>
+    <w:p/>
+    <w:p>
+      <w:pPr>
+        <w:rPr>
+          <w:b/>
+          <w:bCs/>
+          <w:u w:val="single"/>
+        </w:rPr>
+      </w:pPr>
+      <w:r>
+        <w:rPr>
+          <w:b/>
+          <w:bCs/>
+          <w:u w:val="single"/>
+        </w:rPr>
+        <w:t>Class design notes</w:t>
+      </w:r>
+    </w:p>
+    <w:p>
+      <w:pPr>
+        <w:pStyle w:val="ListParagraph"/>
+        <w:numPr>
+          <w:ilvl w:val="0"/>
+          <w:numId w:val="2"/>
+        </w:numPr>
+        <w:rPr>
+          <w:b/>
+          <w:bCs/>
+          <w:u w:val="single"/>
+        </w:rPr>
+      </w:pPr>
+      <w:r>
+        <w:t>Dimension class:</w:t>
+      </w:r>
+    </w:p>
+    <w:p>
+      <w:pPr>
+        <w:pStyle w:val="ListParagraph"/>
+        <w:numPr>
+          <w:ilvl w:val="1"/>
+          <w:numId w:val="2"/>
+        </w:numPr>
+      </w:pPr>
+      <w:r>
+        <w:t xml:space="preserve">In images, need to know which dimension of the </w:t>
+      </w:r>
+      <w:proofErr w:type="spellStart"/>
+      <w:proofErr w:type="gramStart"/>
+      <w:r>
+        <w:t>np.array</w:t>
+      </w:r>
+      <w:proofErr w:type="spellEnd"/>
+      <w:proofErr w:type="gramEnd"/>
+      <w:r>
+        <w:t xml:space="preserve"> holds C or Z.</w:t>
+      </w:r>
+    </w:p>
+    <w:p>
+      <w:pPr>
+        <w:pStyle w:val="ListParagraph"/>
+        <w:numPr>
+          <w:ilvl w:val="1"/>
+          <w:numId w:val="2"/>
+        </w:numPr>
+      </w:pPr>
+      <w:r>
+        <w:t xml:space="preserve">Therefore </w:t>
+      </w:r>
+      <w:proofErr w:type="spellStart"/>
+      <w:r>
+        <w:t>image_shape</w:t>
+      </w:r>
+      <w:proofErr w:type="spellEnd"/>
+      <w:r>
+        <w:t xml:space="preserve"> class has </w:t>
+      </w:r>
+      <w:proofErr w:type="spellStart"/>
+      <w:r>
+        <w:t>c_dim</w:t>
+      </w:r>
+      <w:proofErr w:type="spellEnd"/>
+      <w:r>
+        <w:t xml:space="preserve">, </w:t>
+      </w:r>
+      <w:proofErr w:type="spellStart"/>
+      <w:r>
+        <w:t>z_dim</w:t>
+      </w:r>
+      <w:proofErr w:type="spellEnd"/>
+      <w:r>
+        <w:t xml:space="preserve">, </w:t>
+      </w:r>
+      <w:proofErr w:type="spellStart"/>
+      <w:r>
+        <w:t>y_dim</w:t>
+      </w:r>
+      <w:proofErr w:type="spellEnd"/>
+      <w:r>
+        <w:t xml:space="preserve">, </w:t>
+      </w:r>
+      <w:proofErr w:type="spellStart"/>
+      <w:r>
+        <w:t>x_dim</w:t>
+      </w:r>
+      <w:proofErr w:type="spellEnd"/>
+    </w:p>
+    <w:p>
+      <w:pPr>
+        <w:pStyle w:val="ListParagraph"/>
+        <w:numPr>
+          <w:ilvl w:val="1"/>
+          <w:numId w:val="2"/>
+        </w:numPr>
+      </w:pPr>
+      <w:r>
+        <w:t>Image class itself needs to be able to iterate through c, iterate through z, iterate through y and iterate through x.</w:t>
+      </w:r>
+    </w:p>
+    <w:p>
+      <w:pPr>
+        <w:pStyle w:val="ListParagraph"/>
+        <w:numPr>
+          <w:ilvl w:val="1"/>
+          <w:numId w:val="2"/>
+        </w:numPr>
+      </w:pPr>
+      <w:r>
+        <w:t xml:space="preserve">The images returned </w:t>
+      </w:r>
+      <w:proofErr w:type="spellStart"/>
+      <w:r>
+        <w:t>form</w:t>
+      </w:r>
+      <w:proofErr w:type="spellEnd"/>
+      <w:r>
+        <w:t xml:space="preserve"> these iterations need their own </w:t>
+      </w:r>
+      <w:proofErr w:type="spellStart"/>
+      <w:r>
+        <w:t>image_shape</w:t>
+      </w:r>
+      <w:proofErr w:type="spellEnd"/>
+      <w:r>
+        <w:t xml:space="preserve"> class (</w:t>
+      </w:r>
+      <w:proofErr w:type="spellStart"/>
+      <w:r>
+        <w:t>i.e</w:t>
+      </w:r>
+      <w:proofErr w:type="spellEnd"/>
+      <w:r>
+        <w:t xml:space="preserve">, an image iterated through z slices will have an </w:t>
+      </w:r>
+      <w:proofErr w:type="spellStart"/>
+      <w:r>
+        <w:t>image_shape</w:t>
+      </w:r>
+      <w:proofErr w:type="spellEnd"/>
+      <w:r>
+        <w:t xml:space="preserve"> class with z = -1 - so can then iterate through channels and so on.</w:t>
+      </w:r>
+    </w:p>
+    <w:p>
+      <w:pPr>
+        <w:pStyle w:val="ListParagraph"/>
+        <w:numPr>
+          <w:ilvl w:val="1"/>
+          <w:numId w:val="2"/>
+        </w:numPr>
+      </w:pPr>
+      <w:r>
+        <w:t xml:space="preserve">The output from a function will be an image, this will have its own </w:t>
+      </w:r>
+      <w:proofErr w:type="spellStart"/>
+      <w:r>
+        <w:t>image_shape</w:t>
+      </w:r>
+      <w:proofErr w:type="spellEnd"/>
+      <w:r>
+        <w:t xml:space="preserve"> class so that role of a function is dealt with here.</w:t>
+      </w:r>
+    </w:p>
+    <w:p>
+      <w:pPr>
+        <w:pStyle w:val="ListParagraph"/>
+        <w:numPr>
+          <w:ilvl w:val="1"/>
+          <w:numId w:val="2"/>
+        </w:numPr>
+      </w:pPr>
+      <w:r>
+        <w:t xml:space="preserve">The constraints on </w:t>
+      </w:r>
+      <w:proofErr w:type="gramStart"/>
+      <w:r>
+        <w:t>an</w:t>
+      </w:r>
+      <w:proofErr w:type="gramEnd"/>
+      <w:r>
+        <w:t xml:space="preserve"> </w:t>
+      </w:r>
+      <w:r>
+        <w:t>node</w:t>
+      </w:r>
+      <w:r>
+        <w:t xml:space="preserve"> will</w:t>
+      </w:r>
+      <w:r>
+        <w:t xml:space="preserve"> also use this</w:t>
+      </w:r>
+      <w:r>
+        <w:t xml:space="preserve"> class</w:t>
+      </w:r>
+      <w:r>
+        <w:t>.</w:t>
+      </w:r>
+      <w:r>
+        <w:t xml:space="preserve"> </w:t>
+      </w:r>
+      <w:r>
+        <w:t>N</w:t>
+      </w:r>
+      <w:r>
+        <w:t xml:space="preserve">ode inputs </w:t>
+      </w:r>
+      <w:r>
+        <w:t xml:space="preserve">can </w:t>
+      </w:r>
+      <w:r>
+        <w:t xml:space="preserve">be "I need 1 channel, I don't care about x, I don't care about Y, I don't care about z" - this can fit into </w:t>
+      </w:r>
+      <w:proofErr w:type="spellStart"/>
+      <w:r>
+        <w:t>image_shape</w:t>
+      </w:r>
+      <w:proofErr w:type="spellEnd"/>
+      <w:r>
+        <w:t xml:space="preserve"> class as C = 1, y = x = z = -1.</w:t>
+      </w:r>
+    </w:p>
+    <w:p>
+      <w:pPr>
+        <w:pStyle w:val="ListParagraph"/>
+        <w:numPr>
+          <w:ilvl w:val="1"/>
+          <w:numId w:val="2"/>
+        </w:numPr>
+      </w:pPr>
+      <w:r>
+        <w:t xml:space="preserve">This will also fit for outputs, given currently anticipated effects that a function will have. Either output dimensions are the same or they are </w:t>
+      </w:r>
+      <w:r>
+        <w:t xml:space="preserve">reduced to 1. </w:t>
+      </w:r>
+      <w:proofErr w:type="gramStart"/>
+      <w:r>
+        <w:t>So</w:t>
+      </w:r>
+      <w:proofErr w:type="gramEnd"/>
+      <w:r>
+        <w:t xml:space="preserve"> outputs could be "-1" for no change or "1" for changed to 1, "2" to </w:t>
+      </w:r>
+      <w:proofErr w:type="spellStart"/>
+      <w:r>
+        <w:t>changed</w:t>
+      </w:r>
+      <w:proofErr w:type="spellEnd"/>
+      <w:r>
+        <w:t xml:space="preserve"> to 2.</w:t>
+      </w:r>
+      <w:r>
+        <w:t xml:space="preserve"> There’s a slight possibility of needing to use strings </w:t>
+      </w:r>
+      <w:r>
+        <w:lastRenderedPageBreak/>
+        <w:t>for other operations “-</w:t>
+      </w:r>
+      <w:r>
+        <w:t>3</w:t>
+      </w:r>
+      <w:r>
+        <w:t>” or “/6”</w:t>
+      </w:r>
+      <w:r>
+        <w:t xml:space="preserve"> etc</w:t>
+      </w:r>
+      <w:r>
+        <w:t>, at which point this class may need rethinking.</w:t>
       </w:r>
     </w:p>
     <w:sectPr>
@@ -360,8 +654,124 @@
       </w:rPr>
     </w:lvl>
   </w:abstractNum>
+  <w:abstractNum w:abstractNumId="1" w15:restartNumberingAfterBreak="0">
+    <w:nsid w:val="2B521BFD"/>
+    <w:multiLevelType w:val="hybridMultilevel"/>
+    <w:tmpl w:val="DA2E99D8"/>
+    <w:lvl w:ilvl="0" w:tplc="08090001">
+      <w:start w:val="1"/>
+      <w:numFmt w:val="bullet"/>
+      <w:lvlText w:val=""/>
+      <w:lvlJc w:val="left"/>
+      <w:pPr>
+        <w:ind w:left="720" w:hanging="360"/>
+      </w:pPr>
+      <w:rPr>
+        <w:rFonts w:ascii="Symbol" w:hAnsi="Symbol" w:hint="default"/>
+      </w:rPr>
+    </w:lvl>
+    <w:lvl w:ilvl="1" w:tplc="08090003">
+      <w:start w:val="1"/>
+      <w:numFmt w:val="bullet"/>
+      <w:lvlText w:val="o"/>
+      <w:lvlJc w:val="left"/>
+      <w:pPr>
+        <w:ind w:left="1440" w:hanging="360"/>
+      </w:pPr>
+      <w:rPr>
+        <w:rFonts w:ascii="Courier New" w:hAnsi="Courier New" w:cs="Courier New" w:hint="default"/>
+      </w:rPr>
+    </w:lvl>
+    <w:lvl w:ilvl="2" w:tplc="08090005" w:tentative="1">
+      <w:start w:val="1"/>
+      <w:numFmt w:val="bullet"/>
+      <w:lvlText w:val=""/>
+      <w:lvlJc w:val="left"/>
+      <w:pPr>
+        <w:ind w:left="2160" w:hanging="360"/>
+      </w:pPr>
+      <w:rPr>
+        <w:rFonts w:ascii="Wingdings" w:hAnsi="Wingdings" w:hint="default"/>
+      </w:rPr>
+    </w:lvl>
+    <w:lvl w:ilvl="3" w:tplc="08090001" w:tentative="1">
+      <w:start w:val="1"/>
+      <w:numFmt w:val="bullet"/>
+      <w:lvlText w:val=""/>
+      <w:lvlJc w:val="left"/>
+      <w:pPr>
+        <w:ind w:left="2880" w:hanging="360"/>
+      </w:pPr>
+      <w:rPr>
+        <w:rFonts w:ascii="Symbol" w:hAnsi="Symbol" w:hint="default"/>
+      </w:rPr>
+    </w:lvl>
+    <w:lvl w:ilvl="4" w:tplc="08090003" w:tentative="1">
+      <w:start w:val="1"/>
+      <w:numFmt w:val="bullet"/>
+      <w:lvlText w:val="o"/>
+      <w:lvlJc w:val="left"/>
+      <w:pPr>
+        <w:ind w:left="3600" w:hanging="360"/>
+      </w:pPr>
+      <w:rPr>
+        <w:rFonts w:ascii="Courier New" w:hAnsi="Courier New" w:cs="Courier New" w:hint="default"/>
+      </w:rPr>
+    </w:lvl>
+    <w:lvl w:ilvl="5" w:tplc="08090005" w:tentative="1">
+      <w:start w:val="1"/>
+      <w:numFmt w:val="bullet"/>
+      <w:lvlText w:val=""/>
+      <w:lvlJc w:val="left"/>
+      <w:pPr>
+        <w:ind w:left="4320" w:hanging="360"/>
+      </w:pPr>
+      <w:rPr>
+        <w:rFonts w:ascii="Wingdings" w:hAnsi="Wingdings" w:hint="default"/>
+      </w:rPr>
+    </w:lvl>
+    <w:lvl w:ilvl="6" w:tplc="08090001" w:tentative="1">
+      <w:start w:val="1"/>
+      <w:numFmt w:val="bullet"/>
+      <w:lvlText w:val=""/>
+      <w:lvlJc w:val="left"/>
+      <w:pPr>
+        <w:ind w:left="5040" w:hanging="360"/>
+      </w:pPr>
+      <w:rPr>
+        <w:rFonts w:ascii="Symbol" w:hAnsi="Symbol" w:hint="default"/>
+      </w:rPr>
+    </w:lvl>
+    <w:lvl w:ilvl="7" w:tplc="08090003" w:tentative="1">
+      <w:start w:val="1"/>
+      <w:numFmt w:val="bullet"/>
+      <w:lvlText w:val="o"/>
+      <w:lvlJc w:val="left"/>
+      <w:pPr>
+        <w:ind w:left="5760" w:hanging="360"/>
+      </w:pPr>
+      <w:rPr>
+        <w:rFonts w:ascii="Courier New" w:hAnsi="Courier New" w:cs="Courier New" w:hint="default"/>
+      </w:rPr>
+    </w:lvl>
+    <w:lvl w:ilvl="8" w:tplc="08090005" w:tentative="1">
+      <w:start w:val="1"/>
+      <w:numFmt w:val="bullet"/>
+      <w:lvlText w:val=""/>
+      <w:lvlJc w:val="left"/>
+      <w:pPr>
+        <w:ind w:left="6480" w:hanging="360"/>
+      </w:pPr>
+      <w:rPr>
+        <w:rFonts w:ascii="Wingdings" w:hAnsi="Wingdings" w:hint="default"/>
+      </w:rPr>
+    </w:lvl>
+  </w:abstractNum>
   <w:num w:numId="1" w16cid:durableId="464857354">
     <w:abstractNumId w:val="0"/>
+  </w:num>
+  <w:num w:numId="2" w16cid:durableId="2132094706">
+    <w:abstractNumId w:val="1"/>
   </w:num>
 </w:numbering>
 </file>

</xml_diff>

<commit_message>
docs: updated Design notes and Structure
</commit_message>
<xml_diff>
--- a/docs/Design notes.docx
+++ b/docs/Design notes.docx
@@ -4,7 +4,6 @@
   <w:body>
     <w:p>
       <w:pPr>
-        <w:ind w:left="720" w:hanging="360"/>
         <w:rPr>
           <w:b/>
           <w:bCs/>
@@ -17,7 +16,381 @@
           <w:bCs/>
           <w:u w:val="single"/>
         </w:rPr>
-        <w:t>Overall Design Notes</w:t>
+        <w:t>Plans</w:t>
+      </w:r>
+    </w:p>
+    <w:p>
+      <w:r>
+        <w:t xml:space="preserve">Over the last 10 years, a lot of my </w:t>
+      </w:r>
+      <w:r>
+        <w:t>research has been based on image analysis. I have developed my own workflows using one or a combination of FIJI, Python and C#. With the ease of high-definition microscopy at various levels, thorough, repeatable and robust image analysis is becoming more and more important – even with the advent of AI, there will always be a role for classical image analysis. However, getting into analysing your own images can have quite a high barrier to entry. This is exacerbated by some of the weaknesses in the image analysis tools mentioned above:</w:t>
+      </w:r>
+    </w:p>
+    <w:p>
+      <w:pPr>
+        <w:pStyle w:val="ListParagraph"/>
+        <w:numPr>
+          <w:ilvl w:val="0"/>
+          <w:numId w:val="3"/>
+        </w:numPr>
+      </w:pPr>
+      <w:r>
+        <w:t>It’s hard to compare the output to the input, particularly when stringing together multiple steps.</w:t>
+      </w:r>
+    </w:p>
+    <w:p>
+      <w:pPr>
+        <w:pStyle w:val="ListParagraph"/>
+        <w:numPr>
+          <w:ilvl w:val="0"/>
+          <w:numId w:val="3"/>
+        </w:numPr>
+      </w:pPr>
+      <w:r>
+        <w:t>It’s difficult to know what tools are out there – you might think you have complex needs when what you’re trying to do is a solved problem and can be done in a single step.</w:t>
+      </w:r>
+    </w:p>
+    <w:p>
+      <w:pPr>
+        <w:pStyle w:val="ListParagraph"/>
+        <w:numPr>
+          <w:ilvl w:val="0"/>
+          <w:numId w:val="3"/>
+        </w:numPr>
+      </w:pPr>
+      <w:r>
+        <w:t>Particularly when getting into coding for image analysis, it can be very difficult to get different functions to talk to one another. Frequently, the challenge is in understanding how to manipulate the image into the correct format and dimensions for a particular function. Once, you’ve done that, the actual analysis is simple.</w:t>
+      </w:r>
+    </w:p>
+    <w:p>
+      <w:r>
+        <w:t>With that in mind, I’ve got three main aims to this software:</w:t>
+      </w:r>
+    </w:p>
+    <w:p>
+      <w:pPr>
+        <w:pStyle w:val="ListParagraph"/>
+        <w:numPr>
+          <w:ilvl w:val="0"/>
+          <w:numId w:val="5"/>
+        </w:numPr>
+      </w:pPr>
+      <w:r>
+        <w:t>It needs to be educational by easing users into the image analysis tools that are available.</w:t>
+      </w:r>
+    </w:p>
+    <w:p>
+      <w:pPr>
+        <w:pStyle w:val="ListParagraph"/>
+        <w:numPr>
+          <w:ilvl w:val="0"/>
+          <w:numId w:val="5"/>
+        </w:numPr>
+      </w:pPr>
+      <w:r>
+        <w:t xml:space="preserve">It needs to be intuitive, </w:t>
+      </w:r>
+      <w:r>
+        <w:t>with a simple UI where the same actions will always lead to the same effects.</w:t>
+      </w:r>
+    </w:p>
+    <w:p>
+      <w:pPr>
+        <w:pStyle w:val="ListParagraph"/>
+        <w:numPr>
+          <w:ilvl w:val="0"/>
+          <w:numId w:val="5"/>
+        </w:numPr>
+      </w:pPr>
+      <w:r>
+        <w:t>It needs to have a large, well-structured and well-documented list of functions. To aid this, it needs to be easily expandable.</w:t>
+      </w:r>
+    </w:p>
+    <w:p>
+      <w:r>
+        <w:t>This will be done by allowing the user to use drag-and-drop nodes and connections to draw an image analysis workflow. A pair of input/output images will allow immediate comparison between the original image and the changes at each step.</w:t>
+      </w:r>
+    </w:p>
+    <w:p>
+      <w:pPr>
+        <w:pStyle w:val="ListParagraph"/>
+        <w:ind w:left="780"/>
+      </w:pPr>
+    </w:p>
+    <w:p>
+      <w:pPr>
+        <w:pStyle w:val="ListParagraph"/>
+        <w:ind w:left="0"/>
+        <w:rPr>
+          <w:b/>
+          <w:bCs/>
+          <w:u w:val="single"/>
+        </w:rPr>
+      </w:pPr>
+      <w:r>
+        <w:rPr>
+          <w:b/>
+          <w:bCs/>
+          <w:u w:val="single"/>
+        </w:rPr>
+        <w:t>Educational</w:t>
+      </w:r>
+    </w:p>
+    <w:p>
+      <w:pPr>
+        <w:pStyle w:val="ListParagraph"/>
+        <w:ind w:left="0"/>
+        <w:rPr>
+          <w:b/>
+          <w:bCs/>
+          <w:u w:val="single"/>
+        </w:rPr>
+      </w:pPr>
+    </w:p>
+    <w:p>
+      <w:pPr>
+        <w:pStyle w:val="ListParagraph"/>
+        <w:ind w:left="0"/>
+      </w:pPr>
+      <w:r>
+        <w:t>To be educational, it should not place unnecessary barriers to learning. This means things like conversions between data types and transposition of dimensions should be dealt with behind the scenes, EXCEPT where they are directly relevant to proper image analysis (for example, trying to do binary processes on non-binarised data).</w:t>
+      </w:r>
+    </w:p>
+    <w:p>
+      <w:pPr>
+        <w:pStyle w:val="ListParagraph"/>
+        <w:ind w:left="0"/>
+      </w:pPr>
+    </w:p>
+    <w:p>
+      <w:pPr>
+        <w:pStyle w:val="ListParagraph"/>
+        <w:ind w:left="0"/>
+      </w:pPr>
+      <w:r>
+        <w:t>Feedback should be immediate, so adding a new process into the workflow, or changing a parameter, will update the images so the user can see its effect.</w:t>
+      </w:r>
+    </w:p>
+    <w:p>
+      <w:pPr>
+        <w:pStyle w:val="ListParagraph"/>
+        <w:ind w:left="0"/>
+      </w:pPr>
+    </w:p>
+    <w:p>
+      <w:pPr>
+        <w:pStyle w:val="ListParagraph"/>
+        <w:ind w:left="0"/>
+      </w:pPr>
+      <w:r>
+        <w:lastRenderedPageBreak/>
+        <w:t>Image analysis processes will be categorised in such a way that the user can get some idea of what they do before trying them, and documented so that it’s easy to learn what they do and how they work.</w:t>
+      </w:r>
+    </w:p>
+    <w:p>
+      <w:pPr>
+        <w:pStyle w:val="ListParagraph"/>
+        <w:ind w:left="0"/>
+      </w:pPr>
+    </w:p>
+    <w:p>
+      <w:pPr>
+        <w:pStyle w:val="ListParagraph"/>
+        <w:ind w:left="0"/>
+      </w:pPr>
+      <w:r>
+        <w:t>You shouldn’t have to do something unrelated to image analysis (ie, learn to code) to analyse images. At the same time, it should provide the tools to develop the user’s ability to use code in image analysis. An end goal is to have the option to export the user’s image analysis workflow to functional, documented python code.</w:t>
+      </w:r>
+    </w:p>
+    <w:p>
+      <w:pPr>
+        <w:pStyle w:val="ListParagraph"/>
+        <w:ind w:left="0"/>
+      </w:pPr>
+    </w:p>
+    <w:p>
+      <w:pPr>
+        <w:pStyle w:val="ListParagraph"/>
+        <w:ind w:left="0"/>
+      </w:pPr>
+    </w:p>
+    <w:p>
+      <w:pPr>
+        <w:pStyle w:val="ListParagraph"/>
+        <w:ind w:left="0"/>
+        <w:rPr>
+          <w:b/>
+          <w:bCs/>
+          <w:u w:val="single"/>
+        </w:rPr>
+      </w:pPr>
+      <w:r>
+        <w:rPr>
+          <w:b/>
+          <w:bCs/>
+          <w:u w:val="single"/>
+        </w:rPr>
+        <w:t>Intuitive</w:t>
+      </w:r>
+    </w:p>
+    <w:p>
+      <w:pPr>
+        <w:pStyle w:val="ListParagraph"/>
+        <w:ind w:left="0"/>
+        <w:rPr>
+          <w:b/>
+          <w:bCs/>
+          <w:u w:val="single"/>
+        </w:rPr>
+      </w:pPr>
+    </w:p>
+    <w:p>
+      <w:pPr>
+        <w:pStyle w:val="ListParagraph"/>
+        <w:ind w:left="0"/>
+      </w:pPr>
+      <w:r>
+        <w:t>This largely comes down to the UI. It should be simple, with the more complex options present but not in the way, and focussed around the three main elements: the two image windows and the workflow.</w:t>
+      </w:r>
+    </w:p>
+    <w:p>
+      <w:pPr>
+        <w:pStyle w:val="ListParagraph"/>
+        <w:ind w:left="0"/>
+      </w:pPr>
+    </w:p>
+    <w:p>
+      <w:pPr>
+        <w:pStyle w:val="ListParagraph"/>
+        <w:ind w:left="0"/>
+        <w:rPr>
+          <w:b/>
+          <w:bCs/>
+          <w:u w:val="single"/>
+        </w:rPr>
+      </w:pPr>
+      <w:r>
+        <w:t>It should have the</w:t>
+      </w:r>
+      <w:r>
+        <w:t xml:space="preserve"> capacity to deal automatically with data conversions that the user doesn’t need to see</w:t>
+      </w:r>
+      <w:r>
+        <w:t>, while giving hints on how to fix conversions which are required to develop an understanding of image analysis (e.g., how to flatten a z-stack image, how to binarise an image).</w:t>
+      </w:r>
+    </w:p>
+    <w:p>
+      <w:pPr>
+        <w:pStyle w:val="ListParagraph"/>
+        <w:ind w:left="0"/>
+        <w:rPr>
+          <w:b/>
+          <w:bCs/>
+          <w:u w:val="single"/>
+        </w:rPr>
+      </w:pPr>
+    </w:p>
+    <w:p>
+      <w:pPr>
+        <w:pStyle w:val="ListParagraph"/>
+        <w:ind w:left="0"/>
+        <w:rPr>
+          <w:b/>
+          <w:bCs/>
+          <w:u w:val="single"/>
+        </w:rPr>
+      </w:pPr>
+      <w:r>
+        <w:rPr>
+          <w:b/>
+          <w:bCs/>
+          <w:u w:val="single"/>
+        </w:rPr>
+        <w:t>Expandable</w:t>
+      </w:r>
+    </w:p>
+    <w:p>
+      <w:pPr>
+        <w:pStyle w:val="ListParagraph"/>
+        <w:ind w:left="0"/>
+        <w:rPr>
+          <w:b/>
+          <w:bCs/>
+          <w:u w:val="single"/>
+        </w:rPr>
+      </w:pPr>
+    </w:p>
+    <w:p>
+      <w:pPr>
+        <w:pStyle w:val="ListParagraph"/>
+        <w:ind w:left="0"/>
+      </w:pPr>
+      <w:r>
+        <w:t>The ability for the software to organise the workflow should be independent of exactly which image analysis functions are included but should, within reason, work for any function.</w:t>
+      </w:r>
+    </w:p>
+    <w:p>
+      <w:pPr>
+        <w:pStyle w:val="ListParagraph"/>
+        <w:ind w:left="0"/>
+      </w:pPr>
+    </w:p>
+    <w:p>
+      <w:pPr>
+        <w:pStyle w:val="ListParagraph"/>
+        <w:ind w:left="0"/>
+      </w:pPr>
+      <w:r>
+        <w:t>This means new functions, with the correct formatting and using the correct classes, should be able to slot directly into the software simply by saving them into the correct folder.</w:t>
+      </w:r>
+    </w:p>
+    <w:p>
+      <w:pPr>
+        <w:pStyle w:val="ListParagraph"/>
+        <w:ind w:left="0"/>
+      </w:pPr>
+    </w:p>
+    <w:p>
+      <w:pPr>
+        <w:pStyle w:val="ListParagraph"/>
+        <w:ind w:left="0"/>
+      </w:pPr>
+      <w:r>
+        <w:t>Crucially, adding</w:t>
+      </w:r>
+      <w:r>
+        <w:t xml:space="preserve"> in a new function should not require messing with the UI or base code</w:t>
+      </w:r>
+      <w:r>
+        <w:t>.</w:t>
+      </w:r>
+    </w:p>
+    <w:p>
+      <w:pPr>
+        <w:rPr>
+          <w:b/>
+          <w:bCs/>
+          <w:u w:val="single"/>
+        </w:rPr>
+      </w:pPr>
+    </w:p>
+    <w:p>
+      <w:pPr>
+        <w:ind w:left="360" w:hanging="360"/>
+        <w:rPr>
+          <w:b/>
+          <w:bCs/>
+          <w:u w:val="single"/>
+        </w:rPr>
+      </w:pPr>
+      <w:r>
+        <w:rPr>
+          <w:b/>
+          <w:bCs/>
+          <w:u w:val="single"/>
+        </w:rPr>
+        <w:t>Design Notes</w:t>
       </w:r>
     </w:p>
     <w:p>
@@ -29,15 +402,7 @@
         </w:numPr>
       </w:pPr>
       <w:r>
-        <w:t xml:space="preserve">Changes to image shape should always be explicit, never incidental. For example, z-projection will reduce z dimension to 1 because that’s what z projection does, but thresholding a </w:t>
-      </w:r>
-      <w:proofErr w:type="gramStart"/>
-      <w:r>
-        <w:t>5 slice</w:t>
-      </w:r>
-      <w:proofErr w:type="gramEnd"/>
-      <w:r>
-        <w:t xml:space="preserve"> z-stack will output 5 thresholds, not just 1.</w:t>
+        <w:t>Changes to image shape should always be explicit, never incidental. For example, z-projection will reduce z dimension to 1 because that’s what z projection does, but thresholding a 5 slice z-stack will output 5 thresholds, not just 1.</w:t>
       </w:r>
     </w:p>
     <w:p>
@@ -61,7 +426,11 @@
         <w:t>it according to the supplied parameters</w:t>
       </w:r>
       <w:r>
-        <w:t>, and produce an output in defined shape. As part of this role, it should include error handling to minimi</w:t>
+        <w:t xml:space="preserve">, and produce an output in defined shape. As </w:t>
+      </w:r>
+      <w:r>
+        <w:lastRenderedPageBreak/>
+        <w:t>part of this role, it should include error handling to minimi</w:t>
       </w:r>
       <w:r>
         <w:t>s</w:t>
@@ -112,15 +481,7 @@
         </w:numPr>
       </w:pPr>
       <w:r>
-        <w:t xml:space="preserve">Functions can have multiple outputs, but defined inputs. For example, a z-stack could have one output getting z-projected, another getting processes slice by slice etc, but two images could not enter the same z-projection function. Some functions may require multiple inputs, </w:t>
-      </w:r>
-      <w:proofErr w:type="spellStart"/>
-      <w:r>
-        <w:t>eg</w:t>
-      </w:r>
-      <w:proofErr w:type="spellEnd"/>
-      <w:r>
-        <w:t xml:space="preserve"> applying a threshold will require thresholds and an image to apply thresholds to.</w:t>
+        <w:t>Functions can have multiple outputs, but defined inputs. For example, a z-stack could have one output getting z-projected, another getting processes slice by slice etc, but two images could not enter the same z-projection function. Some functions may require multiple inputs, eg applying a threshold will require thresholds and an image to apply thresholds to.</w:t>
       </w:r>
     </w:p>
     <w:p>
@@ -144,23 +505,7 @@
         </w:numPr>
       </w:pPr>
       <w:r>
-        <w:t>Some type changes should be dealt with automatically (</w:t>
-      </w:r>
-      <w:proofErr w:type="spellStart"/>
-      <w:r>
-        <w:t>ie</w:t>
-      </w:r>
-      <w:proofErr w:type="spellEnd"/>
-      <w:r>
-        <w:t>, int to float). Some type changes should be highlighted to user as a flaw in the workflow (</w:t>
-      </w:r>
-      <w:proofErr w:type="spellStart"/>
-      <w:r>
-        <w:t>ie</w:t>
-      </w:r>
-      <w:proofErr w:type="spellEnd"/>
-      <w:r>
-        <w:t>, trying to carry out a binary process on a non-binarised image) with pointers on how to fix the issue).</w:t>
+        <w:t>Some type changes should be dealt with automatically (ie, int to float). Some type changes should be highlighted to user as a flaw in the workflow (ie, trying to carry out a binary process on a non-binarised image) with pointers on how to fix the issue).</w:t>
       </w:r>
     </w:p>
     <w:p>
@@ -199,8 +544,23 @@
         </w:numPr>
       </w:pPr>
       <w:r>
+        <w:t>The UI should be unintimidating. Consider what is necessary to see (input image, output image for comparison, channel and slice controls, current workflow diagram) and what can be hidden except when needed (LUTs, adding functions, changing function parameters, defining channel image parameters (channel names etc)).</w:t>
+      </w:r>
+    </w:p>
+    <w:p>
+      <w:pPr>
+        <w:pStyle w:val="ListParagraph"/>
+        <w:numPr>
+          <w:ilvl w:val="0"/>
+          <w:numId w:val="1"/>
+        </w:numPr>
+      </w:pPr>
+      <w:r>
+        <w:t xml:space="preserve">One of the challenges of image analysis I would like to simplify here is making sure an input image to a function is in the right format. Transposition of shape (eg, 3*1024*1024 image to 1024*1024*3 image) and data type (int to float) will be handled automatically. The user will be responsible for making sure a function that requires a 1*1024*1024 image doesn’t get sent a 3*5*1024*1024 image. For this to be intuitive, each function must have a clearly defined and invariable effect on image shape (eg, z-projection will reduce Z to 1. Isolating a channel will reduce channels to </w:t>
+      </w:r>
+      <w:r>
         <w:lastRenderedPageBreak/>
-        <w:t>The UI should be unintimidating. Consider what is necessary to see (input image, output image for comparison, channel and slice controls, current workflow diagram) and what can be hidden except when needed (LUTs, adding functions, changing function parameters, defining channel image parameters (channel names etc)).</w:t>
+        <w:t>1 or conversely, z-projection won’t affect channels so channels in = channels out). This allows the user to clearly see what effect each function has on the shape of the image, and also allows the software to give pointers (ie, if the user is trying to squeeze a 3 * 1024 * 1024 image into a function that requires a 1 * 1024 * 1024 image, or an integer image into a function that requires a binarized input, highlight potential functions that can be used to fit the image to the required shape).</w:t>
       </w:r>
     </w:p>
     <w:p>
@@ -212,31 +572,17 @@
         </w:numPr>
       </w:pPr>
       <w:r>
-        <w:t>One of the challenges of image analysis I would like to simplify here is making sure an input image to a function is in the right format. Transposition of shape (</w:t>
-      </w:r>
-      <w:proofErr w:type="spellStart"/>
-      <w:r>
-        <w:t>eg</w:t>
-      </w:r>
-      <w:proofErr w:type="spellEnd"/>
-      <w:r>
-        <w:t>, 3*1024*1024 image to 1024*1024*3 image) and data type (int to float) will be handled automatically. The user will be responsible for making sure a function that requires a 1*1024*1024 image doesn’t get sent a 3*5*1024*1024 image. For this to be intuitive, each function must have a clearly defined and invariable effect on image shape (</w:t>
-      </w:r>
-      <w:proofErr w:type="spellStart"/>
-      <w:r>
-        <w:t>eg</w:t>
-      </w:r>
-      <w:proofErr w:type="spellEnd"/>
-      <w:r>
-        <w:t>, z-projection will reduce Z to 1. Isolating a channel will reduce channels to 1 or conversely, z-projection won’t affect channels so channels in = channels out). This allows the user to clearly see what effect each function has on the shape of the image, and also allows the software to give pointers (</w:t>
-      </w:r>
-      <w:proofErr w:type="spellStart"/>
-      <w:r>
-        <w:t>ie</w:t>
-      </w:r>
-      <w:proofErr w:type="spellEnd"/>
-      <w:r>
-        <w:t>, if the user is trying to squeeze a 3 * 1024 * 1024 image into a function that requires a 1 * 1024 * 1024 image, or an integer image into a function that requires a binarized input, highlight potential functions that can be used to fit the image to the required shape).</w:t>
+        <w:t xml:space="preserve">Implement a “pause updates” button – if the node graph gets big, make it possible to update multiple nodes </w:t>
+      </w:r>
+      <w:r>
+        <w:rPr>
+          <w:i/>
+          <w:iCs/>
+        </w:rPr>
+        <w:t>then</w:t>
+      </w:r>
+      <w:r>
+        <w:t xml:space="preserve"> update all the images, rather than doing it repeatedly.</w:t>
       </w:r>
     </w:p>
     <w:p/>
@@ -283,17 +629,7 @@
         </w:numPr>
       </w:pPr>
       <w:r>
-        <w:t xml:space="preserve">In images, need to know which dimension of the </w:t>
-      </w:r>
-      <w:proofErr w:type="spellStart"/>
-      <w:proofErr w:type="gramStart"/>
-      <w:r>
-        <w:t>np.array</w:t>
-      </w:r>
-      <w:proofErr w:type="spellEnd"/>
-      <w:proofErr w:type="gramEnd"/>
-      <w:r>
-        <w:t xml:space="preserve"> holds C or Z.</w:t>
+        <w:t>In images, need to know which dimension of the np.array holds C or Z.</w:t>
       </w:r>
     </w:p>
     <w:p>
@@ -305,45 +641,8 @@
         </w:numPr>
       </w:pPr>
       <w:r>
-        <w:t xml:space="preserve">Therefore </w:t>
-      </w:r>
-      <w:proofErr w:type="spellStart"/>
-      <w:r>
-        <w:t>image_shape</w:t>
-      </w:r>
-      <w:proofErr w:type="spellEnd"/>
-      <w:r>
-        <w:t xml:space="preserve"> class has </w:t>
-      </w:r>
-      <w:proofErr w:type="spellStart"/>
-      <w:r>
-        <w:t>c_dim</w:t>
-      </w:r>
-      <w:proofErr w:type="spellEnd"/>
-      <w:r>
-        <w:t xml:space="preserve">, </w:t>
-      </w:r>
-      <w:proofErr w:type="spellStart"/>
-      <w:r>
-        <w:t>z_dim</w:t>
-      </w:r>
-      <w:proofErr w:type="spellEnd"/>
-      <w:r>
-        <w:t xml:space="preserve">, </w:t>
-      </w:r>
-      <w:proofErr w:type="spellStart"/>
-      <w:r>
-        <w:t>y_dim</w:t>
-      </w:r>
-      <w:proofErr w:type="spellEnd"/>
-      <w:r>
-        <w:t xml:space="preserve">, </w:t>
-      </w:r>
-      <w:proofErr w:type="spellStart"/>
-      <w:r>
-        <w:t>x_dim</w:t>
-      </w:r>
-      <w:proofErr w:type="spellEnd"/>
+        <w:t>Therefore image_shape class has c_dim, z_dim, y_dim, x_dim</w:t>
+      </w:r>
     </w:p>
     <w:p>
       <w:pPr>
@@ -366,39 +665,7 @@
         </w:numPr>
       </w:pPr>
       <w:r>
-        <w:t xml:space="preserve">The images returned </w:t>
-      </w:r>
-      <w:proofErr w:type="spellStart"/>
-      <w:r>
-        <w:t>form</w:t>
-      </w:r>
-      <w:proofErr w:type="spellEnd"/>
-      <w:r>
-        <w:t xml:space="preserve"> these iterations need their own </w:t>
-      </w:r>
-      <w:proofErr w:type="spellStart"/>
-      <w:r>
-        <w:t>image_shape</w:t>
-      </w:r>
-      <w:proofErr w:type="spellEnd"/>
-      <w:r>
-        <w:t xml:space="preserve"> class (</w:t>
-      </w:r>
-      <w:proofErr w:type="spellStart"/>
-      <w:r>
-        <w:t>i.e</w:t>
-      </w:r>
-      <w:proofErr w:type="spellEnd"/>
-      <w:r>
-        <w:t xml:space="preserve">, an image iterated through z slices will have an </w:t>
-      </w:r>
-      <w:proofErr w:type="spellStart"/>
-      <w:r>
-        <w:t>image_shape</w:t>
-      </w:r>
-      <w:proofErr w:type="spellEnd"/>
-      <w:r>
-        <w:t xml:space="preserve"> class with z = -1 - so can then iterate through channels and so on.</w:t>
+        <w:t>The images returned form these iterations need their own image_shape class (i.e, an image iterated through z slices will have an image_shape class with z = -1 - so can then iterate through channels and so on.</w:t>
       </w:r>
     </w:p>
     <w:p>
@@ -410,15 +677,7 @@
         </w:numPr>
       </w:pPr>
       <w:r>
-        <w:t xml:space="preserve">The output from a function will be an image, this will have its own </w:t>
-      </w:r>
-      <w:proofErr w:type="spellStart"/>
-      <w:r>
-        <w:t>image_shape</w:t>
-      </w:r>
-      <w:proofErr w:type="spellEnd"/>
-      <w:r>
-        <w:t xml:space="preserve"> class so that role of a function is dealt with here.</w:t>
+        <w:t>The output from a function will be an image, this will have its own image_shape class so that role of a function is dealt with here.</w:t>
       </w:r>
     </w:p>
     <w:p>
@@ -430,53 +689,7 @@
         </w:numPr>
       </w:pPr>
       <w:r>
-        <w:t xml:space="preserve">The constraints on </w:t>
-      </w:r>
-      <w:proofErr w:type="gramStart"/>
-      <w:r>
-        <w:t>an</w:t>
-      </w:r>
-      <w:proofErr w:type="gramEnd"/>
-      <w:r>
-        <w:t xml:space="preserve"> </w:t>
-      </w:r>
-      <w:r>
-        <w:t>node</w:t>
-      </w:r>
-      <w:r>
-        <w:t xml:space="preserve"> will</w:t>
-      </w:r>
-      <w:r>
-        <w:t xml:space="preserve"> also use this</w:t>
-      </w:r>
-      <w:r>
-        <w:t xml:space="preserve"> class</w:t>
-      </w:r>
-      <w:r>
-        <w:t>.</w:t>
-      </w:r>
-      <w:r>
-        <w:t xml:space="preserve"> </w:t>
-      </w:r>
-      <w:r>
-        <w:t>N</w:t>
-      </w:r>
-      <w:r>
-        <w:t xml:space="preserve">ode inputs </w:t>
-      </w:r>
-      <w:r>
-        <w:t xml:space="preserve">can </w:t>
-      </w:r>
-      <w:r>
-        <w:t xml:space="preserve">be "I need 1 channel, I don't care about x, I don't care about Y, I don't care about z" - this can fit into </w:t>
-      </w:r>
-      <w:proofErr w:type="spellStart"/>
-      <w:r>
-        <w:t>image_shape</w:t>
-      </w:r>
-      <w:proofErr w:type="spellEnd"/>
-      <w:r>
-        <w:t xml:space="preserve"> class as C = 1, y = x = z = -1.</w:t>
+        <w:t>The constraints on an node will also use this class. Node inputs can be "I need 1 channel, I don't care about x, I don't care about Y, I don't care about z" - this can fit into image_shape class as C = 1, y = x = z = -1.</w:t>
       </w:r>
     </w:p>
     <w:p>
@@ -488,46 +701,259 @@
         </w:numPr>
       </w:pPr>
       <w:r>
-        <w:t xml:space="preserve">This will also fit for outputs, given currently anticipated effects that a function will have. Either output dimensions are the same or they are </w:t>
-      </w:r>
-      <w:r>
-        <w:t xml:space="preserve">reduced to 1. </w:t>
-      </w:r>
-      <w:proofErr w:type="gramStart"/>
-      <w:r>
-        <w:t>So</w:t>
-      </w:r>
-      <w:proofErr w:type="gramEnd"/>
-      <w:r>
-        <w:t xml:space="preserve"> outputs could be "-1" for no change or "1" for changed to 1, "2" to </w:t>
-      </w:r>
-      <w:proofErr w:type="spellStart"/>
-      <w:r>
-        <w:t>changed</w:t>
-      </w:r>
-      <w:proofErr w:type="spellEnd"/>
-      <w:r>
-        <w:t xml:space="preserve"> to 2.</w:t>
-      </w:r>
-      <w:r>
-        <w:t xml:space="preserve"> There’s a slight possibility of needing to use strings </w:t>
+        <w:t>This will also fit for outputs, given currently anticipated effects that a function will have. Either output dimensions are the same or they are reduced to 1. So outputs could be "-1" for no change or "1" for changed to 1, "2" to changed to 2. There’s a slight possibility of needing to use strings for other operations “-3” or “/6” etc, at which point this class may need rethinking.</w:t>
+      </w:r>
+    </w:p>
+    <w:p>
+      <w:pPr>
+        <w:pStyle w:val="ListParagraph"/>
+        <w:numPr>
+          <w:ilvl w:val="0"/>
+          <w:numId w:val="2"/>
+        </w:numPr>
+      </w:pPr>
+      <w:r>
+        <w:t>Workflow class:</w:t>
+      </w:r>
+    </w:p>
+    <w:p>
+      <w:pPr>
+        <w:pStyle w:val="ListParagraph"/>
+        <w:numPr>
+          <w:ilvl w:val="1"/>
+          <w:numId w:val="2"/>
+        </w:numPr>
+      </w:pPr>
+      <w:r>
+        <w:t xml:space="preserve">Plans for defining </w:t>
+      </w:r>
+      <w:r>
+        <w:t xml:space="preserve">graph topology </w:t>
+      </w:r>
+      <w:r>
+        <w:t xml:space="preserve">of the workflow are </w:t>
+      </w:r>
+      <w:r>
+        <w:t>to match the way they would be added in the UI. First, a node (</w:t>
+      </w:r>
+      <w:r>
+        <w:t xml:space="preserve">e.g., </w:t>
+      </w:r>
+      <w:r>
+        <w:t xml:space="preserve">node 2) would be dragged into the workflow; this would add the node to the workflow class as a workflow element, but with no input or output connections specified. Next, the user would connect the node to the preceding node (node 1). At this point a function would be called within the workflow class to check what type conversions might be needed (in pseudo code, node2 input = int(node1 float output)) or whether there were larger problems with the input to node 2 that might need the user to add in intervening nodes to further process the data. If the function is satisfied that the connection between node 1 and node 2 is </w:t>
       </w:r>
       <w:r>
         <w:lastRenderedPageBreak/>
-        <w:t>for other operations “-</w:t>
-      </w:r>
-      <w:r>
-        <w:t>3</w:t>
-      </w:r>
-      <w:r>
-        <w:t>” or “/6”</w:t>
-      </w:r>
-      <w:r>
-        <w:t xml:space="preserve"> etc</w:t>
-      </w:r>
-      <w:r>
-        <w:t>, at which point this class may need rethinking.</w:t>
-      </w:r>
+        <w:t>functional, the relevant inputs and outputs are added to the two node elements.</w:t>
+      </w:r>
+    </w:p>
+    <w:p>
+      <w:pPr>
+        <w:pStyle w:val="ListParagraph"/>
+        <w:numPr>
+          <w:ilvl w:val="1"/>
+          <w:numId w:val="2"/>
+        </w:numPr>
+      </w:pPr>
+      <w:r>
+        <w:t>Key thing is that these checks need to be made when adding the connection as the image processing will update once the software is satisfied that the connection is valid. As such, there’s a few checks to make.</w:t>
+      </w:r>
+    </w:p>
+    <w:p/>
+    <w:p/>
+    <w:p/>
+    <w:p>
+      <w:pPr>
+        <w:rPr>
+          <w:b/>
+          <w:bCs/>
+          <w:u w:val="single"/>
+        </w:rPr>
+      </w:pPr>
+      <w:r>
+        <w:rPr>
+          <w:b/>
+          <w:bCs/>
+          <w:u w:val="single"/>
+        </w:rPr>
+        <w:t>Node design notes</w:t>
+      </w:r>
+    </w:p>
+    <w:p>
+      <w:pPr>
+        <w:pStyle w:val="ListParagraph"/>
+        <w:numPr>
+          <w:ilvl w:val="0"/>
+          <w:numId w:val="2"/>
+        </w:numPr>
+      </w:pPr>
+      <w:r>
+        <w:t>Z-projection</w:t>
+      </w:r>
+    </w:p>
+    <w:p>
+      <w:pPr>
+        <w:pStyle w:val="ListParagraph"/>
+        <w:numPr>
+          <w:ilvl w:val="0"/>
+          <w:numId w:val="2"/>
+        </w:numPr>
+      </w:pPr>
+      <w:r>
+        <w:t>Select channel(s)</w:t>
+      </w:r>
+    </w:p>
+    <w:p>
+      <w:pPr>
+        <w:pStyle w:val="ListParagraph"/>
+        <w:numPr>
+          <w:ilvl w:val="0"/>
+          <w:numId w:val="2"/>
+        </w:numPr>
+      </w:pPr>
+      <w:r>
+        <w:t>Get threshold value</w:t>
+      </w:r>
+    </w:p>
+    <w:p>
+      <w:pPr>
+        <w:pStyle w:val="ListParagraph"/>
+        <w:numPr>
+          <w:ilvl w:val="0"/>
+          <w:numId w:val="2"/>
+        </w:numPr>
+      </w:pPr>
+      <w:r>
+        <w:t>Apply threshold value</w:t>
+      </w:r>
+    </w:p>
+    <w:p>
+      <w:pPr>
+        <w:pStyle w:val="ListParagraph"/>
+        <w:numPr>
+          <w:ilvl w:val="0"/>
+          <w:numId w:val="2"/>
+        </w:numPr>
+      </w:pPr>
+      <w:r>
+        <w:t>Gaussian blur</w:t>
+      </w:r>
+    </w:p>
+    <w:p>
+      <w:pPr>
+        <w:pStyle w:val="ListParagraph"/>
+        <w:numPr>
+          <w:ilvl w:val="0"/>
+          <w:numId w:val="2"/>
+        </w:numPr>
+      </w:pPr>
+      <w:r>
+        <w:t>Median blur</w:t>
+      </w:r>
+    </w:p>
+    <w:p>
+      <w:pPr>
+        <w:pStyle w:val="ListParagraph"/>
+        <w:numPr>
+          <w:ilvl w:val="0"/>
+          <w:numId w:val="2"/>
+        </w:numPr>
+      </w:pPr>
+      <w:r>
+        <w:t>Top hat filter</w:t>
+      </w:r>
+    </w:p>
+    <w:p>
+      <w:pPr>
+        <w:pStyle w:val="ListParagraph"/>
+        <w:numPr>
+          <w:ilvl w:val="0"/>
+          <w:numId w:val="2"/>
+        </w:numPr>
+      </w:pPr>
+      <w:r>
+        <w:t>Binary operations (erode, dilate, open, close, fill holes)</w:t>
+      </w:r>
+    </w:p>
+    <w:p>
+      <w:pPr>
+        <w:pStyle w:val="ListParagraph"/>
+        <w:numPr>
+          <w:ilvl w:val="0"/>
+          <w:numId w:val="2"/>
+        </w:numPr>
+      </w:pPr>
+      <w:r>
+        <w:t>Logical operations (and, or, etc)</w:t>
+      </w:r>
+    </w:p>
+    <w:p>
+      <w:pPr>
+        <w:pStyle w:val="ListParagraph"/>
+        <w:numPr>
+          <w:ilvl w:val="0"/>
+          <w:numId w:val="2"/>
+        </w:numPr>
+      </w:pPr>
+      <w:r>
+        <w:t>Measurements</w:t>
+      </w:r>
+    </w:p>
+    <w:p>
+      <w:pPr>
+        <w:pStyle w:val="ListParagraph"/>
+        <w:numPr>
+          <w:ilvl w:val="0"/>
+          <w:numId w:val="2"/>
+        </w:numPr>
+      </w:pPr>
+      <w:r>
+        <w:t>Compare intensities</w:t>
+      </w:r>
+    </w:p>
+    <w:p>
+      <w:pPr>
+        <w:pStyle w:val="ListParagraph"/>
+        <w:numPr>
+          <w:ilvl w:val="0"/>
+          <w:numId w:val="2"/>
+        </w:numPr>
+      </w:pPr>
+      <w:r>
+        <w:t>Edge detection</w:t>
+      </w:r>
+    </w:p>
+    <w:p>
+      <w:pPr>
+        <w:pStyle w:val="ListParagraph"/>
+        <w:numPr>
+          <w:ilvl w:val="0"/>
+          <w:numId w:val="2"/>
+        </w:numPr>
+      </w:pPr>
+      <w:r>
+        <w:t>Segmentation</w:t>
+      </w:r>
+    </w:p>
+    <w:p>
+      <w:pPr>
+        <w:pStyle w:val="ListParagraph"/>
+        <w:numPr>
+          <w:ilvl w:val="0"/>
+          <w:numId w:val="2"/>
+        </w:numPr>
+      </w:pPr>
+      <w:r>
+        <w:t>Watershedding</w:t>
+      </w:r>
+    </w:p>
+    <w:p>
+      <w:pPr>
+        <w:rPr>
+          <w:b/>
+          <w:bCs/>
+        </w:rPr>
+      </w:pPr>
     </w:p>
     <w:sectPr>
       <w:pgSz w:w="11906" w:h="16838"/>
@@ -542,6 +968,92 @@
 <file path=word/numbering.xml><?xml version="1.0" encoding="utf-8"?>
 <w:numbering xmlns:wpc="http://schemas.microsoft.com/office/word/2010/wordprocessingCanvas" xmlns:cx="http://schemas.microsoft.com/office/drawing/2014/chartex" xmlns:cx1="http://schemas.microsoft.com/office/drawing/2015/9/8/chartex" xmlns:cx2="http://schemas.microsoft.com/office/drawing/2015/10/21/chartex" xmlns:cx3="http://schemas.microsoft.com/office/drawing/2016/5/9/chartex" xmlns:cx4="http://schemas.microsoft.com/office/drawing/2016/5/10/chartex" xmlns:cx5="http://schemas.microsoft.com/office/drawing/2016/5/11/chartex" xmlns:cx6="http://schemas.microsoft.com/office/drawing/2016/5/12/chartex" xmlns:cx7="http://schemas.microsoft.com/office/drawing/2016/5/13/chartex" xmlns:cx8="http://schemas.microsoft.com/office/drawing/2016/5/14/chartex" xmlns:mc="http://schemas.openxmlformats.org/markup-compatibility/2006" xmlns:aink="http://schemas.microsoft.com/office/drawing/2016/ink" xmlns:am3d="http://schemas.microsoft.com/office/drawing/2017/model3d" xmlns:o="urn:schemas-microsoft-com:office:office" xmlns:oel="http://schemas.microsoft.com/office/2019/extlst" xmlns:r="http://schemas.openxmlformats.org/officeDocument/2006/relationships" xmlns:m="http://schemas.openxmlformats.org/officeDocument/2006/math" xmlns:v="urn:schemas-microsoft-com:vml" xmlns:wp14="http://schemas.microsoft.com/office/word/2010/wordprocessingDrawing" xmlns:wp="http://schemas.openxmlformats.org/drawingml/2006/wordprocessingDrawing" xmlns:w10="urn:schemas-microsoft-com:office:word" xmlns:w="http://schemas.openxmlformats.org/wordprocessingml/2006/main" xmlns:w14="http://schemas.microsoft.com/office/word/2010/wordml" xmlns:w15="http://schemas.microsoft.com/office/word/2012/wordml" xmlns:w16cex="http://schemas.microsoft.com/office/word/2018/wordml/cex" xmlns:w16cid="http://schemas.microsoft.com/office/word/2016/wordml/cid" xmlns:w16="http://schemas.microsoft.com/office/word/2018/wordml" xmlns:w16du="http://schemas.microsoft.com/office/word/2023/wordml/word16du" xmlns:w16sdtdh="http://schemas.microsoft.com/office/word/2020/wordml/sdtdatahash" xmlns:w16sdtfl="http://schemas.microsoft.com/office/word/2024/wordml/sdtformatlock" xmlns:w16se="http://schemas.microsoft.com/office/word/2015/wordml/symex" xmlns:wpg="http://schemas.microsoft.com/office/word/2010/wordprocessingGroup" xmlns:wpi="http://schemas.microsoft.com/office/word/2010/wordprocessingInk" xmlns:wne="http://schemas.microsoft.com/office/word/2006/wordml" xmlns:wps="http://schemas.microsoft.com/office/word/2010/wordprocessingShape" mc:Ignorable="w14 w15 w16se w16cid w16 w16cex w16sdtdh w16sdtfl w16du wp14">
   <w:abstractNum w:abstractNumId="0" w15:restartNumberingAfterBreak="0">
+    <w:nsid w:val="16B25DDF"/>
+    <w:multiLevelType w:val="hybridMultilevel"/>
+    <w:tmpl w:val="F11EB088"/>
+    <w:lvl w:ilvl="0" w:tplc="0809000F">
+      <w:start w:val="1"/>
+      <w:numFmt w:val="decimal"/>
+      <w:lvlText w:val="%1."/>
+      <w:lvlJc w:val="left"/>
+      <w:pPr>
+        <w:ind w:left="780" w:hanging="360"/>
+      </w:pPr>
+    </w:lvl>
+    <w:lvl w:ilvl="1" w:tplc="08090019" w:tentative="1">
+      <w:start w:val="1"/>
+      <w:numFmt w:val="lowerLetter"/>
+      <w:lvlText w:val="%2."/>
+      <w:lvlJc w:val="left"/>
+      <w:pPr>
+        <w:ind w:left="1500" w:hanging="360"/>
+      </w:pPr>
+    </w:lvl>
+    <w:lvl w:ilvl="2" w:tplc="0809001B" w:tentative="1">
+      <w:start w:val="1"/>
+      <w:numFmt w:val="lowerRoman"/>
+      <w:lvlText w:val="%3."/>
+      <w:lvlJc w:val="right"/>
+      <w:pPr>
+        <w:ind w:left="2220" w:hanging="180"/>
+      </w:pPr>
+    </w:lvl>
+    <w:lvl w:ilvl="3" w:tplc="0809000F" w:tentative="1">
+      <w:start w:val="1"/>
+      <w:numFmt w:val="decimal"/>
+      <w:lvlText w:val="%4."/>
+      <w:lvlJc w:val="left"/>
+      <w:pPr>
+        <w:ind w:left="2940" w:hanging="360"/>
+      </w:pPr>
+    </w:lvl>
+    <w:lvl w:ilvl="4" w:tplc="08090019" w:tentative="1">
+      <w:start w:val="1"/>
+      <w:numFmt w:val="lowerLetter"/>
+      <w:lvlText w:val="%5."/>
+      <w:lvlJc w:val="left"/>
+      <w:pPr>
+        <w:ind w:left="3660" w:hanging="360"/>
+      </w:pPr>
+    </w:lvl>
+    <w:lvl w:ilvl="5" w:tplc="0809001B" w:tentative="1">
+      <w:start w:val="1"/>
+      <w:numFmt w:val="lowerRoman"/>
+      <w:lvlText w:val="%6."/>
+      <w:lvlJc w:val="right"/>
+      <w:pPr>
+        <w:ind w:left="4380" w:hanging="180"/>
+      </w:pPr>
+    </w:lvl>
+    <w:lvl w:ilvl="6" w:tplc="0809000F" w:tentative="1">
+      <w:start w:val="1"/>
+      <w:numFmt w:val="decimal"/>
+      <w:lvlText w:val="%7."/>
+      <w:lvlJc w:val="left"/>
+      <w:pPr>
+        <w:ind w:left="5100" w:hanging="360"/>
+      </w:pPr>
+    </w:lvl>
+    <w:lvl w:ilvl="7" w:tplc="08090019" w:tentative="1">
+      <w:start w:val="1"/>
+      <w:numFmt w:val="lowerLetter"/>
+      <w:lvlText w:val="%8."/>
+      <w:lvlJc w:val="left"/>
+      <w:pPr>
+        <w:ind w:left="5820" w:hanging="360"/>
+      </w:pPr>
+    </w:lvl>
+    <w:lvl w:ilvl="8" w:tplc="0809001B" w:tentative="1">
+      <w:start w:val="1"/>
+      <w:numFmt w:val="lowerRoman"/>
+      <w:lvlText w:val="%9."/>
+      <w:lvlJc w:val="right"/>
+      <w:pPr>
+        <w:ind w:left="6540" w:hanging="180"/>
+      </w:pPr>
+    </w:lvl>
+  </w:abstractNum>
+  <w:abstractNum w:abstractNumId="1" w15:restartNumberingAfterBreak="0">
     <w:nsid w:val="258F0C3B"/>
     <w:multiLevelType w:val="hybridMultilevel"/>
     <w:tmpl w:val="B35EB432"/>
@@ -654,10 +1166,10 @@
       </w:rPr>
     </w:lvl>
   </w:abstractNum>
-  <w:abstractNum w:abstractNumId="1" w15:restartNumberingAfterBreak="0">
+  <w:abstractNum w:abstractNumId="2" w15:restartNumberingAfterBreak="0">
     <w:nsid w:val="2B521BFD"/>
     <w:multiLevelType w:val="hybridMultilevel"/>
-    <w:tmpl w:val="DA2E99D8"/>
+    <w:tmpl w:val="EB56FB14"/>
     <w:lvl w:ilvl="0" w:tplc="08090001">
       <w:start w:val="1"/>
       <w:numFmt w:val="bullet"/>
@@ -767,11 +1279,219 @@
       </w:rPr>
     </w:lvl>
   </w:abstractNum>
+  <w:abstractNum w:abstractNumId="3" w15:restartNumberingAfterBreak="0">
+    <w:nsid w:val="44D73ADD"/>
+    <w:multiLevelType w:val="hybridMultilevel"/>
+    <w:tmpl w:val="CE263032"/>
+    <w:lvl w:ilvl="0" w:tplc="0809000F">
+      <w:start w:val="1"/>
+      <w:numFmt w:val="decimal"/>
+      <w:lvlText w:val="%1."/>
+      <w:lvlJc w:val="left"/>
+      <w:pPr>
+        <w:ind w:left="780" w:hanging="360"/>
+      </w:pPr>
+    </w:lvl>
+    <w:lvl w:ilvl="1" w:tplc="08090019" w:tentative="1">
+      <w:start w:val="1"/>
+      <w:numFmt w:val="lowerLetter"/>
+      <w:lvlText w:val="%2."/>
+      <w:lvlJc w:val="left"/>
+      <w:pPr>
+        <w:ind w:left="1500" w:hanging="360"/>
+      </w:pPr>
+    </w:lvl>
+    <w:lvl w:ilvl="2" w:tplc="0809001B" w:tentative="1">
+      <w:start w:val="1"/>
+      <w:numFmt w:val="lowerRoman"/>
+      <w:lvlText w:val="%3."/>
+      <w:lvlJc w:val="right"/>
+      <w:pPr>
+        <w:ind w:left="2220" w:hanging="180"/>
+      </w:pPr>
+    </w:lvl>
+    <w:lvl w:ilvl="3" w:tplc="0809000F" w:tentative="1">
+      <w:start w:val="1"/>
+      <w:numFmt w:val="decimal"/>
+      <w:lvlText w:val="%4."/>
+      <w:lvlJc w:val="left"/>
+      <w:pPr>
+        <w:ind w:left="2940" w:hanging="360"/>
+      </w:pPr>
+    </w:lvl>
+    <w:lvl w:ilvl="4" w:tplc="08090019" w:tentative="1">
+      <w:start w:val="1"/>
+      <w:numFmt w:val="lowerLetter"/>
+      <w:lvlText w:val="%5."/>
+      <w:lvlJc w:val="left"/>
+      <w:pPr>
+        <w:ind w:left="3660" w:hanging="360"/>
+      </w:pPr>
+    </w:lvl>
+    <w:lvl w:ilvl="5" w:tplc="0809001B" w:tentative="1">
+      <w:start w:val="1"/>
+      <w:numFmt w:val="lowerRoman"/>
+      <w:lvlText w:val="%6."/>
+      <w:lvlJc w:val="right"/>
+      <w:pPr>
+        <w:ind w:left="4380" w:hanging="180"/>
+      </w:pPr>
+    </w:lvl>
+    <w:lvl w:ilvl="6" w:tplc="0809000F" w:tentative="1">
+      <w:start w:val="1"/>
+      <w:numFmt w:val="decimal"/>
+      <w:lvlText w:val="%7."/>
+      <w:lvlJc w:val="left"/>
+      <w:pPr>
+        <w:ind w:left="5100" w:hanging="360"/>
+      </w:pPr>
+    </w:lvl>
+    <w:lvl w:ilvl="7" w:tplc="08090019" w:tentative="1">
+      <w:start w:val="1"/>
+      <w:numFmt w:val="lowerLetter"/>
+      <w:lvlText w:val="%8."/>
+      <w:lvlJc w:val="left"/>
+      <w:pPr>
+        <w:ind w:left="5820" w:hanging="360"/>
+      </w:pPr>
+    </w:lvl>
+    <w:lvl w:ilvl="8" w:tplc="0809001B" w:tentative="1">
+      <w:start w:val="1"/>
+      <w:numFmt w:val="lowerRoman"/>
+      <w:lvlText w:val="%9."/>
+      <w:lvlJc w:val="right"/>
+      <w:pPr>
+        <w:ind w:left="6540" w:hanging="180"/>
+      </w:pPr>
+    </w:lvl>
+  </w:abstractNum>
+  <w:abstractNum w:abstractNumId="4" w15:restartNumberingAfterBreak="0">
+    <w:nsid w:val="73544086"/>
+    <w:multiLevelType w:val="hybridMultilevel"/>
+    <w:tmpl w:val="3A3EC374"/>
+    <w:lvl w:ilvl="0" w:tplc="08090001">
+      <w:start w:val="1"/>
+      <w:numFmt w:val="bullet"/>
+      <w:lvlText w:val=""/>
+      <w:lvlJc w:val="left"/>
+      <w:pPr>
+        <w:ind w:left="720" w:hanging="360"/>
+      </w:pPr>
+      <w:rPr>
+        <w:rFonts w:ascii="Symbol" w:hAnsi="Symbol" w:hint="default"/>
+      </w:rPr>
+    </w:lvl>
+    <w:lvl w:ilvl="1" w:tplc="08090003" w:tentative="1">
+      <w:start w:val="1"/>
+      <w:numFmt w:val="bullet"/>
+      <w:lvlText w:val="o"/>
+      <w:lvlJc w:val="left"/>
+      <w:pPr>
+        <w:ind w:left="1440" w:hanging="360"/>
+      </w:pPr>
+      <w:rPr>
+        <w:rFonts w:ascii="Courier New" w:hAnsi="Courier New" w:cs="Courier New" w:hint="default"/>
+      </w:rPr>
+    </w:lvl>
+    <w:lvl w:ilvl="2" w:tplc="08090005" w:tentative="1">
+      <w:start w:val="1"/>
+      <w:numFmt w:val="bullet"/>
+      <w:lvlText w:val=""/>
+      <w:lvlJc w:val="left"/>
+      <w:pPr>
+        <w:ind w:left="2160" w:hanging="360"/>
+      </w:pPr>
+      <w:rPr>
+        <w:rFonts w:ascii="Wingdings" w:hAnsi="Wingdings" w:hint="default"/>
+      </w:rPr>
+    </w:lvl>
+    <w:lvl w:ilvl="3" w:tplc="08090001" w:tentative="1">
+      <w:start w:val="1"/>
+      <w:numFmt w:val="bullet"/>
+      <w:lvlText w:val=""/>
+      <w:lvlJc w:val="left"/>
+      <w:pPr>
+        <w:ind w:left="2880" w:hanging="360"/>
+      </w:pPr>
+      <w:rPr>
+        <w:rFonts w:ascii="Symbol" w:hAnsi="Symbol" w:hint="default"/>
+      </w:rPr>
+    </w:lvl>
+    <w:lvl w:ilvl="4" w:tplc="08090003" w:tentative="1">
+      <w:start w:val="1"/>
+      <w:numFmt w:val="bullet"/>
+      <w:lvlText w:val="o"/>
+      <w:lvlJc w:val="left"/>
+      <w:pPr>
+        <w:ind w:left="3600" w:hanging="360"/>
+      </w:pPr>
+      <w:rPr>
+        <w:rFonts w:ascii="Courier New" w:hAnsi="Courier New" w:cs="Courier New" w:hint="default"/>
+      </w:rPr>
+    </w:lvl>
+    <w:lvl w:ilvl="5" w:tplc="08090005" w:tentative="1">
+      <w:start w:val="1"/>
+      <w:numFmt w:val="bullet"/>
+      <w:lvlText w:val=""/>
+      <w:lvlJc w:val="left"/>
+      <w:pPr>
+        <w:ind w:left="4320" w:hanging="360"/>
+      </w:pPr>
+      <w:rPr>
+        <w:rFonts w:ascii="Wingdings" w:hAnsi="Wingdings" w:hint="default"/>
+      </w:rPr>
+    </w:lvl>
+    <w:lvl w:ilvl="6" w:tplc="08090001" w:tentative="1">
+      <w:start w:val="1"/>
+      <w:numFmt w:val="bullet"/>
+      <w:lvlText w:val=""/>
+      <w:lvlJc w:val="left"/>
+      <w:pPr>
+        <w:ind w:left="5040" w:hanging="360"/>
+      </w:pPr>
+      <w:rPr>
+        <w:rFonts w:ascii="Symbol" w:hAnsi="Symbol" w:hint="default"/>
+      </w:rPr>
+    </w:lvl>
+    <w:lvl w:ilvl="7" w:tplc="08090003" w:tentative="1">
+      <w:start w:val="1"/>
+      <w:numFmt w:val="bullet"/>
+      <w:lvlText w:val="o"/>
+      <w:lvlJc w:val="left"/>
+      <w:pPr>
+        <w:ind w:left="5760" w:hanging="360"/>
+      </w:pPr>
+      <w:rPr>
+        <w:rFonts w:ascii="Courier New" w:hAnsi="Courier New" w:cs="Courier New" w:hint="default"/>
+      </w:rPr>
+    </w:lvl>
+    <w:lvl w:ilvl="8" w:tplc="08090005" w:tentative="1">
+      <w:start w:val="1"/>
+      <w:numFmt w:val="bullet"/>
+      <w:lvlText w:val=""/>
+      <w:lvlJc w:val="left"/>
+      <w:pPr>
+        <w:ind w:left="6480" w:hanging="360"/>
+      </w:pPr>
+      <w:rPr>
+        <w:rFonts w:ascii="Wingdings" w:hAnsi="Wingdings" w:hint="default"/>
+      </w:rPr>
+    </w:lvl>
+  </w:abstractNum>
   <w:num w:numId="1" w16cid:durableId="464857354">
+    <w:abstractNumId w:val="1"/>
+  </w:num>
+  <w:num w:numId="2" w16cid:durableId="2132094706">
+    <w:abstractNumId w:val="2"/>
+  </w:num>
+  <w:num w:numId="3" w16cid:durableId="1120807208">
     <w:abstractNumId w:val="0"/>
   </w:num>
-  <w:num w:numId="2" w16cid:durableId="2132094706">
-    <w:abstractNumId w:val="1"/>
+  <w:num w:numId="4" w16cid:durableId="1420760374">
+    <w:abstractNumId w:val="4"/>
+  </w:num>
+  <w:num w:numId="5" w16cid:durableId="797988434">
+    <w:abstractNumId w:val="3"/>
   </w:num>
 </w:numbering>
 </file>
@@ -1379,7 +2099,6 @@
   <w:style w:type="character" w:default="1" w:styleId="DefaultParagraphFont">
     <w:name w:val="Default Paragraph Font"/>
     <w:uiPriority w:val="1"/>
-    <w:semiHidden/>
     <w:unhideWhenUsed/>
   </w:style>
   <w:style w:type="table" w:default="1" w:styleId="TableNormal">

</xml_diff>

<commit_message>
docs: Updated design notes
Added start of class descriptions, development plan
</commit_message>
<xml_diff>
--- a/docs/Design notes.docx
+++ b/docs/Design notes.docx
@@ -200,7 +200,15 @@
         <w:ind w:left="0"/>
       </w:pPr>
       <w:r>
-        <w:t>You shouldn’t have to do something unrelated to image analysis (ie, learn to code) to analyse images. At the same time, it should provide the tools to develop the user’s ability to use code in image analysis. An end goal is to have the option to export the user’s image analysis workflow to functional, documented python code.</w:t>
+        <w:t>You shouldn’t have to do something unrelated to image analysis (</w:t>
+      </w:r>
+      <w:proofErr w:type="spellStart"/>
+      <w:r>
+        <w:t>ie</w:t>
+      </w:r>
+      <w:proofErr w:type="spellEnd"/>
+      <w:r>
+        <w:t>, learn to code) to analyse images. At the same time, it should provide the tools to develop the user’s ability to use code in image analysis. An end goal is to have the option to export the user’s image analysis workflow to functional, documented python code.</w:t>
       </w:r>
     </w:p>
     <w:p>
@@ -368,6 +376,1506 @@
     </w:p>
     <w:p>
       <w:pPr>
+        <w:pStyle w:val="Heading1"/>
+      </w:pPr>
+      <w:r>
+        <w:t>Backend</w:t>
+      </w:r>
+    </w:p>
+    <w:p>
+      <w:pPr>
+        <w:pStyle w:val="Heading2"/>
+      </w:pPr>
+      <w:r>
+        <w:t>Structure</w:t>
+      </w:r>
+    </w:p>
+    <w:p>
+      <w:r>
+        <w:t xml:space="preserve">The main image analysis workflow will be made up of a series of interconnected </w:t>
+      </w:r>
+      <w:r>
+        <w:rPr>
+          <w:b/>
+          <w:bCs/>
+        </w:rPr>
+        <w:t>nodes</w:t>
+      </w:r>
+      <w:r>
+        <w:t xml:space="preserve">, </w:t>
+      </w:r>
+      <w:r>
+        <w:rPr>
+          <w:b/>
+          <w:bCs/>
+        </w:rPr>
+        <w:t>ports</w:t>
+      </w:r>
+      <w:r>
+        <w:t xml:space="preserve"> and </w:t>
+      </w:r>
+      <w:r>
+        <w:rPr>
+          <w:b/>
+          <w:bCs/>
+        </w:rPr>
+        <w:t>connections</w:t>
+      </w:r>
+      <w:r>
+        <w:t xml:space="preserve">. </w:t>
+      </w:r>
+    </w:p>
+    <w:p>
+      <w:r>
+        <w:rPr>
+          <w:b/>
+          <w:bCs/>
+        </w:rPr>
+        <w:t>Nodes</w:t>
+      </w:r>
+      <w:r>
+        <w:t xml:space="preserve"> take an input image, carry out a given </w:t>
+      </w:r>
+      <w:proofErr w:type="spellStart"/>
+      <w:r>
+        <w:rPr>
+          <w:b/>
+          <w:bCs/>
+        </w:rPr>
+        <w:t>ImageOperation</w:t>
+      </w:r>
+      <w:proofErr w:type="spellEnd"/>
+      <w:r>
+        <w:t xml:space="preserve"> on that image (based on the input data and any specific parameters provided by the user), and present the adjusted image.</w:t>
+      </w:r>
+    </w:p>
+    <w:p>
+      <w:r>
+        <w:rPr>
+          <w:b/>
+          <w:bCs/>
+        </w:rPr>
+        <w:lastRenderedPageBreak/>
+        <w:t>Ports</w:t>
+      </w:r>
+      <w:r>
+        <w:t xml:space="preserve"> attach to nodes and provide a layer of separation between the functions manipulating the image and the </w:t>
+      </w:r>
+      <w:r>
+        <w:rPr>
+          <w:b/>
+          <w:bCs/>
+        </w:rPr>
+        <w:t>Connections</w:t>
+      </w:r>
+      <w:r>
+        <w:t xml:space="preserve"> carrying the data between </w:t>
+      </w:r>
+      <w:r>
+        <w:rPr>
+          <w:b/>
+          <w:bCs/>
+        </w:rPr>
+        <w:t>Nodes</w:t>
+      </w:r>
+      <w:r>
+        <w:t xml:space="preserve">. In the future, if changes are made to how data is stored and transmitted, this should only require changes to a single </w:t>
+      </w:r>
+      <w:r>
+        <w:rPr>
+          <w:b/>
+          <w:bCs/>
+        </w:rPr>
+        <w:t>Port</w:t>
+      </w:r>
+      <w:r>
+        <w:t xml:space="preserve"> class, not all the image analysis functions.</w:t>
+      </w:r>
+    </w:p>
+    <w:p>
+      <w:r>
+        <w:rPr>
+          <w:b/>
+          <w:bCs/>
+        </w:rPr>
+        <w:t xml:space="preserve">Connections </w:t>
+      </w:r>
+      <w:r>
+        <w:t xml:space="preserve">transmit images and other parameters between </w:t>
+      </w:r>
+      <w:r>
+        <w:rPr>
+          <w:b/>
+          <w:bCs/>
+        </w:rPr>
+        <w:t>n</w:t>
+      </w:r>
+      <w:r>
+        <w:rPr>
+          <w:b/>
+          <w:bCs/>
+        </w:rPr>
+        <w:t>odes</w:t>
+      </w:r>
+      <w:r>
+        <w:t xml:space="preserve"> (via p</w:t>
+      </w:r>
+      <w:r>
+        <w:rPr>
+          <w:b/>
+          <w:bCs/>
+        </w:rPr>
+        <w:t>orts</w:t>
+      </w:r>
+      <w:r>
+        <w:t xml:space="preserve">). They carry out type- and shape-checking on transmitted images to ensure they match what is expected by the next input </w:t>
+      </w:r>
+      <w:r>
+        <w:rPr>
+          <w:b/>
+          <w:bCs/>
+        </w:rPr>
+        <w:t>port</w:t>
+      </w:r>
+      <w:r>
+        <w:t xml:space="preserve">, carry out simple shape and type conversions (where required) and prompt the user to adjust the workflow where simple conversions are not sufficient to fit the image to the next </w:t>
+      </w:r>
+      <w:r>
+        <w:rPr>
+          <w:b/>
+          <w:bCs/>
+        </w:rPr>
+        <w:t>node</w:t>
+      </w:r>
+      <w:r>
+        <w:t>.</w:t>
+      </w:r>
+    </w:p>
+    <w:p>
+      <w:proofErr w:type="spellStart"/>
+      <w:r>
+        <w:rPr>
+          <w:b/>
+          <w:bCs/>
+        </w:rPr>
+        <w:t>ImageOperations</w:t>
+      </w:r>
+      <w:proofErr w:type="spellEnd"/>
+      <w:r>
+        <w:t xml:space="preserve"> are the actual image analysis functions carried out by </w:t>
+      </w:r>
+      <w:r>
+        <w:rPr>
+          <w:b/>
+          <w:bCs/>
+        </w:rPr>
+        <w:t>nodes</w:t>
+      </w:r>
+      <w:r>
+        <w:t xml:space="preserve">. They can use existing image analysis libraries (such as scikit image) or custom functions. To allow easy expandability, each </w:t>
+      </w:r>
+      <w:proofErr w:type="spellStart"/>
+      <w:r>
+        <w:rPr>
+          <w:b/>
+          <w:bCs/>
+        </w:rPr>
+        <w:t>ImageOperation</w:t>
+      </w:r>
+      <w:proofErr w:type="spellEnd"/>
+      <w:r>
+        <w:t xml:space="preserve"> is held in its own file which are imported to an </w:t>
+      </w:r>
+      <w:proofErr w:type="spellStart"/>
+      <w:r>
+        <w:rPr>
+          <w:b/>
+          <w:bCs/>
+        </w:rPr>
+        <w:t>ImageOperationDirectory</w:t>
+      </w:r>
+      <w:proofErr w:type="spellEnd"/>
+      <w:r>
+        <w:t xml:space="preserve"> on startup. They also contain definitions of input/output data types and image shape.</w:t>
+      </w:r>
+    </w:p>
+    <w:p>
+      <w:r>
+        <w:t xml:space="preserve">To allow consistent data transfer through the workflow, a number of classes are used to define the structure of the data. These include custom </w:t>
+      </w:r>
+      <w:proofErr w:type="spellStart"/>
+      <w:r>
+        <w:rPr>
+          <w:b/>
+          <w:bCs/>
+        </w:rPr>
+        <w:t>DataTypes</w:t>
+      </w:r>
+      <w:proofErr w:type="spellEnd"/>
+      <w:r>
+        <w:t xml:space="preserve">, and classes defining the </w:t>
+      </w:r>
+      <w:r>
+        <w:rPr>
+          <w:b/>
+          <w:bCs/>
+        </w:rPr>
+        <w:t>image</w:t>
+      </w:r>
+      <w:r>
+        <w:t xml:space="preserve"> and its </w:t>
+      </w:r>
+      <w:r>
+        <w:rPr>
+          <w:b/>
+          <w:bCs/>
+        </w:rPr>
+        <w:t>shape</w:t>
+      </w:r>
+      <w:r>
+        <w:t xml:space="preserve">, and input </w:t>
+      </w:r>
+      <w:r>
+        <w:rPr>
+          <w:b/>
+          <w:bCs/>
+        </w:rPr>
+        <w:t>parameters</w:t>
+      </w:r>
+      <w:r>
+        <w:t xml:space="preserve"> to </w:t>
+      </w:r>
+      <w:proofErr w:type="spellStart"/>
+      <w:r>
+        <w:rPr>
+          <w:b/>
+          <w:bCs/>
+        </w:rPr>
+        <w:t>ImageOperations</w:t>
+      </w:r>
+      <w:proofErr w:type="spellEnd"/>
+      <w:r>
+        <w:rPr>
+          <w:b/>
+          <w:bCs/>
+        </w:rPr>
+        <w:t xml:space="preserve">. </w:t>
+      </w:r>
+      <w:r>
+        <w:t>These are used to streamline user input and data transmission, but are not used in actual image analysis, where standard NumPy data types are used.</w:t>
+      </w:r>
+    </w:p>
+    <w:p>
+      <w:pPr>
+        <w:pStyle w:val="Heading2"/>
+      </w:pPr>
+      <w:r>
+        <w:t>Interaction with UI</w:t>
+      </w:r>
+    </w:p>
+    <w:p>
+      <w:r>
+        <w:t>The UI is defined in more detail in the Frontend section</w:t>
+      </w:r>
+      <w:r>
+        <w:t xml:space="preserve">, but the Backend interacts with the UI in a few main ways. Firstly, users drag-and-drop </w:t>
+      </w:r>
+      <w:r>
+        <w:rPr>
+          <w:b/>
+          <w:bCs/>
+        </w:rPr>
+        <w:t>nodes</w:t>
+      </w:r>
+      <w:r>
+        <w:t xml:space="preserve"> based on their desired image analysis workflow.</w:t>
+      </w:r>
+    </w:p>
+    <w:p>
+      <w:r>
+        <w:t xml:space="preserve">Each </w:t>
+      </w:r>
+      <w:r>
+        <w:rPr>
+          <w:b/>
+          <w:bCs/>
+        </w:rPr>
+        <w:t>node</w:t>
+      </w:r>
+      <w:r>
+        <w:t xml:space="preserve"> is associated with a given </w:t>
+      </w:r>
+      <w:proofErr w:type="spellStart"/>
+      <w:r>
+        <w:rPr>
+          <w:b/>
+          <w:bCs/>
+        </w:rPr>
+        <w:t>ImageOperation</w:t>
+      </w:r>
+      <w:proofErr w:type="spellEnd"/>
+      <w:r>
+        <w:t xml:space="preserve"> and the </w:t>
+      </w:r>
+      <w:r>
+        <w:rPr>
+          <w:b/>
+          <w:bCs/>
+        </w:rPr>
+        <w:t>parameters</w:t>
+      </w:r>
+      <w:r>
+        <w:t xml:space="preserve"> of that operation are designed to allow the UI to automatically draw a dialog requesting the required information in a relevant format, without each new operation requiring adjustments to the UI.</w:t>
+      </w:r>
+    </w:p>
+    <w:p>
+      <w:r>
+        <w:t xml:space="preserve">They can then draw </w:t>
+      </w:r>
+      <w:r>
+        <w:rPr>
+          <w:b/>
+          <w:bCs/>
+        </w:rPr>
+        <w:t>connections</w:t>
+      </w:r>
+      <w:r>
+        <w:t xml:space="preserve"> between the </w:t>
+      </w:r>
+      <w:r>
+        <w:rPr>
+          <w:b/>
+          <w:bCs/>
+        </w:rPr>
+        <w:t>nodes</w:t>
+      </w:r>
+      <w:r>
+        <w:t xml:space="preserve">. A single </w:t>
+      </w:r>
+      <w:r>
+        <w:rPr>
+          <w:b/>
+          <w:bCs/>
+        </w:rPr>
+        <w:t>node</w:t>
+      </w:r>
+      <w:r>
+        <w:t xml:space="preserve"> has a defined number of inputs (defined by the </w:t>
+      </w:r>
+      <w:proofErr w:type="spellStart"/>
+      <w:r>
+        <w:rPr>
+          <w:b/>
+          <w:bCs/>
+        </w:rPr>
+        <w:t>ImageOperation</w:t>
+      </w:r>
+      <w:proofErr w:type="spellEnd"/>
+      <w:r>
+        <w:t xml:space="preserve">) but can output to as many other </w:t>
+      </w:r>
+      <w:r>
+        <w:rPr>
+          <w:b/>
+          <w:bCs/>
+        </w:rPr>
+        <w:t>nodes</w:t>
+      </w:r>
+      <w:r>
+        <w:t xml:space="preserve"> as required. On drawing the connection, the </w:t>
+      </w:r>
+      <w:proofErr w:type="spellStart"/>
+      <w:r>
+        <w:rPr>
+          <w:b/>
+          <w:bCs/>
+        </w:rPr>
+        <w:t>WorkFlow</w:t>
+      </w:r>
+      <w:proofErr w:type="spellEnd"/>
+      <w:r>
+        <w:t xml:space="preserve"> class checks that the connection can provide an image/value in the proper data type and shape. If so, the </w:t>
+      </w:r>
+      <w:proofErr w:type="spellStart"/>
+      <w:r>
+        <w:rPr>
+          <w:b/>
+          <w:bCs/>
+        </w:rPr>
+        <w:t>ImageOperation</w:t>
+      </w:r>
+      <w:proofErr w:type="spellEnd"/>
+      <w:r>
+        <w:t xml:space="preserve"> is carried out allowing immediate feedback in one of the two image views. If not, and the </w:t>
+      </w:r>
+      <w:r>
+        <w:rPr>
+          <w:b/>
+          <w:bCs/>
+        </w:rPr>
+        <w:t>connection</w:t>
+      </w:r>
+      <w:r>
+        <w:t xml:space="preserve"> cannot carry out simple shape or type conversions, the user is warned of the problem. Where possible, this warning will provide hints towards available </w:t>
+      </w:r>
+      <w:proofErr w:type="spellStart"/>
+      <w:r>
+        <w:rPr>
+          <w:b/>
+          <w:bCs/>
+        </w:rPr>
+        <w:t>ImageOperations</w:t>
+      </w:r>
+      <w:proofErr w:type="spellEnd"/>
+      <w:r>
+        <w:t xml:space="preserve"> that could be used to fix the problems with the data (for example, carry out a Z-projection to flatten the image). </w:t>
+      </w:r>
+    </w:p>
+    <w:p>
+      <w:pPr>
+        <w:pStyle w:val="Heading2"/>
+      </w:pPr>
+      <w:r>
+        <w:lastRenderedPageBreak/>
+        <w:t>Classes</w:t>
+      </w:r>
+    </w:p>
+    <w:p>
+      <w:pPr>
+        <w:pStyle w:val="Heading3"/>
+      </w:pPr>
+      <w:proofErr w:type="spellStart"/>
+      <w:r>
+        <w:t>DataType</w:t>
+      </w:r>
+      <w:proofErr w:type="spellEnd"/>
+      <w:r>
+        <w:t xml:space="preserve"> Classes</w:t>
+      </w:r>
+    </w:p>
+    <w:p>
+      <w:r>
+        <w:t xml:space="preserve">The aim of the data classes is to allow data to be transferred through the workflow in a reliable and predictable way. </w:t>
+      </w:r>
+      <w:r>
+        <w:t>W</w:t>
+      </w:r>
+      <w:r>
+        <w:t>hen developing image analysis functions</w:t>
+      </w:r>
+      <w:r>
+        <w:t>, this should make</w:t>
+      </w:r>
+      <w:r>
+        <w:t xml:space="preserve"> the permissible input and output formats</w:t>
+      </w:r>
+      <w:r>
+        <w:t xml:space="preserve"> clear</w:t>
+      </w:r>
+      <w:r>
+        <w:t xml:space="preserve">, </w:t>
+      </w:r>
+      <w:r>
+        <w:t xml:space="preserve">it should </w:t>
+      </w:r>
+      <w:r>
+        <w:t xml:space="preserve">allow automatic conversion between compatible formats and give clear feedback to users where formats aren't compatible. </w:t>
+      </w:r>
+      <w:r>
+        <w:br/>
+      </w:r>
+      <w:r>
+        <w:br/>
+        <w:t>These data types exist purely for transferring data between nodes in the workflow</w:t>
+      </w:r>
+      <w:r>
+        <w:t>:</w:t>
+      </w:r>
+      <w:r>
+        <w:t xml:space="preserve"> actual image manipulation within image analysis functions will be carried out using standard </w:t>
+      </w:r>
+      <w:proofErr w:type="spellStart"/>
+      <w:r>
+        <w:t>numpy</w:t>
+      </w:r>
+      <w:proofErr w:type="spellEnd"/>
+      <w:r>
+        <w:t xml:space="preserve"> data types. This means there's no requirement to be able to carry out calculations or comparisons with these data types.</w:t>
+      </w:r>
+      <w:r>
+        <w:br/>
+      </w:r>
+      <w:r>
+        <w:br/>
+        <w:t>There will be three data types for image data and two for non-image data:</w:t>
+      </w:r>
+      <w:r>
+        <w:br/>
+      </w:r>
+      <w:r>
+        <w:br/>
+      </w:r>
+      <w:proofErr w:type="spellStart"/>
+      <w:r>
+        <w:t>ImageInt</w:t>
+      </w:r>
+      <w:proofErr w:type="spellEnd"/>
+      <w:r>
+        <w:t xml:space="preserve"> - 0 ≤ int ≤ 255</w:t>
+      </w:r>
+      <w:r>
+        <w:br/>
+      </w:r>
+      <w:proofErr w:type="spellStart"/>
+      <w:r>
+        <w:t>ImageFloat</w:t>
+      </w:r>
+      <w:proofErr w:type="spellEnd"/>
+      <w:r>
+        <w:t xml:space="preserve"> - 0 ≤ float ≤ 1</w:t>
+      </w:r>
+      <w:r>
+        <w:br/>
+      </w:r>
+      <w:proofErr w:type="spellStart"/>
+      <w:r>
+        <w:t>ImageBinary</w:t>
+      </w:r>
+      <w:proofErr w:type="spellEnd"/>
+      <w:r>
+        <w:t xml:space="preserve"> - 0 or 1</w:t>
+      </w:r>
+      <w:r>
+        <w:br/>
+      </w:r>
+      <w:proofErr w:type="spellStart"/>
+      <w:r>
+        <w:t>ValueInt</w:t>
+      </w:r>
+      <w:proofErr w:type="spellEnd"/>
+      <w:r>
+        <w:t xml:space="preserve"> - int</w:t>
+      </w:r>
+      <w:r>
+        <w:br/>
+      </w:r>
+      <w:proofErr w:type="spellStart"/>
+      <w:r>
+        <w:t>ValueFloat</w:t>
+      </w:r>
+      <w:proofErr w:type="spellEnd"/>
+      <w:r>
+        <w:t xml:space="preserve"> - float</w:t>
+      </w:r>
+      <w:r>
+        <w:br/>
+      </w:r>
+      <w:r>
+        <w:br/>
+        <w:t>Each Image type will have __</w:t>
+      </w:r>
+      <w:proofErr w:type="spellStart"/>
+      <w:r>
+        <w:t>init</w:t>
+      </w:r>
+      <w:proofErr w:type="spellEnd"/>
+      <w:r>
+        <w:t xml:space="preserve">__, value property and </w:t>
+      </w:r>
+      <w:proofErr w:type="spellStart"/>
+      <w:r>
+        <w:t>value.getter</w:t>
+      </w:r>
+      <w:proofErr w:type="spellEnd"/>
+      <w:r>
+        <w:t xml:space="preserve"> functions along with conversion functions for the other two image types and the relevant standard </w:t>
+      </w:r>
+      <w:proofErr w:type="spellStart"/>
+      <w:r>
+        <w:t>numpy</w:t>
+      </w:r>
+      <w:proofErr w:type="spellEnd"/>
+      <w:r>
+        <w:t xml:space="preserve"> type.</w:t>
+      </w:r>
+      <w:r>
+        <w:br/>
+      </w:r>
+      <w:r>
+        <w:br/>
+        <w:t>The value types will have similar functions for converting between themselves.</w:t>
+      </w:r>
+      <w:r>
+        <w:br/>
+      </w:r>
+      <w:r>
+        <w:br/>
+        <w:t xml:space="preserve">They will all be wrapped in an </w:t>
+      </w:r>
+      <w:r>
+        <w:t>E</w:t>
+      </w:r>
+      <w:r>
+        <w:t>num to</w:t>
+      </w:r>
+      <w:r>
+        <w:t xml:space="preserve"> help ensure type safety. Also, if data types need to be changed in the future, this will help with refactoring.</w:t>
+      </w:r>
+    </w:p>
+    <w:p>
+      <w:pPr>
+        <w:pStyle w:val="Heading3"/>
+      </w:pPr>
+      <w:r>
+        <w:t>Shape class</w:t>
+      </w:r>
+    </w:p>
+    <w:p>
+      <w:r>
+        <w:t xml:space="preserve">This </w:t>
+      </w:r>
+      <w:r>
+        <w:t>exists to hold data related to the shape of transmitted images. It will hold integer values for C (channels), Z (depth), Y (height) and X (width) and will be used to hold shape related information in a number of classes and contexts:</w:t>
+      </w:r>
+    </w:p>
+    <w:p>
+      <w:pPr>
+        <w:pStyle w:val="ListParagraph"/>
+        <w:numPr>
+          <w:ilvl w:val="0"/>
+          <w:numId w:val="7"/>
+        </w:numPr>
+      </w:pPr>
+      <w:r>
+        <w:rPr>
+          <w:b/>
+          <w:bCs/>
+        </w:rPr>
+        <w:t>Image</w:t>
+      </w:r>
+      <w:r>
+        <w:t xml:space="preserve"> class – this will reflect which dimension of the multi-dimensional array holds </w:t>
+      </w:r>
+      <w:r>
+        <w:t>which dimension of the image.</w:t>
+      </w:r>
+    </w:p>
+    <w:p>
+      <w:pPr>
+        <w:pStyle w:val="ListParagraph"/>
+        <w:numPr>
+          <w:ilvl w:val="0"/>
+          <w:numId w:val="7"/>
+        </w:numPr>
+      </w:pPr>
+      <w:proofErr w:type="spellStart"/>
+      <w:r>
+        <w:rPr>
+          <w:b/>
+          <w:bCs/>
+        </w:rPr>
+        <w:t>ImageOperation</w:t>
+      </w:r>
+      <w:proofErr w:type="spellEnd"/>
+      <w:r>
+        <w:t xml:space="preserve"> class:</w:t>
+      </w:r>
+    </w:p>
+    <w:p>
+      <w:pPr>
+        <w:pStyle w:val="ListParagraph"/>
+        <w:numPr>
+          <w:ilvl w:val="1"/>
+          <w:numId w:val="7"/>
+        </w:numPr>
+      </w:pPr>
+      <w:r>
+        <w:t>Constraints on input – does the operation need a specific shape (</w:t>
+      </w:r>
+      <w:proofErr w:type="spellStart"/>
+      <w:r>
+        <w:t>eg</w:t>
+      </w:r>
+      <w:proofErr w:type="spellEnd"/>
+      <w:r>
+        <w:t xml:space="preserve"> Z = 1 for a flat image) or accept any size for a specific dimension (in which case, -1 is used).</w:t>
+      </w:r>
+    </w:p>
+    <w:p>
+      <w:pPr>
+        <w:pStyle w:val="ListParagraph"/>
+        <w:numPr>
+          <w:ilvl w:val="1"/>
+          <w:numId w:val="7"/>
+        </w:numPr>
+      </w:pPr>
+      <w:r>
+        <w:lastRenderedPageBreak/>
+        <w:t>Effects on output – what effect an operation will have on the image shape, for example Z-projection will result in a Z of 1, while other dimensions will be left unchanged (-1).</w:t>
+      </w:r>
+    </w:p>
+    <w:p>
+      <w:pPr>
+        <w:pStyle w:val="ListParagraph"/>
+        <w:numPr>
+          <w:ilvl w:val="0"/>
+          <w:numId w:val="7"/>
+        </w:numPr>
+      </w:pPr>
+      <w:r>
+        <w:rPr>
+          <w:b/>
+          <w:bCs/>
+        </w:rPr>
+        <w:t>Node</w:t>
+      </w:r>
+      <w:r>
+        <w:t xml:space="preserve"> and </w:t>
+      </w:r>
+      <w:r>
+        <w:rPr>
+          <w:b/>
+          <w:bCs/>
+        </w:rPr>
+        <w:t>Port</w:t>
+      </w:r>
+      <w:r>
+        <w:t xml:space="preserve"> classes – this will mirror the usage in </w:t>
+      </w:r>
+      <w:proofErr w:type="spellStart"/>
+      <w:r>
+        <w:t>ImageOperation</w:t>
+      </w:r>
+      <w:proofErr w:type="spellEnd"/>
+      <w:r>
+        <w:t xml:space="preserve"> classes</w:t>
+      </w:r>
+    </w:p>
+    <w:p>
+      <w:pPr>
+        <w:pStyle w:val="ListParagraph"/>
+        <w:numPr>
+          <w:ilvl w:val="0"/>
+          <w:numId w:val="7"/>
+        </w:numPr>
+      </w:pPr>
+      <w:r>
+        <w:rPr>
+          <w:b/>
+          <w:bCs/>
+        </w:rPr>
+        <w:t>Connection</w:t>
+      </w:r>
+      <w:r>
+        <w:t xml:space="preserve"> class – this may be required to reshape the image from the shape given by the input port to the shape given by the output port.</w:t>
+      </w:r>
+    </w:p>
+    <w:p>
+      <w:pPr>
+        <w:pStyle w:val="Heading3"/>
+      </w:pPr>
+      <w:r>
+        <w:t>Image Class</w:t>
+      </w:r>
+    </w:p>
+    <w:p>
+      <w:r>
+        <w:t>This holds the image data. As for the data type class, it exists purely to transmit images between nodes with a clearly defined shape and data type. It contains four instance variables:</w:t>
+      </w:r>
+    </w:p>
+    <w:p>
+      <w:pPr>
+        <w:pStyle w:val="ListParagraph"/>
+        <w:numPr>
+          <w:ilvl w:val="0"/>
+          <w:numId w:val="11"/>
+        </w:numPr>
+      </w:pPr>
+      <w:r>
+        <w:t>Image pixel data, in a multi-dimensional array of defined size and type.</w:t>
+      </w:r>
+    </w:p>
+    <w:p>
+      <w:pPr>
+        <w:pStyle w:val="ListParagraph"/>
+        <w:numPr>
+          <w:ilvl w:val="0"/>
+          <w:numId w:val="11"/>
+        </w:numPr>
+      </w:pPr>
+      <w:r>
+        <w:t xml:space="preserve">Image data type, as a member of </w:t>
+      </w:r>
+      <w:proofErr w:type="spellStart"/>
+      <w:r>
+        <w:t>DataType</w:t>
+      </w:r>
+      <w:proofErr w:type="spellEnd"/>
+      <w:r>
+        <w:t>.</w:t>
+      </w:r>
+    </w:p>
+    <w:p>
+      <w:pPr>
+        <w:pStyle w:val="ListParagraph"/>
+        <w:numPr>
+          <w:ilvl w:val="0"/>
+          <w:numId w:val="11"/>
+        </w:numPr>
+      </w:pPr>
+      <w:r>
+        <w:t xml:space="preserve">Image shape, using </w:t>
+      </w:r>
+      <w:r>
+        <w:rPr>
+          <w:b/>
+          <w:bCs/>
+        </w:rPr>
+        <w:t>Shape</w:t>
+      </w:r>
+      <w:r>
+        <w:t xml:space="preserve"> class.</w:t>
+      </w:r>
+    </w:p>
+    <w:p>
+      <w:pPr>
+        <w:pStyle w:val="ListParagraph"/>
+        <w:numPr>
+          <w:ilvl w:val="0"/>
+          <w:numId w:val="11"/>
+        </w:numPr>
+      </w:pPr>
+      <w:r>
+        <w:t xml:space="preserve">Mapping from image dimensions (C, Z, Y, X) to image array dimensions (0,1,2,3) using </w:t>
+      </w:r>
+      <w:r>
+        <w:rPr>
+          <w:b/>
+          <w:bCs/>
+        </w:rPr>
+        <w:t>Shape</w:t>
+      </w:r>
+      <w:r>
+        <w:t xml:space="preserve"> class.</w:t>
+      </w:r>
+    </w:p>
+    <w:p>
+      <w:pPr>
+        <w:pStyle w:val="Heading1"/>
+      </w:pPr>
+      <w:r>
+        <w:t>Frontend</w:t>
+      </w:r>
+    </w:p>
+    <w:p>
+      <w:pPr>
+        <w:pStyle w:val="Heading2"/>
+      </w:pPr>
+      <w:r>
+        <w:t>Development Plan</w:t>
+      </w:r>
+    </w:p>
+    <w:p>
+      <w:pPr>
+        <w:pStyle w:val="Heading3"/>
+      </w:pPr>
+      <w:r>
+        <w:t>Stage 0</w:t>
+      </w:r>
+    </w:p>
+    <w:p>
+      <w:pPr>
+        <w:pStyle w:val="ListParagraph"/>
+        <w:numPr>
+          <w:ilvl w:val="0"/>
+          <w:numId w:val="14"/>
+        </w:numPr>
+      </w:pPr>
+      <w:r>
+        <w:t>Plan overall design.</w:t>
+      </w:r>
+    </w:p>
+    <w:p>
+      <w:pPr>
+        <w:pStyle w:val="ListParagraph"/>
+        <w:numPr>
+          <w:ilvl w:val="0"/>
+          <w:numId w:val="14"/>
+        </w:numPr>
+      </w:pPr>
+      <w:r>
+        <w:t>Plan class structure.</w:t>
+      </w:r>
+    </w:p>
+    <w:p>
+      <w:pPr>
+        <w:pStyle w:val="ListParagraph"/>
+        <w:numPr>
+          <w:ilvl w:val="0"/>
+          <w:numId w:val="14"/>
+        </w:numPr>
+      </w:pPr>
+      <w:r>
+        <w:t>Plan graph flow.</w:t>
+      </w:r>
+    </w:p>
+    <w:p>
+      <w:pPr>
+        <w:pStyle w:val="ListParagraph"/>
+        <w:numPr>
+          <w:ilvl w:val="0"/>
+          <w:numId w:val="14"/>
+        </w:numPr>
+      </w:pPr>
+      <w:r>
+        <w:t>Plan main UI elements.</w:t>
+      </w:r>
+    </w:p>
+    <w:p>
+      <w:pPr>
+        <w:pStyle w:val="ListParagraph"/>
+        <w:numPr>
+          <w:ilvl w:val="0"/>
+          <w:numId w:val="14"/>
+        </w:numPr>
+      </w:pPr>
+      <w:r>
+        <w:t>Set up project and directory structure for development and testing.</w:t>
+      </w:r>
+    </w:p>
+    <w:p>
+      <w:pPr>
+        <w:pStyle w:val="Heading3"/>
+      </w:pPr>
+      <w:r>
+        <w:t>Stage 1 – Backend Image Classes</w:t>
+      </w:r>
+    </w:p>
+    <w:p>
+      <w:pPr>
+        <w:pStyle w:val="ListParagraph"/>
+        <w:numPr>
+          <w:ilvl w:val="0"/>
+          <w:numId w:val="12"/>
+        </w:numPr>
+      </w:pPr>
+      <w:r>
+        <w:t xml:space="preserve">Plan unit testing for </w:t>
+      </w:r>
+      <w:proofErr w:type="spellStart"/>
+      <w:r>
+        <w:rPr>
+          <w:b/>
+          <w:bCs/>
+        </w:rPr>
+        <w:t>DataType</w:t>
+      </w:r>
+      <w:proofErr w:type="spellEnd"/>
+      <w:r>
+        <w:t xml:space="preserve">, </w:t>
+      </w:r>
+      <w:r>
+        <w:rPr>
+          <w:b/>
+          <w:bCs/>
+        </w:rPr>
+        <w:t>Shape</w:t>
+      </w:r>
+      <w:r>
+        <w:t xml:space="preserve"> and </w:t>
+      </w:r>
+      <w:r>
+        <w:rPr>
+          <w:b/>
+          <w:bCs/>
+        </w:rPr>
+        <w:t>Image</w:t>
+      </w:r>
+      <w:r>
+        <w:t xml:space="preserve"> classes.</w:t>
+      </w:r>
+    </w:p>
+    <w:p>
+      <w:pPr>
+        <w:pStyle w:val="ListParagraph"/>
+        <w:numPr>
+          <w:ilvl w:val="0"/>
+          <w:numId w:val="12"/>
+        </w:numPr>
+      </w:pPr>
+      <w:r>
+        <w:t xml:space="preserve">Implement </w:t>
+      </w:r>
+      <w:proofErr w:type="spellStart"/>
+      <w:r>
+        <w:rPr>
+          <w:b/>
+          <w:bCs/>
+        </w:rPr>
+        <w:t>DataType</w:t>
+      </w:r>
+      <w:proofErr w:type="spellEnd"/>
+      <w:r>
+        <w:t xml:space="preserve">, </w:t>
+      </w:r>
+      <w:r>
+        <w:rPr>
+          <w:b/>
+          <w:bCs/>
+        </w:rPr>
+        <w:t>Shape</w:t>
+      </w:r>
+      <w:r>
+        <w:t xml:space="preserve"> and </w:t>
+      </w:r>
+      <w:r>
+        <w:rPr>
+          <w:b/>
+          <w:bCs/>
+        </w:rPr>
+        <w:t>Image</w:t>
+      </w:r>
+      <w:r>
+        <w:t xml:space="preserve"> classes.</w:t>
+      </w:r>
+    </w:p>
+    <w:p>
+      <w:pPr>
+        <w:pStyle w:val="ListParagraph"/>
+        <w:numPr>
+          <w:ilvl w:val="0"/>
+          <w:numId w:val="12"/>
+        </w:numPr>
+      </w:pPr>
+      <w:r>
+        <w:t xml:space="preserve">Test </w:t>
+      </w:r>
+      <w:proofErr w:type="spellStart"/>
+      <w:r>
+        <w:rPr>
+          <w:b/>
+          <w:bCs/>
+        </w:rPr>
+        <w:t>DataType</w:t>
+      </w:r>
+      <w:proofErr w:type="spellEnd"/>
+      <w:r>
+        <w:t xml:space="preserve">, </w:t>
+      </w:r>
+      <w:r>
+        <w:rPr>
+          <w:b/>
+          <w:bCs/>
+        </w:rPr>
+        <w:t>Shape</w:t>
+      </w:r>
+      <w:r>
+        <w:t xml:space="preserve"> and </w:t>
+      </w:r>
+      <w:r>
+        <w:rPr>
+          <w:b/>
+          <w:bCs/>
+        </w:rPr>
+        <w:t>Image</w:t>
+      </w:r>
+      <w:r>
+        <w:t xml:space="preserve"> classes.</w:t>
+      </w:r>
+    </w:p>
+    <w:p>
+      <w:pPr>
+        <w:pStyle w:val="Heading3"/>
+      </w:pPr>
+      <w:r>
+        <w:t>Stage 2 – Backend Image Operation Classes</w:t>
+      </w:r>
+    </w:p>
+    <w:p>
+      <w:pPr>
+        <w:pStyle w:val="ListParagraph"/>
+        <w:numPr>
+          <w:ilvl w:val="0"/>
+          <w:numId w:val="15"/>
+        </w:numPr>
+      </w:pPr>
+      <w:r>
+        <w:t xml:space="preserve">Plan unit testing for </w:t>
+      </w:r>
+      <w:r>
+        <w:rPr>
+          <w:b/>
+          <w:bCs/>
+        </w:rPr>
+        <w:t>Parameters</w:t>
+      </w:r>
+      <w:r>
+        <w:t xml:space="preserve">, </w:t>
+      </w:r>
+      <w:proofErr w:type="spellStart"/>
+      <w:r>
+        <w:rPr>
+          <w:b/>
+          <w:bCs/>
+        </w:rPr>
+        <w:t>ImageOperation</w:t>
+      </w:r>
+      <w:proofErr w:type="spellEnd"/>
+      <w:r>
+        <w:t xml:space="preserve"> and </w:t>
+      </w:r>
+      <w:proofErr w:type="spellStart"/>
+      <w:r>
+        <w:rPr>
+          <w:b/>
+          <w:bCs/>
+        </w:rPr>
+        <w:t>ImageOperationDirectory</w:t>
+      </w:r>
+      <w:proofErr w:type="spellEnd"/>
+      <w:r>
+        <w:t xml:space="preserve"> classes.</w:t>
+      </w:r>
+    </w:p>
+    <w:p>
+      <w:pPr>
+        <w:pStyle w:val="ListParagraph"/>
+        <w:numPr>
+          <w:ilvl w:val="0"/>
+          <w:numId w:val="15"/>
+        </w:numPr>
+      </w:pPr>
+      <w:r>
+        <w:t xml:space="preserve">Implement </w:t>
+      </w:r>
+      <w:r>
+        <w:rPr>
+          <w:b/>
+          <w:bCs/>
+        </w:rPr>
+        <w:t>Parameters</w:t>
+      </w:r>
+      <w:r>
+        <w:t xml:space="preserve">, </w:t>
+      </w:r>
+      <w:proofErr w:type="spellStart"/>
+      <w:r>
+        <w:rPr>
+          <w:b/>
+          <w:bCs/>
+        </w:rPr>
+        <w:t>ImageOperation</w:t>
+      </w:r>
+      <w:proofErr w:type="spellEnd"/>
+      <w:r>
+        <w:t xml:space="preserve"> and </w:t>
+      </w:r>
+      <w:proofErr w:type="spellStart"/>
+      <w:r>
+        <w:rPr>
+          <w:b/>
+          <w:bCs/>
+        </w:rPr>
+        <w:t>ImageOperationDirectory</w:t>
+      </w:r>
+      <w:proofErr w:type="spellEnd"/>
+      <w:r>
+        <w:t xml:space="preserve"> classes.</w:t>
+      </w:r>
+    </w:p>
+    <w:p>
+      <w:pPr>
+        <w:pStyle w:val="ListParagraph"/>
+        <w:numPr>
+          <w:ilvl w:val="0"/>
+          <w:numId w:val="15"/>
+        </w:numPr>
+      </w:pPr>
+      <w:r>
+        <w:t xml:space="preserve">Test </w:t>
+      </w:r>
+      <w:r>
+        <w:rPr>
+          <w:b/>
+          <w:bCs/>
+        </w:rPr>
+        <w:t>Parameters</w:t>
+      </w:r>
+      <w:r>
+        <w:t xml:space="preserve">, </w:t>
+      </w:r>
+      <w:proofErr w:type="spellStart"/>
+      <w:r>
+        <w:rPr>
+          <w:b/>
+          <w:bCs/>
+        </w:rPr>
+        <w:t>ImageOperation</w:t>
+      </w:r>
+      <w:proofErr w:type="spellEnd"/>
+      <w:r>
+        <w:t xml:space="preserve"> and </w:t>
+      </w:r>
+      <w:proofErr w:type="spellStart"/>
+      <w:r>
+        <w:rPr>
+          <w:b/>
+          <w:bCs/>
+        </w:rPr>
+        <w:t>ImageOperationDirectory</w:t>
+      </w:r>
+      <w:proofErr w:type="spellEnd"/>
+      <w:r>
+        <w:t xml:space="preserve"> classes.</w:t>
+      </w:r>
+    </w:p>
+    <w:p>
+      <w:pPr>
+        <w:pStyle w:val="Heading3"/>
+      </w:pPr>
+      <w:r>
+        <w:lastRenderedPageBreak/>
+        <w:t>Stage 3 – Backend Workflow Sub-classes</w:t>
+      </w:r>
+    </w:p>
+    <w:p>
+      <w:pPr>
+        <w:pStyle w:val="ListParagraph"/>
+        <w:numPr>
+          <w:ilvl w:val="0"/>
+          <w:numId w:val="16"/>
+        </w:numPr>
+      </w:pPr>
+      <w:r>
+        <w:t xml:space="preserve">Plan unit testing for </w:t>
+      </w:r>
+      <w:r>
+        <w:rPr>
+          <w:b/>
+          <w:bCs/>
+        </w:rPr>
+        <w:t>Port</w:t>
+      </w:r>
+      <w:r>
+        <w:t xml:space="preserve">, </w:t>
+      </w:r>
+      <w:r>
+        <w:rPr>
+          <w:b/>
+          <w:bCs/>
+        </w:rPr>
+        <w:t>Node</w:t>
+      </w:r>
+      <w:r>
+        <w:t xml:space="preserve"> and </w:t>
+      </w:r>
+      <w:r>
+        <w:rPr>
+          <w:b/>
+          <w:bCs/>
+        </w:rPr>
+        <w:t>Connection</w:t>
+      </w:r>
+      <w:r>
+        <w:t xml:space="preserve"> classes.</w:t>
+      </w:r>
+    </w:p>
+    <w:p>
+      <w:pPr>
+        <w:pStyle w:val="ListParagraph"/>
+        <w:numPr>
+          <w:ilvl w:val="0"/>
+          <w:numId w:val="16"/>
+        </w:numPr>
+      </w:pPr>
+      <w:r>
+        <w:t xml:space="preserve">Implement </w:t>
+      </w:r>
+      <w:r>
+        <w:rPr>
+          <w:b/>
+          <w:bCs/>
+        </w:rPr>
+        <w:t>Port</w:t>
+      </w:r>
+      <w:r>
+        <w:t xml:space="preserve">, </w:t>
+      </w:r>
+      <w:r>
+        <w:rPr>
+          <w:b/>
+          <w:bCs/>
+        </w:rPr>
+        <w:t>Node</w:t>
+      </w:r>
+      <w:r>
+        <w:t xml:space="preserve"> and </w:t>
+      </w:r>
+      <w:r>
+        <w:rPr>
+          <w:b/>
+          <w:bCs/>
+        </w:rPr>
+        <w:t>Connection</w:t>
+      </w:r>
+      <w:r>
+        <w:t xml:space="preserve"> classes.</w:t>
+      </w:r>
+    </w:p>
+    <w:p>
+      <w:pPr>
+        <w:pStyle w:val="ListParagraph"/>
+        <w:numPr>
+          <w:ilvl w:val="0"/>
+          <w:numId w:val="16"/>
+        </w:numPr>
+      </w:pPr>
+      <w:r>
+        <w:t xml:space="preserve">Test </w:t>
+      </w:r>
+      <w:r>
+        <w:rPr>
+          <w:b/>
+          <w:bCs/>
+        </w:rPr>
+        <w:t>Port</w:t>
+      </w:r>
+      <w:r>
+        <w:t xml:space="preserve">, </w:t>
+      </w:r>
+      <w:r>
+        <w:rPr>
+          <w:b/>
+          <w:bCs/>
+        </w:rPr>
+        <w:t>Node</w:t>
+      </w:r>
+      <w:r>
+        <w:t xml:space="preserve"> and </w:t>
+      </w:r>
+      <w:r>
+        <w:rPr>
+          <w:b/>
+          <w:bCs/>
+        </w:rPr>
+        <w:t>Connection</w:t>
+      </w:r>
+      <w:r>
+        <w:t xml:space="preserve"> classes.</w:t>
+      </w:r>
+    </w:p>
+    <w:p>
+      <w:pPr>
+        <w:pStyle w:val="Heading3"/>
+      </w:pPr>
+      <w:r>
+        <w:t>Stage 4 – Backend Workflow Class</w:t>
+      </w:r>
+    </w:p>
+    <w:p>
+      <w:pPr>
+        <w:pStyle w:val="ListParagraph"/>
+        <w:numPr>
+          <w:ilvl w:val="0"/>
+          <w:numId w:val="16"/>
+        </w:numPr>
+      </w:pPr>
+      <w:r>
+        <w:t xml:space="preserve">Plan unit testing for </w:t>
+      </w:r>
+      <w:r>
+        <w:rPr>
+          <w:b/>
+          <w:bCs/>
+        </w:rPr>
+        <w:t>Workflow</w:t>
+      </w:r>
+      <w:r>
+        <w:t xml:space="preserve"> class.</w:t>
+      </w:r>
+    </w:p>
+    <w:p>
+      <w:pPr>
+        <w:pStyle w:val="ListParagraph"/>
+        <w:numPr>
+          <w:ilvl w:val="0"/>
+          <w:numId w:val="16"/>
+        </w:numPr>
+      </w:pPr>
+      <w:r>
+        <w:t xml:space="preserve">Implement </w:t>
+      </w:r>
+      <w:r>
+        <w:rPr>
+          <w:b/>
+          <w:bCs/>
+        </w:rPr>
+        <w:t>Workflow</w:t>
+      </w:r>
+      <w:r>
+        <w:t xml:space="preserve"> class.</w:t>
+      </w:r>
+    </w:p>
+    <w:p>
+      <w:pPr>
+        <w:pStyle w:val="ListParagraph"/>
+        <w:numPr>
+          <w:ilvl w:val="0"/>
+          <w:numId w:val="16"/>
+        </w:numPr>
+      </w:pPr>
+      <w:r>
+        <w:t xml:space="preserve">Test </w:t>
+      </w:r>
+      <w:r>
+        <w:rPr>
+          <w:b/>
+          <w:bCs/>
+        </w:rPr>
+        <w:t>Workflow</w:t>
+      </w:r>
+      <w:r>
+        <w:t xml:space="preserve"> class.</w:t>
+      </w:r>
+    </w:p>
+    <w:p>
+      <w:pPr>
+        <w:pStyle w:val="Heading3"/>
+      </w:pPr>
+      <w:r>
+        <w:t>Stage 5</w:t>
+      </w:r>
+      <w:r>
+        <w:t xml:space="preserve"> – Frontend Planning</w:t>
+      </w:r>
+    </w:p>
+    <w:p>
+      <w:pPr>
+        <w:pStyle w:val="ListParagraph"/>
+        <w:numPr>
+          <w:ilvl w:val="0"/>
+          <w:numId w:val="17"/>
+        </w:numPr>
+      </w:pPr>
+      <w:r>
+        <w:t>Detailed plans for frontend from initial overview.</w:t>
+      </w:r>
+    </w:p>
+    <w:p>
+      <w:pPr>
+        <w:pStyle w:val="ListParagraph"/>
+        <w:numPr>
+          <w:ilvl w:val="0"/>
+          <w:numId w:val="17"/>
+        </w:numPr>
+      </w:pPr>
+      <w:r>
+        <w:t>Plan implementation of frontend.</w:t>
+      </w:r>
+    </w:p>
+    <w:p/>
+    <w:p>
+      <w:pPr>
         <w:rPr>
           <w:b/>
           <w:bCs/>
@@ -402,7 +1910,15 @@
         </w:numPr>
       </w:pPr>
       <w:r>
-        <w:t>Changes to image shape should always be explicit, never incidental. For example, z-projection will reduce z dimension to 1 because that’s what z projection does, but thresholding a 5 slice z-stack will output 5 thresholds, not just 1.</w:t>
+        <w:t xml:space="preserve">Changes to image shape should always be explicit, never incidental. For example, z-projection will reduce z dimension to 1 because that’s what z projection does, but thresholding a </w:t>
+      </w:r>
+      <w:proofErr w:type="gramStart"/>
+      <w:r>
+        <w:t>5 slice</w:t>
+      </w:r>
+      <w:proofErr w:type="gramEnd"/>
+      <w:r>
+        <w:t xml:space="preserve"> z-stack will output 5 thresholds, not just 1.</w:t>
       </w:r>
     </w:p>
     <w:p>
@@ -426,20 +1942,79 @@
         <w:t>it according to the supplied parameters</w:t>
       </w:r>
       <w:r>
-        <w:t xml:space="preserve">, and produce an output in defined shape. As </w:t>
-      </w:r>
+        <w:t>, and produce an output in defined shape. As part of this role, it should include error handling to minimi</w:t>
+      </w:r>
+      <w:r>
+        <w:t>s</w:t>
+      </w:r>
+      <w:r>
+        <w:t>e/deal with possible errors (with the assumption that the input is of the required format)</w:t>
+      </w:r>
+      <w:r>
+        <w:t xml:space="preserve">. </w:t>
+      </w:r>
+    </w:p>
+    <w:p>
+      <w:pPr>
+        <w:pStyle w:val="ListParagraph"/>
+        <w:numPr>
+          <w:ilvl w:val="0"/>
+          <w:numId w:val="1"/>
+        </w:numPr>
+      </w:pPr>
+      <w:r>
+        <w:t xml:space="preserve">To allow for simple additions of new functions without affecting the base code, each function will be in a separate module. Along with the code itself, this module should include other data required to integrate into the software (definitions of parameters required, input and output data types, input and output image shape) and documentation (what the </w:t>
+      </w:r>
+      <w:r>
+        <w:t>function does, how it affects the image shape, how changes to parameters affect output, any other points of interest).</w:t>
+      </w:r>
+      <w:r>
+        <w:t xml:space="preserve"> </w:t>
+      </w:r>
+    </w:p>
+    <w:p>
+      <w:pPr>
+        <w:pStyle w:val="ListParagraph"/>
+        <w:numPr>
+          <w:ilvl w:val="0"/>
+          <w:numId w:val="1"/>
+        </w:numPr>
+      </w:pPr>
+      <w:r>
+        <w:t>Type checking etc will be carried out by the pipeline functions, along with checking that the input and output image shapes are as expected.</w:t>
+      </w:r>
+    </w:p>
+    <w:p>
+      <w:pPr>
+        <w:pStyle w:val="ListParagraph"/>
+        <w:numPr>
+          <w:ilvl w:val="0"/>
+          <w:numId w:val="1"/>
+        </w:numPr>
+      </w:pPr>
+      <w:r>
+        <w:t xml:space="preserve">Functions can have multiple outputs, but defined inputs. For example, a z-stack could have one output getting z-projected, another getting processes slice by slice etc, but two images could not enter the same z-projection function. Some functions may require multiple inputs, </w:t>
+      </w:r>
+      <w:proofErr w:type="spellStart"/>
+      <w:r>
+        <w:t>eg</w:t>
+      </w:r>
+      <w:proofErr w:type="spellEnd"/>
+      <w:r>
+        <w:t xml:space="preserve"> applying a threshold will require thresholds and an image to apply thresholds to.</w:t>
+      </w:r>
+    </w:p>
+    <w:p>
+      <w:pPr>
+        <w:pStyle w:val="ListParagraph"/>
+        <w:numPr>
+          <w:ilvl w:val="0"/>
+          <w:numId w:val="1"/>
+        </w:numPr>
+      </w:pPr>
       <w:r>
         <w:lastRenderedPageBreak/>
-        <w:t>part of this role, it should include error handling to minimi</w:t>
-      </w:r>
-      <w:r>
-        <w:t>s</w:t>
-      </w:r>
-      <w:r>
-        <w:t>e/deal with possible errors (with the assumption that the input is of the required format)</w:t>
-      </w:r>
-      <w:r>
-        <w:t xml:space="preserve">. </w:t>
+        <w:t>Some thought is going to have to be given to how to deal with segmented images. Are segments treated as an image of size y * x with integer values defining segment locations? Is each segment treated like its own sub-image (like channels or z-slices)? Is a segmented image treated as the original image with an added layer defining the segments? Leaning towards the first option, but the other options may have advantages in specific situations.</w:t>
       </w:r>
     </w:p>
     <w:p>
@@ -451,13 +2026,23 @@
         </w:numPr>
       </w:pPr>
       <w:r>
-        <w:t xml:space="preserve">To allow for simple additions of new functions without affecting the base code, each function will be in a separate module. Along with the code itself, this module should include other data required to integrate into the software (definitions of parameters required, input and output data types, input and output image shape) and documentation (what the </w:t>
-      </w:r>
-      <w:r>
-        <w:t>function does, how it affects the image shape, how changes to parameters affect output, any other points of interest).</w:t>
-      </w:r>
-      <w:r>
-        <w:t xml:space="preserve"> </w:t>
+        <w:t>Some type changes should be dealt with automatically (</w:t>
+      </w:r>
+      <w:proofErr w:type="spellStart"/>
+      <w:r>
+        <w:t>ie</w:t>
+      </w:r>
+      <w:proofErr w:type="spellEnd"/>
+      <w:r>
+        <w:t>, int to float). Some type changes should be highlighted to user as a flaw in the workflow (</w:t>
+      </w:r>
+      <w:proofErr w:type="spellStart"/>
+      <w:r>
+        <w:t>ie</w:t>
+      </w:r>
+      <w:proofErr w:type="spellEnd"/>
+      <w:r>
+        <w:t>, trying to carry out a binary process on a non-binarised image) with pointers on how to fix the issue).</w:t>
       </w:r>
     </w:p>
     <w:p>
@@ -469,7 +2054,7 @@
         </w:numPr>
       </w:pPr>
       <w:r>
-        <w:t>Type checking etc will be carried out by the pipeline functions, along with checking that the input and output image shapes are as expected.</w:t>
+        <w:t>It should be possible to add new functions without programming new UI elements. The data included with a function must be sufficient to automatically generate a UI element for the user to enter the required parameters.</w:t>
       </w:r>
     </w:p>
     <w:p>
@@ -481,7 +2066,10 @@
         </w:numPr>
       </w:pPr>
       <w:r>
-        <w:t>Functions can have multiple outputs, but defined inputs. For example, a z-stack could have one output getting z-projected, another getting processes slice by slice etc, but two images could not enter the same z-projection function. Some functions may require multiple inputs, eg applying a threshold will require thresholds and an image to apply thresholds to.</w:t>
+        <w:t>If its educational, it needs documentation. Consider whether this should be included as a string within any new function or as a separate file</w:t>
+      </w:r>
+      <w:r>
+        <w:t>.</w:t>
       </w:r>
     </w:p>
     <w:p>
@@ -493,7 +2081,7 @@
         </w:numPr>
       </w:pPr>
       <w:r>
-        <w:t>Some thought is going to have to be given to how to deal with segmented images. Are segments treated as an image of size y * x with integer values defining segment locations? Is each segment treated like its own sub-image (like channels or z-slices)? Is a segmented image treated as the original image with an added layer defining the segments? Leaning towards the first option, but the other options may have advantages in specific situations.</w:t>
+        <w:t>The UI should be unintimidating. Consider what is necessary to see (input image, output image for comparison, channel and slice controls, current workflow diagram) and what can be hidden except when needed (LUTs, adding functions, changing function parameters, defining channel image parameters (channel names etc)).</w:t>
       </w:r>
     </w:p>
     <w:p>
@@ -505,62 +2093,31 @@
         </w:numPr>
       </w:pPr>
       <w:r>
-        <w:t>Some type changes should be dealt with automatically (ie, int to float). Some type changes should be highlighted to user as a flaw in the workflow (ie, trying to carry out a binary process on a non-binarised image) with pointers on how to fix the issue).</w:t>
-      </w:r>
-    </w:p>
-    <w:p>
-      <w:pPr>
-        <w:pStyle w:val="ListParagraph"/>
-        <w:numPr>
-          <w:ilvl w:val="0"/>
-          <w:numId w:val="1"/>
-        </w:numPr>
-      </w:pPr>
-      <w:r>
-        <w:t>It should be possible to add new functions without programming new UI elements. The data included with a function must be sufficient to automatically generate a UI element for the user to enter the required parameters.</w:t>
-      </w:r>
-    </w:p>
-    <w:p>
-      <w:pPr>
-        <w:pStyle w:val="ListParagraph"/>
-        <w:numPr>
-          <w:ilvl w:val="0"/>
-          <w:numId w:val="1"/>
-        </w:numPr>
-      </w:pPr>
-      <w:r>
-        <w:t>If its educational, it needs documentation. Consider whether this should be included as a string within any new function or as a separate file</w:t>
-      </w:r>
-      <w:r>
-        <w:t>.</w:t>
-      </w:r>
-    </w:p>
-    <w:p>
-      <w:pPr>
-        <w:pStyle w:val="ListParagraph"/>
-        <w:numPr>
-          <w:ilvl w:val="0"/>
-          <w:numId w:val="1"/>
-        </w:numPr>
-      </w:pPr>
-      <w:r>
-        <w:t>The UI should be unintimidating. Consider what is necessary to see (input image, output image for comparison, channel and slice controls, current workflow diagram) and what can be hidden except when needed (LUTs, adding functions, changing function parameters, defining channel image parameters (channel names etc)).</w:t>
-      </w:r>
-    </w:p>
-    <w:p>
-      <w:pPr>
-        <w:pStyle w:val="ListParagraph"/>
-        <w:numPr>
-          <w:ilvl w:val="0"/>
-          <w:numId w:val="1"/>
-        </w:numPr>
-      </w:pPr>
-      <w:r>
-        <w:t xml:space="preserve">One of the challenges of image analysis I would like to simplify here is making sure an input image to a function is in the right format. Transposition of shape (eg, 3*1024*1024 image to 1024*1024*3 image) and data type (int to float) will be handled automatically. The user will be responsible for making sure a function that requires a 1*1024*1024 image doesn’t get sent a 3*5*1024*1024 image. For this to be intuitive, each function must have a clearly defined and invariable effect on image shape (eg, z-projection will reduce Z to 1. Isolating a channel will reduce channels to </w:t>
-      </w:r>
-      <w:r>
-        <w:lastRenderedPageBreak/>
-        <w:t>1 or conversely, z-projection won’t affect channels so channels in = channels out). This allows the user to clearly see what effect each function has on the shape of the image, and also allows the software to give pointers (ie, if the user is trying to squeeze a 3 * 1024 * 1024 image into a function that requires a 1 * 1024 * 1024 image, or an integer image into a function that requires a binarized input, highlight potential functions that can be used to fit the image to the required shape).</w:t>
+        <w:t>One of the challenges of image analysis I would like to simplify here is making sure an input image to a function is in the right format. Transposition of shape (</w:t>
+      </w:r>
+      <w:proofErr w:type="spellStart"/>
+      <w:r>
+        <w:t>eg</w:t>
+      </w:r>
+      <w:proofErr w:type="spellEnd"/>
+      <w:r>
+        <w:t>, 3*1024*1024 image to 1024*1024*3 image) and data type (int to float) will be handled automatically. The user will be responsible for making sure a function that requires a 1*1024*1024 image doesn’t get sent a 3*5*1024*1024 image. For this to be intuitive, each function must have a clearly defined and invariable effect on image shape (</w:t>
+      </w:r>
+      <w:proofErr w:type="spellStart"/>
+      <w:r>
+        <w:t>eg</w:t>
+      </w:r>
+      <w:proofErr w:type="spellEnd"/>
+      <w:r>
+        <w:t>, z-projection will reduce Z to 1. Isolating a channel will reduce channels to 1 or conversely, z-projection won’t affect channels so channels in = channels out). This allows the user to clearly see what effect each function has on the shape of the image, and also allows the software to give pointers (</w:t>
+      </w:r>
+      <w:proofErr w:type="spellStart"/>
+      <w:r>
+        <w:t>ie</w:t>
+      </w:r>
+      <w:proofErr w:type="spellEnd"/>
+      <w:r>
+        <w:t>, if the user is trying to squeeze a 3 * 1024 * 1024 image into a function that requires a 1 * 1024 * 1024 image, or an integer image into a function that requires a binarized input, highlight potential functions that can be used to fit the image to the required shape).</w:t>
       </w:r>
     </w:p>
     <w:p>
@@ -629,7 +2186,17 @@
         </w:numPr>
       </w:pPr>
       <w:r>
-        <w:t>In images, need to know which dimension of the np.array holds C or Z.</w:t>
+        <w:t xml:space="preserve">In images, need to know which dimension of the </w:t>
+      </w:r>
+      <w:proofErr w:type="spellStart"/>
+      <w:proofErr w:type="gramStart"/>
+      <w:r>
+        <w:t>np.array</w:t>
+      </w:r>
+      <w:proofErr w:type="spellEnd"/>
+      <w:proofErr w:type="gramEnd"/>
+      <w:r>
+        <w:t xml:space="preserve"> holds C or Z.</w:t>
       </w:r>
     </w:p>
     <w:p>
@@ -641,8 +2208,45 @@
         </w:numPr>
       </w:pPr>
       <w:r>
-        <w:t>Therefore image_shape class has c_dim, z_dim, y_dim, x_dim</w:t>
-      </w:r>
+        <w:t xml:space="preserve">Therefore </w:t>
+      </w:r>
+      <w:proofErr w:type="spellStart"/>
+      <w:r>
+        <w:t>image_shape</w:t>
+      </w:r>
+      <w:proofErr w:type="spellEnd"/>
+      <w:r>
+        <w:t xml:space="preserve"> class has </w:t>
+      </w:r>
+      <w:proofErr w:type="spellStart"/>
+      <w:r>
+        <w:t>c_dim</w:t>
+      </w:r>
+      <w:proofErr w:type="spellEnd"/>
+      <w:r>
+        <w:t xml:space="preserve">, </w:t>
+      </w:r>
+      <w:proofErr w:type="spellStart"/>
+      <w:r>
+        <w:t>z_dim</w:t>
+      </w:r>
+      <w:proofErr w:type="spellEnd"/>
+      <w:r>
+        <w:t xml:space="preserve">, </w:t>
+      </w:r>
+      <w:proofErr w:type="spellStart"/>
+      <w:r>
+        <w:t>y_dim</w:t>
+      </w:r>
+      <w:proofErr w:type="spellEnd"/>
+      <w:r>
+        <w:t xml:space="preserve">, </w:t>
+      </w:r>
+      <w:proofErr w:type="spellStart"/>
+      <w:r>
+        <w:t>x_dim</w:t>
+      </w:r>
+      <w:proofErr w:type="spellEnd"/>
     </w:p>
     <w:p>
       <w:pPr>
@@ -651,8 +2255,15 @@
           <w:ilvl w:val="1"/>
           <w:numId w:val="2"/>
         </w:numPr>
-      </w:pPr>
-      <w:r>
+        <w:rPr>
+          <w:strike/>
+        </w:rPr>
+      </w:pPr>
+      <w:r>
+        <w:rPr>
+          <w:strike/>
+        </w:rPr>
+        <w:lastRenderedPageBreak/>
         <w:t>Image class itself needs to be able to iterate through c, iterate through z, iterate through y and iterate through x.</w:t>
       </w:r>
     </w:p>
@@ -663,9 +2274,71 @@
           <w:ilvl w:val="1"/>
           <w:numId w:val="2"/>
         </w:numPr>
-      </w:pPr>
-      <w:r>
-        <w:t>The images returned form these iterations need their own image_shape class (i.e, an image iterated through z slices will have an image_shape class with z = -1 - so can then iterate through channels and so on.</w:t>
+        <w:rPr>
+          <w:strike/>
+        </w:rPr>
+      </w:pPr>
+      <w:r>
+        <w:rPr>
+          <w:strike/>
+        </w:rPr>
+        <w:t xml:space="preserve">The images returned </w:t>
+      </w:r>
+      <w:proofErr w:type="spellStart"/>
+      <w:r>
+        <w:rPr>
+          <w:strike/>
+        </w:rPr>
+        <w:t>form</w:t>
+      </w:r>
+      <w:proofErr w:type="spellEnd"/>
+      <w:r>
+        <w:rPr>
+          <w:strike/>
+        </w:rPr>
+        <w:t xml:space="preserve"> these iterations need their own </w:t>
+      </w:r>
+      <w:proofErr w:type="spellStart"/>
+      <w:r>
+        <w:rPr>
+          <w:strike/>
+        </w:rPr>
+        <w:t>image_shape</w:t>
+      </w:r>
+      <w:proofErr w:type="spellEnd"/>
+      <w:r>
+        <w:rPr>
+          <w:strike/>
+        </w:rPr>
+        <w:t xml:space="preserve"> class (</w:t>
+      </w:r>
+      <w:proofErr w:type="spellStart"/>
+      <w:r>
+        <w:rPr>
+          <w:strike/>
+        </w:rPr>
+        <w:t>i.e</w:t>
+      </w:r>
+      <w:proofErr w:type="spellEnd"/>
+      <w:r>
+        <w:rPr>
+          <w:strike/>
+        </w:rPr>
+        <w:t xml:space="preserve">, an image iterated through z slices will have an </w:t>
+      </w:r>
+      <w:proofErr w:type="spellStart"/>
+      <w:r>
+        <w:rPr>
+          <w:strike/>
+        </w:rPr>
+        <w:t>image_shape</w:t>
+      </w:r>
+      <w:proofErr w:type="spellEnd"/>
+      <w:r>
+        <w:rPr>
+          <w:strike/>
+        </w:rPr>
+        <w:t xml:space="preserve"> class with z = -1 - so can then iterate through channels and so on.</w:t>
       </w:r>
     </w:p>
     <w:p>
@@ -677,7 +2350,15 @@
         </w:numPr>
       </w:pPr>
       <w:r>
-        <w:t>The output from a function will be an image, this will have its own image_shape class so that role of a function is dealt with here.</w:t>
+        <w:t xml:space="preserve">The output from a function will be an image, this will have its own </w:t>
+      </w:r>
+      <w:proofErr w:type="spellStart"/>
+      <w:r>
+        <w:t>image_shape</w:t>
+      </w:r>
+      <w:proofErr w:type="spellEnd"/>
+      <w:r>
+        <w:t xml:space="preserve"> class so that role of a function is dealt with here.</w:t>
       </w:r>
     </w:p>
     <w:p>
@@ -689,7 +2370,15 @@
         </w:numPr>
       </w:pPr>
       <w:r>
-        <w:t>The constraints on an node will also use this class. Node inputs can be "I need 1 channel, I don't care about x, I don't care about Y, I don't care about z" - this can fit into image_shape class as C = 1, y = x = z = -1.</w:t>
+        <w:t xml:space="preserve">The constraints on a node will also use this class. Node inputs can be "I need 1 channel, I don't care about x, I don't care about Y, I don't care about z" - this can fit into </w:t>
+      </w:r>
+      <w:proofErr w:type="spellStart"/>
+      <w:r>
+        <w:t>image_shape</w:t>
+      </w:r>
+      <w:proofErr w:type="spellEnd"/>
+      <w:r>
+        <w:t xml:space="preserve"> class as C = 1, y = x = z = -1.</w:t>
       </w:r>
     </w:p>
     <w:p>
@@ -701,7 +2390,23 @@
         </w:numPr>
       </w:pPr>
       <w:r>
-        <w:t>This will also fit for outputs, given currently anticipated effects that a function will have. Either output dimensions are the same or they are reduced to 1. So outputs could be "-1" for no change or "1" for changed to 1, "2" to changed to 2. There’s a slight possibility of needing to use strings for other operations “-3” or “/6” etc, at which point this class may need rethinking.</w:t>
+        <w:t xml:space="preserve">This will also fit for outputs, given currently anticipated effects that a function will have. Either output dimensions are the same or they are reduced to 1. </w:t>
+      </w:r>
+      <w:proofErr w:type="gramStart"/>
+      <w:r>
+        <w:t>So</w:t>
+      </w:r>
+      <w:proofErr w:type="gramEnd"/>
+      <w:r>
+        <w:t xml:space="preserve"> outputs could be "-1" for no change or "1" for changed to 1, "2" to </w:t>
+      </w:r>
+      <w:proofErr w:type="spellStart"/>
+      <w:r>
+        <w:t>changed</w:t>
+      </w:r>
+      <w:proofErr w:type="spellEnd"/>
+      <w:r>
+        <w:t xml:space="preserve"> to 2. There’s a slight possibility of needing to use strings for other operations “-3” or “/6” etc, at which point this class may need rethinking.</w:t>
       </w:r>
     </w:p>
     <w:p>
@@ -740,11 +2445,15 @@
         <w:t xml:space="preserve">e.g., </w:t>
       </w:r>
       <w:r>
-        <w:t xml:space="preserve">node 2) would be dragged into the workflow; this would add the node to the workflow class as a workflow element, but with no input or output connections specified. Next, the user would connect the node to the preceding node (node 1). At this point a function would be called within the workflow class to check what type conversions might be needed (in pseudo code, node2 input = int(node1 float output)) or whether there were larger problems with the input to node 2 that might need the user to add in intervening nodes to further process the data. If the function is satisfied that the connection between node 1 and node 2 is </w:t>
-      </w:r>
-      <w:r>
-        <w:lastRenderedPageBreak/>
-        <w:t>functional, the relevant inputs and outputs are added to the two node elements.</w:t>
+        <w:t xml:space="preserve">node 2) would be dragged into the workflow; this would add the node to the workflow class as a workflow element, but with no input or output connections specified. Next, the user would connect the node to the preceding node (node 1). At this point a function would be called within the workflow class to check what type conversions might be needed (in pseudo code, node2 input = </w:t>
+      </w:r>
+      <w:proofErr w:type="gramStart"/>
+      <w:r>
+        <w:t>int(</w:t>
+      </w:r>
+      <w:proofErr w:type="gramEnd"/>
+      <w:r>
+        <w:t>node1 float output)) or whether there were larger problems with the input to node 2 that might need the user to add in intervening nodes to further process the data. If the function is satisfied that the connection between node 1 and node 2 is functional, the relevant inputs and outputs are added to the two node elements.</w:t>
       </w:r>
     </w:p>
     <w:p>
@@ -824,6 +2533,7 @@
         </w:numPr>
       </w:pPr>
       <w:r>
+        <w:lastRenderedPageBreak/>
         <w:t>Apply threshold value</w:t>
       </w:r>
     </w:p>
@@ -943,9 +2653,11 @@
           <w:numId w:val="2"/>
         </w:numPr>
       </w:pPr>
+      <w:proofErr w:type="spellStart"/>
       <w:r>
         <w:t>Watershedding</w:t>
       </w:r>
+      <w:proofErr w:type="spellEnd"/>
     </w:p>
     <w:p>
       <w:pPr>
@@ -968,6 +2680,232 @@
 <file path=word/numbering.xml><?xml version="1.0" encoding="utf-8"?>
 <w:numbering xmlns:wpc="http://schemas.microsoft.com/office/word/2010/wordprocessingCanvas" xmlns:cx="http://schemas.microsoft.com/office/drawing/2014/chartex" xmlns:cx1="http://schemas.microsoft.com/office/drawing/2015/9/8/chartex" xmlns:cx2="http://schemas.microsoft.com/office/drawing/2015/10/21/chartex" xmlns:cx3="http://schemas.microsoft.com/office/drawing/2016/5/9/chartex" xmlns:cx4="http://schemas.microsoft.com/office/drawing/2016/5/10/chartex" xmlns:cx5="http://schemas.microsoft.com/office/drawing/2016/5/11/chartex" xmlns:cx6="http://schemas.microsoft.com/office/drawing/2016/5/12/chartex" xmlns:cx7="http://schemas.microsoft.com/office/drawing/2016/5/13/chartex" xmlns:cx8="http://schemas.microsoft.com/office/drawing/2016/5/14/chartex" xmlns:mc="http://schemas.openxmlformats.org/markup-compatibility/2006" xmlns:aink="http://schemas.microsoft.com/office/drawing/2016/ink" xmlns:am3d="http://schemas.microsoft.com/office/drawing/2017/model3d" xmlns:o="urn:schemas-microsoft-com:office:office" xmlns:oel="http://schemas.microsoft.com/office/2019/extlst" xmlns:r="http://schemas.openxmlformats.org/officeDocument/2006/relationships" xmlns:m="http://schemas.openxmlformats.org/officeDocument/2006/math" xmlns:v="urn:schemas-microsoft-com:vml" xmlns:wp14="http://schemas.microsoft.com/office/word/2010/wordprocessingDrawing" xmlns:wp="http://schemas.openxmlformats.org/drawingml/2006/wordprocessingDrawing" xmlns:w10="urn:schemas-microsoft-com:office:word" xmlns:w="http://schemas.openxmlformats.org/wordprocessingml/2006/main" xmlns:w14="http://schemas.microsoft.com/office/word/2010/wordml" xmlns:w15="http://schemas.microsoft.com/office/word/2012/wordml" xmlns:w16cex="http://schemas.microsoft.com/office/word/2018/wordml/cex" xmlns:w16cid="http://schemas.microsoft.com/office/word/2016/wordml/cid" xmlns:w16="http://schemas.microsoft.com/office/word/2018/wordml" xmlns:w16du="http://schemas.microsoft.com/office/word/2023/wordml/word16du" xmlns:w16sdtdh="http://schemas.microsoft.com/office/word/2020/wordml/sdtdatahash" xmlns:w16sdtfl="http://schemas.microsoft.com/office/word/2024/wordml/sdtformatlock" xmlns:w16se="http://schemas.microsoft.com/office/word/2015/wordml/symex" xmlns:wpg="http://schemas.microsoft.com/office/word/2010/wordprocessingGroup" xmlns:wpi="http://schemas.microsoft.com/office/word/2010/wordprocessingInk" xmlns:wne="http://schemas.microsoft.com/office/word/2006/wordml" xmlns:wps="http://schemas.microsoft.com/office/word/2010/wordprocessingShape" mc:Ignorable="w14 w15 w16se w16cid w16 w16cex w16sdtdh w16sdtfl w16du wp14">
   <w:abstractNum w:abstractNumId="0" w15:restartNumberingAfterBreak="0">
+    <w:nsid w:val="131A0838"/>
+    <w:multiLevelType w:val="hybridMultilevel"/>
+    <w:tmpl w:val="F6B89466"/>
+    <w:lvl w:ilvl="0" w:tplc="08090001">
+      <w:start w:val="1"/>
+      <w:numFmt w:val="bullet"/>
+      <w:lvlText w:val=""/>
+      <w:lvlJc w:val="left"/>
+      <w:pPr>
+        <w:ind w:left="720" w:hanging="360"/>
+      </w:pPr>
+      <w:rPr>
+        <w:rFonts w:ascii="Symbol" w:hAnsi="Symbol" w:hint="default"/>
+      </w:rPr>
+    </w:lvl>
+    <w:lvl w:ilvl="1" w:tplc="08090003" w:tentative="1">
+      <w:start w:val="1"/>
+      <w:numFmt w:val="bullet"/>
+      <w:lvlText w:val="o"/>
+      <w:lvlJc w:val="left"/>
+      <w:pPr>
+        <w:ind w:left="1440" w:hanging="360"/>
+      </w:pPr>
+      <w:rPr>
+        <w:rFonts w:ascii="Courier New" w:hAnsi="Courier New" w:cs="Courier New" w:hint="default"/>
+      </w:rPr>
+    </w:lvl>
+    <w:lvl w:ilvl="2" w:tplc="08090005" w:tentative="1">
+      <w:start w:val="1"/>
+      <w:numFmt w:val="bullet"/>
+      <w:lvlText w:val=""/>
+      <w:lvlJc w:val="left"/>
+      <w:pPr>
+        <w:ind w:left="2160" w:hanging="360"/>
+      </w:pPr>
+      <w:rPr>
+        <w:rFonts w:ascii="Wingdings" w:hAnsi="Wingdings" w:hint="default"/>
+      </w:rPr>
+    </w:lvl>
+    <w:lvl w:ilvl="3" w:tplc="08090001" w:tentative="1">
+      <w:start w:val="1"/>
+      <w:numFmt w:val="bullet"/>
+      <w:lvlText w:val=""/>
+      <w:lvlJc w:val="left"/>
+      <w:pPr>
+        <w:ind w:left="2880" w:hanging="360"/>
+      </w:pPr>
+      <w:rPr>
+        <w:rFonts w:ascii="Symbol" w:hAnsi="Symbol" w:hint="default"/>
+      </w:rPr>
+    </w:lvl>
+    <w:lvl w:ilvl="4" w:tplc="08090003" w:tentative="1">
+      <w:start w:val="1"/>
+      <w:numFmt w:val="bullet"/>
+      <w:lvlText w:val="o"/>
+      <w:lvlJc w:val="left"/>
+      <w:pPr>
+        <w:ind w:left="3600" w:hanging="360"/>
+      </w:pPr>
+      <w:rPr>
+        <w:rFonts w:ascii="Courier New" w:hAnsi="Courier New" w:cs="Courier New" w:hint="default"/>
+      </w:rPr>
+    </w:lvl>
+    <w:lvl w:ilvl="5" w:tplc="08090005" w:tentative="1">
+      <w:start w:val="1"/>
+      <w:numFmt w:val="bullet"/>
+      <w:lvlText w:val=""/>
+      <w:lvlJc w:val="left"/>
+      <w:pPr>
+        <w:ind w:left="4320" w:hanging="360"/>
+      </w:pPr>
+      <w:rPr>
+        <w:rFonts w:ascii="Wingdings" w:hAnsi="Wingdings" w:hint="default"/>
+      </w:rPr>
+    </w:lvl>
+    <w:lvl w:ilvl="6" w:tplc="08090001" w:tentative="1">
+      <w:start w:val="1"/>
+      <w:numFmt w:val="bullet"/>
+      <w:lvlText w:val=""/>
+      <w:lvlJc w:val="left"/>
+      <w:pPr>
+        <w:ind w:left="5040" w:hanging="360"/>
+      </w:pPr>
+      <w:rPr>
+        <w:rFonts w:ascii="Symbol" w:hAnsi="Symbol" w:hint="default"/>
+      </w:rPr>
+    </w:lvl>
+    <w:lvl w:ilvl="7" w:tplc="08090003" w:tentative="1">
+      <w:start w:val="1"/>
+      <w:numFmt w:val="bullet"/>
+      <w:lvlText w:val="o"/>
+      <w:lvlJc w:val="left"/>
+      <w:pPr>
+        <w:ind w:left="5760" w:hanging="360"/>
+      </w:pPr>
+      <w:rPr>
+        <w:rFonts w:ascii="Courier New" w:hAnsi="Courier New" w:cs="Courier New" w:hint="default"/>
+      </w:rPr>
+    </w:lvl>
+    <w:lvl w:ilvl="8" w:tplc="08090005" w:tentative="1">
+      <w:start w:val="1"/>
+      <w:numFmt w:val="bullet"/>
+      <w:lvlText w:val=""/>
+      <w:lvlJc w:val="left"/>
+      <w:pPr>
+        <w:ind w:left="6480" w:hanging="360"/>
+      </w:pPr>
+      <w:rPr>
+        <w:rFonts w:ascii="Wingdings" w:hAnsi="Wingdings" w:hint="default"/>
+      </w:rPr>
+    </w:lvl>
+  </w:abstractNum>
+  <w:abstractNum w:abstractNumId="1" w15:restartNumberingAfterBreak="0">
+    <w:nsid w:val="140F42DB"/>
+    <w:multiLevelType w:val="hybridMultilevel"/>
+    <w:tmpl w:val="2A76514E"/>
+    <w:lvl w:ilvl="0" w:tplc="08090001">
+      <w:start w:val="1"/>
+      <w:numFmt w:val="bullet"/>
+      <w:lvlText w:val=""/>
+      <w:lvlJc w:val="left"/>
+      <w:pPr>
+        <w:ind w:left="720" w:hanging="360"/>
+      </w:pPr>
+      <w:rPr>
+        <w:rFonts w:ascii="Symbol" w:hAnsi="Symbol" w:hint="default"/>
+      </w:rPr>
+    </w:lvl>
+    <w:lvl w:ilvl="1" w:tplc="08090003" w:tentative="1">
+      <w:start w:val="1"/>
+      <w:numFmt w:val="bullet"/>
+      <w:lvlText w:val="o"/>
+      <w:lvlJc w:val="left"/>
+      <w:pPr>
+        <w:ind w:left="1440" w:hanging="360"/>
+      </w:pPr>
+      <w:rPr>
+        <w:rFonts w:ascii="Courier New" w:hAnsi="Courier New" w:cs="Courier New" w:hint="default"/>
+      </w:rPr>
+    </w:lvl>
+    <w:lvl w:ilvl="2" w:tplc="08090005" w:tentative="1">
+      <w:start w:val="1"/>
+      <w:numFmt w:val="bullet"/>
+      <w:lvlText w:val=""/>
+      <w:lvlJc w:val="left"/>
+      <w:pPr>
+        <w:ind w:left="2160" w:hanging="360"/>
+      </w:pPr>
+      <w:rPr>
+        <w:rFonts w:ascii="Wingdings" w:hAnsi="Wingdings" w:hint="default"/>
+      </w:rPr>
+    </w:lvl>
+    <w:lvl w:ilvl="3" w:tplc="08090001" w:tentative="1">
+      <w:start w:val="1"/>
+      <w:numFmt w:val="bullet"/>
+      <w:lvlText w:val=""/>
+      <w:lvlJc w:val="left"/>
+      <w:pPr>
+        <w:ind w:left="2880" w:hanging="360"/>
+      </w:pPr>
+      <w:rPr>
+        <w:rFonts w:ascii="Symbol" w:hAnsi="Symbol" w:hint="default"/>
+      </w:rPr>
+    </w:lvl>
+    <w:lvl w:ilvl="4" w:tplc="08090003" w:tentative="1">
+      <w:start w:val="1"/>
+      <w:numFmt w:val="bullet"/>
+      <w:lvlText w:val="o"/>
+      <w:lvlJc w:val="left"/>
+      <w:pPr>
+        <w:ind w:left="3600" w:hanging="360"/>
+      </w:pPr>
+      <w:rPr>
+        <w:rFonts w:ascii="Courier New" w:hAnsi="Courier New" w:cs="Courier New" w:hint="default"/>
+      </w:rPr>
+    </w:lvl>
+    <w:lvl w:ilvl="5" w:tplc="08090005" w:tentative="1">
+      <w:start w:val="1"/>
+      <w:numFmt w:val="bullet"/>
+      <w:lvlText w:val=""/>
+      <w:lvlJc w:val="left"/>
+      <w:pPr>
+        <w:ind w:left="4320" w:hanging="360"/>
+      </w:pPr>
+      <w:rPr>
+        <w:rFonts w:ascii="Wingdings" w:hAnsi="Wingdings" w:hint="default"/>
+      </w:rPr>
+    </w:lvl>
+    <w:lvl w:ilvl="6" w:tplc="08090001" w:tentative="1">
+      <w:start w:val="1"/>
+      <w:numFmt w:val="bullet"/>
+      <w:lvlText w:val=""/>
+      <w:lvlJc w:val="left"/>
+      <w:pPr>
+        <w:ind w:left="5040" w:hanging="360"/>
+      </w:pPr>
+      <w:rPr>
+        <w:rFonts w:ascii="Symbol" w:hAnsi="Symbol" w:hint="default"/>
+      </w:rPr>
+    </w:lvl>
+    <w:lvl w:ilvl="7" w:tplc="08090003" w:tentative="1">
+      <w:start w:val="1"/>
+      <w:numFmt w:val="bullet"/>
+      <w:lvlText w:val="o"/>
+      <w:lvlJc w:val="left"/>
+      <w:pPr>
+        <w:ind w:left="5760" w:hanging="360"/>
+      </w:pPr>
+      <w:rPr>
+        <w:rFonts w:ascii="Courier New" w:hAnsi="Courier New" w:cs="Courier New" w:hint="default"/>
+      </w:rPr>
+    </w:lvl>
+    <w:lvl w:ilvl="8" w:tplc="08090005" w:tentative="1">
+      <w:start w:val="1"/>
+      <w:numFmt w:val="bullet"/>
+      <w:lvlText w:val=""/>
+      <w:lvlJc w:val="left"/>
+      <w:pPr>
+        <w:ind w:left="6480" w:hanging="360"/>
+      </w:pPr>
+      <w:rPr>
+        <w:rFonts w:ascii="Wingdings" w:hAnsi="Wingdings" w:hint="default"/>
+      </w:rPr>
+    </w:lvl>
+  </w:abstractNum>
+  <w:abstractNum w:abstractNumId="2" w15:restartNumberingAfterBreak="0">
     <w:nsid w:val="16B25DDF"/>
     <w:multiLevelType w:val="hybridMultilevel"/>
     <w:tmpl w:val="F11EB088"/>
@@ -1053,7 +2991,120 @@
       </w:pPr>
     </w:lvl>
   </w:abstractNum>
-  <w:abstractNum w:abstractNumId="1" w15:restartNumberingAfterBreak="0">
+  <w:abstractNum w:abstractNumId="3" w15:restartNumberingAfterBreak="0">
+    <w:nsid w:val="1A2237DF"/>
+    <w:multiLevelType w:val="hybridMultilevel"/>
+    <w:tmpl w:val="2A986194"/>
+    <w:lvl w:ilvl="0" w:tplc="08090001">
+      <w:start w:val="1"/>
+      <w:numFmt w:val="bullet"/>
+      <w:lvlText w:val=""/>
+      <w:lvlJc w:val="left"/>
+      <w:pPr>
+        <w:ind w:left="720" w:hanging="360"/>
+      </w:pPr>
+      <w:rPr>
+        <w:rFonts w:ascii="Symbol" w:hAnsi="Symbol" w:hint="default"/>
+      </w:rPr>
+    </w:lvl>
+    <w:lvl w:ilvl="1" w:tplc="08090003" w:tentative="1">
+      <w:start w:val="1"/>
+      <w:numFmt w:val="bullet"/>
+      <w:lvlText w:val="o"/>
+      <w:lvlJc w:val="left"/>
+      <w:pPr>
+        <w:ind w:left="1440" w:hanging="360"/>
+      </w:pPr>
+      <w:rPr>
+        <w:rFonts w:ascii="Courier New" w:hAnsi="Courier New" w:cs="Courier New" w:hint="default"/>
+      </w:rPr>
+    </w:lvl>
+    <w:lvl w:ilvl="2" w:tplc="08090005" w:tentative="1">
+      <w:start w:val="1"/>
+      <w:numFmt w:val="bullet"/>
+      <w:lvlText w:val=""/>
+      <w:lvlJc w:val="left"/>
+      <w:pPr>
+        <w:ind w:left="2160" w:hanging="360"/>
+      </w:pPr>
+      <w:rPr>
+        <w:rFonts w:ascii="Wingdings" w:hAnsi="Wingdings" w:hint="default"/>
+      </w:rPr>
+    </w:lvl>
+    <w:lvl w:ilvl="3" w:tplc="08090001" w:tentative="1">
+      <w:start w:val="1"/>
+      <w:numFmt w:val="bullet"/>
+      <w:lvlText w:val=""/>
+      <w:lvlJc w:val="left"/>
+      <w:pPr>
+        <w:ind w:left="2880" w:hanging="360"/>
+      </w:pPr>
+      <w:rPr>
+        <w:rFonts w:ascii="Symbol" w:hAnsi="Symbol" w:hint="default"/>
+      </w:rPr>
+    </w:lvl>
+    <w:lvl w:ilvl="4" w:tplc="08090003" w:tentative="1">
+      <w:start w:val="1"/>
+      <w:numFmt w:val="bullet"/>
+      <w:lvlText w:val="o"/>
+      <w:lvlJc w:val="left"/>
+      <w:pPr>
+        <w:ind w:left="3600" w:hanging="360"/>
+      </w:pPr>
+      <w:rPr>
+        <w:rFonts w:ascii="Courier New" w:hAnsi="Courier New" w:cs="Courier New" w:hint="default"/>
+      </w:rPr>
+    </w:lvl>
+    <w:lvl w:ilvl="5" w:tplc="08090005" w:tentative="1">
+      <w:start w:val="1"/>
+      <w:numFmt w:val="bullet"/>
+      <w:lvlText w:val=""/>
+      <w:lvlJc w:val="left"/>
+      <w:pPr>
+        <w:ind w:left="4320" w:hanging="360"/>
+      </w:pPr>
+      <w:rPr>
+        <w:rFonts w:ascii="Wingdings" w:hAnsi="Wingdings" w:hint="default"/>
+      </w:rPr>
+    </w:lvl>
+    <w:lvl w:ilvl="6" w:tplc="08090001" w:tentative="1">
+      <w:start w:val="1"/>
+      <w:numFmt w:val="bullet"/>
+      <w:lvlText w:val=""/>
+      <w:lvlJc w:val="left"/>
+      <w:pPr>
+        <w:ind w:left="5040" w:hanging="360"/>
+      </w:pPr>
+      <w:rPr>
+        <w:rFonts w:ascii="Symbol" w:hAnsi="Symbol" w:hint="default"/>
+      </w:rPr>
+    </w:lvl>
+    <w:lvl w:ilvl="7" w:tplc="08090003" w:tentative="1">
+      <w:start w:val="1"/>
+      <w:numFmt w:val="bullet"/>
+      <w:lvlText w:val="o"/>
+      <w:lvlJc w:val="left"/>
+      <w:pPr>
+        <w:ind w:left="5760" w:hanging="360"/>
+      </w:pPr>
+      <w:rPr>
+        <w:rFonts w:ascii="Courier New" w:hAnsi="Courier New" w:cs="Courier New" w:hint="default"/>
+      </w:rPr>
+    </w:lvl>
+    <w:lvl w:ilvl="8" w:tplc="08090005" w:tentative="1">
+      <w:start w:val="1"/>
+      <w:numFmt w:val="bullet"/>
+      <w:lvlText w:val=""/>
+      <w:lvlJc w:val="left"/>
+      <w:pPr>
+        <w:ind w:left="6480" w:hanging="360"/>
+      </w:pPr>
+      <w:rPr>
+        <w:rFonts w:ascii="Wingdings" w:hAnsi="Wingdings" w:hint="default"/>
+      </w:rPr>
+    </w:lvl>
+  </w:abstractNum>
+  <w:abstractNum w:abstractNumId="4" w15:restartNumberingAfterBreak="0">
     <w:nsid w:val="258F0C3B"/>
     <w:multiLevelType w:val="hybridMultilevel"/>
     <w:tmpl w:val="B35EB432"/>
@@ -1166,7 +3217,179 @@
       </w:rPr>
     </w:lvl>
   </w:abstractNum>
-  <w:abstractNum w:abstractNumId="2" w15:restartNumberingAfterBreak="0">
+  <w:abstractNum w:abstractNumId="5" w15:restartNumberingAfterBreak="0">
+    <w:nsid w:val="263F76CF"/>
+    <w:multiLevelType w:val="hybridMultilevel"/>
+    <w:tmpl w:val="5B8A548C"/>
+    <w:lvl w:ilvl="0" w:tplc="0809000F">
+      <w:start w:val="1"/>
+      <w:numFmt w:val="decimal"/>
+      <w:lvlText w:val="%1."/>
+      <w:lvlJc w:val="left"/>
+      <w:pPr>
+        <w:ind w:left="780" w:hanging="360"/>
+      </w:pPr>
+    </w:lvl>
+    <w:lvl w:ilvl="1" w:tplc="08090019" w:tentative="1">
+      <w:start w:val="1"/>
+      <w:numFmt w:val="lowerLetter"/>
+      <w:lvlText w:val="%2."/>
+      <w:lvlJc w:val="left"/>
+      <w:pPr>
+        <w:ind w:left="1500" w:hanging="360"/>
+      </w:pPr>
+    </w:lvl>
+    <w:lvl w:ilvl="2" w:tplc="0809001B" w:tentative="1">
+      <w:start w:val="1"/>
+      <w:numFmt w:val="lowerRoman"/>
+      <w:lvlText w:val="%3."/>
+      <w:lvlJc w:val="right"/>
+      <w:pPr>
+        <w:ind w:left="2220" w:hanging="180"/>
+      </w:pPr>
+    </w:lvl>
+    <w:lvl w:ilvl="3" w:tplc="0809000F" w:tentative="1">
+      <w:start w:val="1"/>
+      <w:numFmt w:val="decimal"/>
+      <w:lvlText w:val="%4."/>
+      <w:lvlJc w:val="left"/>
+      <w:pPr>
+        <w:ind w:left="2940" w:hanging="360"/>
+      </w:pPr>
+    </w:lvl>
+    <w:lvl w:ilvl="4" w:tplc="08090019" w:tentative="1">
+      <w:start w:val="1"/>
+      <w:numFmt w:val="lowerLetter"/>
+      <w:lvlText w:val="%5."/>
+      <w:lvlJc w:val="left"/>
+      <w:pPr>
+        <w:ind w:left="3660" w:hanging="360"/>
+      </w:pPr>
+    </w:lvl>
+    <w:lvl w:ilvl="5" w:tplc="0809001B" w:tentative="1">
+      <w:start w:val="1"/>
+      <w:numFmt w:val="lowerRoman"/>
+      <w:lvlText w:val="%6."/>
+      <w:lvlJc w:val="right"/>
+      <w:pPr>
+        <w:ind w:left="4380" w:hanging="180"/>
+      </w:pPr>
+    </w:lvl>
+    <w:lvl w:ilvl="6" w:tplc="0809000F" w:tentative="1">
+      <w:start w:val="1"/>
+      <w:numFmt w:val="decimal"/>
+      <w:lvlText w:val="%7."/>
+      <w:lvlJc w:val="left"/>
+      <w:pPr>
+        <w:ind w:left="5100" w:hanging="360"/>
+      </w:pPr>
+    </w:lvl>
+    <w:lvl w:ilvl="7" w:tplc="08090019" w:tentative="1">
+      <w:start w:val="1"/>
+      <w:numFmt w:val="lowerLetter"/>
+      <w:lvlText w:val="%8."/>
+      <w:lvlJc w:val="left"/>
+      <w:pPr>
+        <w:ind w:left="5820" w:hanging="360"/>
+      </w:pPr>
+    </w:lvl>
+    <w:lvl w:ilvl="8" w:tplc="0809001B" w:tentative="1">
+      <w:start w:val="1"/>
+      <w:numFmt w:val="lowerRoman"/>
+      <w:lvlText w:val="%9."/>
+      <w:lvlJc w:val="right"/>
+      <w:pPr>
+        <w:ind w:left="6540" w:hanging="180"/>
+      </w:pPr>
+    </w:lvl>
+  </w:abstractNum>
+  <w:abstractNum w:abstractNumId="6" w15:restartNumberingAfterBreak="0">
+    <w:nsid w:val="2B115959"/>
+    <w:multiLevelType w:val="hybridMultilevel"/>
+    <w:tmpl w:val="DD3E1A96"/>
+    <w:lvl w:ilvl="0" w:tplc="0809000F">
+      <w:start w:val="1"/>
+      <w:numFmt w:val="decimal"/>
+      <w:lvlText w:val="%1."/>
+      <w:lvlJc w:val="left"/>
+      <w:pPr>
+        <w:ind w:left="780" w:hanging="360"/>
+      </w:pPr>
+    </w:lvl>
+    <w:lvl w:ilvl="1" w:tplc="08090019" w:tentative="1">
+      <w:start w:val="1"/>
+      <w:numFmt w:val="lowerLetter"/>
+      <w:lvlText w:val="%2."/>
+      <w:lvlJc w:val="left"/>
+      <w:pPr>
+        <w:ind w:left="1500" w:hanging="360"/>
+      </w:pPr>
+    </w:lvl>
+    <w:lvl w:ilvl="2" w:tplc="0809001B" w:tentative="1">
+      <w:start w:val="1"/>
+      <w:numFmt w:val="lowerRoman"/>
+      <w:lvlText w:val="%3."/>
+      <w:lvlJc w:val="right"/>
+      <w:pPr>
+        <w:ind w:left="2220" w:hanging="180"/>
+      </w:pPr>
+    </w:lvl>
+    <w:lvl w:ilvl="3" w:tplc="0809000F" w:tentative="1">
+      <w:start w:val="1"/>
+      <w:numFmt w:val="decimal"/>
+      <w:lvlText w:val="%4."/>
+      <w:lvlJc w:val="left"/>
+      <w:pPr>
+        <w:ind w:left="2940" w:hanging="360"/>
+      </w:pPr>
+    </w:lvl>
+    <w:lvl w:ilvl="4" w:tplc="08090019" w:tentative="1">
+      <w:start w:val="1"/>
+      <w:numFmt w:val="lowerLetter"/>
+      <w:lvlText w:val="%5."/>
+      <w:lvlJc w:val="left"/>
+      <w:pPr>
+        <w:ind w:left="3660" w:hanging="360"/>
+      </w:pPr>
+    </w:lvl>
+    <w:lvl w:ilvl="5" w:tplc="0809001B" w:tentative="1">
+      <w:start w:val="1"/>
+      <w:numFmt w:val="lowerRoman"/>
+      <w:lvlText w:val="%6."/>
+      <w:lvlJc w:val="right"/>
+      <w:pPr>
+        <w:ind w:left="4380" w:hanging="180"/>
+      </w:pPr>
+    </w:lvl>
+    <w:lvl w:ilvl="6" w:tplc="0809000F" w:tentative="1">
+      <w:start w:val="1"/>
+      <w:numFmt w:val="decimal"/>
+      <w:lvlText w:val="%7."/>
+      <w:lvlJc w:val="left"/>
+      <w:pPr>
+        <w:ind w:left="5100" w:hanging="360"/>
+      </w:pPr>
+    </w:lvl>
+    <w:lvl w:ilvl="7" w:tplc="08090019" w:tentative="1">
+      <w:start w:val="1"/>
+      <w:numFmt w:val="lowerLetter"/>
+      <w:lvlText w:val="%8."/>
+      <w:lvlJc w:val="left"/>
+      <w:pPr>
+        <w:ind w:left="5820" w:hanging="360"/>
+      </w:pPr>
+    </w:lvl>
+    <w:lvl w:ilvl="8" w:tplc="0809001B" w:tentative="1">
+      <w:start w:val="1"/>
+      <w:numFmt w:val="lowerRoman"/>
+      <w:lvlText w:val="%9."/>
+      <w:lvlJc w:val="right"/>
+      <w:pPr>
+        <w:ind w:left="6540" w:hanging="180"/>
+      </w:pPr>
+    </w:lvl>
+  </w:abstractNum>
+  <w:abstractNum w:abstractNumId="7" w15:restartNumberingAfterBreak="0">
     <w:nsid w:val="2B521BFD"/>
     <w:multiLevelType w:val="hybridMultilevel"/>
     <w:tmpl w:val="EB56FB14"/>
@@ -1279,7 +3502,93 @@
       </w:rPr>
     </w:lvl>
   </w:abstractNum>
-  <w:abstractNum w:abstractNumId="3" w15:restartNumberingAfterBreak="0">
+  <w:abstractNum w:abstractNumId="8" w15:restartNumberingAfterBreak="0">
+    <w:nsid w:val="2EB63A4A"/>
+    <w:multiLevelType w:val="hybridMultilevel"/>
+    <w:tmpl w:val="C88E8454"/>
+    <w:lvl w:ilvl="0" w:tplc="0809000F">
+      <w:start w:val="1"/>
+      <w:numFmt w:val="decimal"/>
+      <w:lvlText w:val="%1."/>
+      <w:lvlJc w:val="left"/>
+      <w:pPr>
+        <w:ind w:left="720" w:hanging="360"/>
+      </w:pPr>
+    </w:lvl>
+    <w:lvl w:ilvl="1" w:tplc="08090019" w:tentative="1">
+      <w:start w:val="1"/>
+      <w:numFmt w:val="lowerLetter"/>
+      <w:lvlText w:val="%2."/>
+      <w:lvlJc w:val="left"/>
+      <w:pPr>
+        <w:ind w:left="1440" w:hanging="360"/>
+      </w:pPr>
+    </w:lvl>
+    <w:lvl w:ilvl="2" w:tplc="0809001B" w:tentative="1">
+      <w:start w:val="1"/>
+      <w:numFmt w:val="lowerRoman"/>
+      <w:lvlText w:val="%3."/>
+      <w:lvlJc w:val="right"/>
+      <w:pPr>
+        <w:ind w:left="2160" w:hanging="180"/>
+      </w:pPr>
+    </w:lvl>
+    <w:lvl w:ilvl="3" w:tplc="0809000F" w:tentative="1">
+      <w:start w:val="1"/>
+      <w:numFmt w:val="decimal"/>
+      <w:lvlText w:val="%4."/>
+      <w:lvlJc w:val="left"/>
+      <w:pPr>
+        <w:ind w:left="2880" w:hanging="360"/>
+      </w:pPr>
+    </w:lvl>
+    <w:lvl w:ilvl="4" w:tplc="08090019" w:tentative="1">
+      <w:start w:val="1"/>
+      <w:numFmt w:val="lowerLetter"/>
+      <w:lvlText w:val="%5."/>
+      <w:lvlJc w:val="left"/>
+      <w:pPr>
+        <w:ind w:left="3600" w:hanging="360"/>
+      </w:pPr>
+    </w:lvl>
+    <w:lvl w:ilvl="5" w:tplc="0809001B" w:tentative="1">
+      <w:start w:val="1"/>
+      <w:numFmt w:val="lowerRoman"/>
+      <w:lvlText w:val="%6."/>
+      <w:lvlJc w:val="right"/>
+      <w:pPr>
+        <w:ind w:left="4320" w:hanging="180"/>
+      </w:pPr>
+    </w:lvl>
+    <w:lvl w:ilvl="6" w:tplc="0809000F" w:tentative="1">
+      <w:start w:val="1"/>
+      <w:numFmt w:val="decimal"/>
+      <w:lvlText w:val="%7."/>
+      <w:lvlJc w:val="left"/>
+      <w:pPr>
+        <w:ind w:left="5040" w:hanging="360"/>
+      </w:pPr>
+    </w:lvl>
+    <w:lvl w:ilvl="7" w:tplc="08090019" w:tentative="1">
+      <w:start w:val="1"/>
+      <w:numFmt w:val="lowerLetter"/>
+      <w:lvlText w:val="%8."/>
+      <w:lvlJc w:val="left"/>
+      <w:pPr>
+        <w:ind w:left="5760" w:hanging="360"/>
+      </w:pPr>
+    </w:lvl>
+    <w:lvl w:ilvl="8" w:tplc="0809001B" w:tentative="1">
+      <w:start w:val="1"/>
+      <w:numFmt w:val="lowerRoman"/>
+      <w:lvlText w:val="%9."/>
+      <w:lvlJc w:val="right"/>
+      <w:pPr>
+        <w:ind w:left="6480" w:hanging="180"/>
+      </w:pPr>
+    </w:lvl>
+  </w:abstractNum>
+  <w:abstractNum w:abstractNumId="9" w15:restartNumberingAfterBreak="0">
     <w:nsid w:val="44D73ADD"/>
     <w:multiLevelType w:val="hybridMultilevel"/>
     <w:tmpl w:val="CE263032"/>
@@ -1365,7 +3674,551 @@
       </w:pPr>
     </w:lvl>
   </w:abstractNum>
-  <w:abstractNum w:abstractNumId="4" w15:restartNumberingAfterBreak="0">
+  <w:abstractNum w:abstractNumId="10" w15:restartNumberingAfterBreak="0">
+    <w:nsid w:val="586C6A0D"/>
+    <w:multiLevelType w:val="hybridMultilevel"/>
+    <w:tmpl w:val="A4CCD790"/>
+    <w:lvl w:ilvl="0" w:tplc="08090001">
+      <w:start w:val="1"/>
+      <w:numFmt w:val="bullet"/>
+      <w:lvlText w:val=""/>
+      <w:lvlJc w:val="left"/>
+      <w:pPr>
+        <w:ind w:left="720" w:hanging="360"/>
+      </w:pPr>
+      <w:rPr>
+        <w:rFonts w:ascii="Symbol" w:hAnsi="Symbol" w:hint="default"/>
+      </w:rPr>
+    </w:lvl>
+    <w:lvl w:ilvl="1" w:tplc="08090003" w:tentative="1">
+      <w:start w:val="1"/>
+      <w:numFmt w:val="bullet"/>
+      <w:lvlText w:val="o"/>
+      <w:lvlJc w:val="left"/>
+      <w:pPr>
+        <w:ind w:left="1440" w:hanging="360"/>
+      </w:pPr>
+      <w:rPr>
+        <w:rFonts w:ascii="Courier New" w:hAnsi="Courier New" w:cs="Courier New" w:hint="default"/>
+      </w:rPr>
+    </w:lvl>
+    <w:lvl w:ilvl="2" w:tplc="08090005" w:tentative="1">
+      <w:start w:val="1"/>
+      <w:numFmt w:val="bullet"/>
+      <w:lvlText w:val=""/>
+      <w:lvlJc w:val="left"/>
+      <w:pPr>
+        <w:ind w:left="2160" w:hanging="360"/>
+      </w:pPr>
+      <w:rPr>
+        <w:rFonts w:ascii="Wingdings" w:hAnsi="Wingdings" w:hint="default"/>
+      </w:rPr>
+    </w:lvl>
+    <w:lvl w:ilvl="3" w:tplc="08090001" w:tentative="1">
+      <w:start w:val="1"/>
+      <w:numFmt w:val="bullet"/>
+      <w:lvlText w:val=""/>
+      <w:lvlJc w:val="left"/>
+      <w:pPr>
+        <w:ind w:left="2880" w:hanging="360"/>
+      </w:pPr>
+      <w:rPr>
+        <w:rFonts w:ascii="Symbol" w:hAnsi="Symbol" w:hint="default"/>
+      </w:rPr>
+    </w:lvl>
+    <w:lvl w:ilvl="4" w:tplc="08090003" w:tentative="1">
+      <w:start w:val="1"/>
+      <w:numFmt w:val="bullet"/>
+      <w:lvlText w:val="o"/>
+      <w:lvlJc w:val="left"/>
+      <w:pPr>
+        <w:ind w:left="3600" w:hanging="360"/>
+      </w:pPr>
+      <w:rPr>
+        <w:rFonts w:ascii="Courier New" w:hAnsi="Courier New" w:cs="Courier New" w:hint="default"/>
+      </w:rPr>
+    </w:lvl>
+    <w:lvl w:ilvl="5" w:tplc="08090005" w:tentative="1">
+      <w:start w:val="1"/>
+      <w:numFmt w:val="bullet"/>
+      <w:lvlText w:val=""/>
+      <w:lvlJc w:val="left"/>
+      <w:pPr>
+        <w:ind w:left="4320" w:hanging="360"/>
+      </w:pPr>
+      <w:rPr>
+        <w:rFonts w:ascii="Wingdings" w:hAnsi="Wingdings" w:hint="default"/>
+      </w:rPr>
+    </w:lvl>
+    <w:lvl w:ilvl="6" w:tplc="08090001" w:tentative="1">
+      <w:start w:val="1"/>
+      <w:numFmt w:val="bullet"/>
+      <w:lvlText w:val=""/>
+      <w:lvlJc w:val="left"/>
+      <w:pPr>
+        <w:ind w:left="5040" w:hanging="360"/>
+      </w:pPr>
+      <w:rPr>
+        <w:rFonts w:ascii="Symbol" w:hAnsi="Symbol" w:hint="default"/>
+      </w:rPr>
+    </w:lvl>
+    <w:lvl w:ilvl="7" w:tplc="08090003" w:tentative="1">
+      <w:start w:val="1"/>
+      <w:numFmt w:val="bullet"/>
+      <w:lvlText w:val="o"/>
+      <w:lvlJc w:val="left"/>
+      <w:pPr>
+        <w:ind w:left="5760" w:hanging="360"/>
+      </w:pPr>
+      <w:rPr>
+        <w:rFonts w:ascii="Courier New" w:hAnsi="Courier New" w:cs="Courier New" w:hint="default"/>
+      </w:rPr>
+    </w:lvl>
+    <w:lvl w:ilvl="8" w:tplc="08090005" w:tentative="1">
+      <w:start w:val="1"/>
+      <w:numFmt w:val="bullet"/>
+      <w:lvlText w:val=""/>
+      <w:lvlJc w:val="left"/>
+      <w:pPr>
+        <w:ind w:left="6480" w:hanging="360"/>
+      </w:pPr>
+      <w:rPr>
+        <w:rFonts w:ascii="Wingdings" w:hAnsi="Wingdings" w:hint="default"/>
+      </w:rPr>
+    </w:lvl>
+  </w:abstractNum>
+  <w:abstractNum w:abstractNumId="11" w15:restartNumberingAfterBreak="0">
+    <w:nsid w:val="598F7B6D"/>
+    <w:multiLevelType w:val="hybridMultilevel"/>
+    <w:tmpl w:val="CF603B22"/>
+    <w:lvl w:ilvl="0" w:tplc="08090001">
+      <w:start w:val="1"/>
+      <w:numFmt w:val="bullet"/>
+      <w:lvlText w:val=""/>
+      <w:lvlJc w:val="left"/>
+      <w:pPr>
+        <w:ind w:left="720" w:hanging="360"/>
+      </w:pPr>
+      <w:rPr>
+        <w:rFonts w:ascii="Symbol" w:hAnsi="Symbol" w:hint="default"/>
+      </w:rPr>
+    </w:lvl>
+    <w:lvl w:ilvl="1" w:tplc="08090003" w:tentative="1">
+      <w:start w:val="1"/>
+      <w:numFmt w:val="bullet"/>
+      <w:lvlText w:val="o"/>
+      <w:lvlJc w:val="left"/>
+      <w:pPr>
+        <w:ind w:left="1440" w:hanging="360"/>
+      </w:pPr>
+      <w:rPr>
+        <w:rFonts w:ascii="Courier New" w:hAnsi="Courier New" w:cs="Courier New" w:hint="default"/>
+      </w:rPr>
+    </w:lvl>
+    <w:lvl w:ilvl="2" w:tplc="08090005" w:tentative="1">
+      <w:start w:val="1"/>
+      <w:numFmt w:val="bullet"/>
+      <w:lvlText w:val=""/>
+      <w:lvlJc w:val="left"/>
+      <w:pPr>
+        <w:ind w:left="2160" w:hanging="360"/>
+      </w:pPr>
+      <w:rPr>
+        <w:rFonts w:ascii="Wingdings" w:hAnsi="Wingdings" w:hint="default"/>
+      </w:rPr>
+    </w:lvl>
+    <w:lvl w:ilvl="3" w:tplc="08090001" w:tentative="1">
+      <w:start w:val="1"/>
+      <w:numFmt w:val="bullet"/>
+      <w:lvlText w:val=""/>
+      <w:lvlJc w:val="left"/>
+      <w:pPr>
+        <w:ind w:left="2880" w:hanging="360"/>
+      </w:pPr>
+      <w:rPr>
+        <w:rFonts w:ascii="Symbol" w:hAnsi="Symbol" w:hint="default"/>
+      </w:rPr>
+    </w:lvl>
+    <w:lvl w:ilvl="4" w:tplc="08090003" w:tentative="1">
+      <w:start w:val="1"/>
+      <w:numFmt w:val="bullet"/>
+      <w:lvlText w:val="o"/>
+      <w:lvlJc w:val="left"/>
+      <w:pPr>
+        <w:ind w:left="3600" w:hanging="360"/>
+      </w:pPr>
+      <w:rPr>
+        <w:rFonts w:ascii="Courier New" w:hAnsi="Courier New" w:cs="Courier New" w:hint="default"/>
+      </w:rPr>
+    </w:lvl>
+    <w:lvl w:ilvl="5" w:tplc="08090005" w:tentative="1">
+      <w:start w:val="1"/>
+      <w:numFmt w:val="bullet"/>
+      <w:lvlText w:val=""/>
+      <w:lvlJc w:val="left"/>
+      <w:pPr>
+        <w:ind w:left="4320" w:hanging="360"/>
+      </w:pPr>
+      <w:rPr>
+        <w:rFonts w:ascii="Wingdings" w:hAnsi="Wingdings" w:hint="default"/>
+      </w:rPr>
+    </w:lvl>
+    <w:lvl w:ilvl="6" w:tplc="08090001" w:tentative="1">
+      <w:start w:val="1"/>
+      <w:numFmt w:val="bullet"/>
+      <w:lvlText w:val=""/>
+      <w:lvlJc w:val="left"/>
+      <w:pPr>
+        <w:ind w:left="5040" w:hanging="360"/>
+      </w:pPr>
+      <w:rPr>
+        <w:rFonts w:ascii="Symbol" w:hAnsi="Symbol" w:hint="default"/>
+      </w:rPr>
+    </w:lvl>
+    <w:lvl w:ilvl="7" w:tplc="08090003" w:tentative="1">
+      <w:start w:val="1"/>
+      <w:numFmt w:val="bullet"/>
+      <w:lvlText w:val="o"/>
+      <w:lvlJc w:val="left"/>
+      <w:pPr>
+        <w:ind w:left="5760" w:hanging="360"/>
+      </w:pPr>
+      <w:rPr>
+        <w:rFonts w:ascii="Courier New" w:hAnsi="Courier New" w:cs="Courier New" w:hint="default"/>
+      </w:rPr>
+    </w:lvl>
+    <w:lvl w:ilvl="8" w:tplc="08090005" w:tentative="1">
+      <w:start w:val="1"/>
+      <w:numFmt w:val="bullet"/>
+      <w:lvlText w:val=""/>
+      <w:lvlJc w:val="left"/>
+      <w:pPr>
+        <w:ind w:left="6480" w:hanging="360"/>
+      </w:pPr>
+      <w:rPr>
+        <w:rFonts w:ascii="Wingdings" w:hAnsi="Wingdings" w:hint="default"/>
+      </w:rPr>
+    </w:lvl>
+  </w:abstractNum>
+  <w:abstractNum w:abstractNumId="12" w15:restartNumberingAfterBreak="0">
+    <w:nsid w:val="5ADB39E7"/>
+    <w:multiLevelType w:val="hybridMultilevel"/>
+    <w:tmpl w:val="7576CF0C"/>
+    <w:lvl w:ilvl="0" w:tplc="08090001">
+      <w:start w:val="1"/>
+      <w:numFmt w:val="bullet"/>
+      <w:lvlText w:val=""/>
+      <w:lvlJc w:val="left"/>
+      <w:pPr>
+        <w:ind w:left="720" w:hanging="360"/>
+      </w:pPr>
+      <w:rPr>
+        <w:rFonts w:ascii="Symbol" w:hAnsi="Symbol" w:hint="default"/>
+      </w:rPr>
+    </w:lvl>
+    <w:lvl w:ilvl="1" w:tplc="3F8C6FB4">
+      <w:start w:val="1"/>
+      <w:numFmt w:val="decimal"/>
+      <w:lvlText w:val="%2."/>
+      <w:lvlJc w:val="left"/>
+      <w:pPr>
+        <w:ind w:left="851" w:firstLine="0"/>
+      </w:pPr>
+      <w:rPr>
+        <w:rFonts w:hint="default"/>
+      </w:rPr>
+    </w:lvl>
+    <w:lvl w:ilvl="2" w:tplc="0809001B">
+      <w:start w:val="1"/>
+      <w:numFmt w:val="lowerRoman"/>
+      <w:lvlText w:val="%3."/>
+      <w:lvlJc w:val="right"/>
+      <w:pPr>
+        <w:ind w:left="2160" w:hanging="180"/>
+      </w:pPr>
+    </w:lvl>
+    <w:lvl w:ilvl="3" w:tplc="0809000F" w:tentative="1">
+      <w:start w:val="1"/>
+      <w:numFmt w:val="decimal"/>
+      <w:lvlText w:val="%4."/>
+      <w:lvlJc w:val="left"/>
+      <w:pPr>
+        <w:ind w:left="2880" w:hanging="360"/>
+      </w:pPr>
+    </w:lvl>
+    <w:lvl w:ilvl="4" w:tplc="08090019" w:tentative="1">
+      <w:start w:val="1"/>
+      <w:numFmt w:val="lowerLetter"/>
+      <w:lvlText w:val="%5."/>
+      <w:lvlJc w:val="left"/>
+      <w:pPr>
+        <w:ind w:left="3600" w:hanging="360"/>
+      </w:pPr>
+    </w:lvl>
+    <w:lvl w:ilvl="5" w:tplc="0809001B" w:tentative="1">
+      <w:start w:val="1"/>
+      <w:numFmt w:val="lowerRoman"/>
+      <w:lvlText w:val="%6."/>
+      <w:lvlJc w:val="right"/>
+      <w:pPr>
+        <w:ind w:left="4320" w:hanging="180"/>
+      </w:pPr>
+    </w:lvl>
+    <w:lvl w:ilvl="6" w:tplc="0809000F" w:tentative="1">
+      <w:start w:val="1"/>
+      <w:numFmt w:val="decimal"/>
+      <w:lvlText w:val="%7."/>
+      <w:lvlJc w:val="left"/>
+      <w:pPr>
+        <w:ind w:left="5040" w:hanging="360"/>
+      </w:pPr>
+    </w:lvl>
+    <w:lvl w:ilvl="7" w:tplc="08090019" w:tentative="1">
+      <w:start w:val="1"/>
+      <w:numFmt w:val="lowerLetter"/>
+      <w:lvlText w:val="%8."/>
+      <w:lvlJc w:val="left"/>
+      <w:pPr>
+        <w:ind w:left="5760" w:hanging="360"/>
+      </w:pPr>
+    </w:lvl>
+    <w:lvl w:ilvl="8" w:tplc="0809001B" w:tentative="1">
+      <w:start w:val="1"/>
+      <w:numFmt w:val="lowerRoman"/>
+      <w:lvlText w:val="%9."/>
+      <w:lvlJc w:val="right"/>
+      <w:pPr>
+        <w:ind w:left="6480" w:hanging="180"/>
+      </w:pPr>
+    </w:lvl>
+  </w:abstractNum>
+  <w:abstractNum w:abstractNumId="13" w15:restartNumberingAfterBreak="0">
+    <w:nsid w:val="694373A2"/>
+    <w:multiLevelType w:val="hybridMultilevel"/>
+    <w:tmpl w:val="A8EA8652"/>
+    <w:lvl w:ilvl="0" w:tplc="08090001">
+      <w:start w:val="1"/>
+      <w:numFmt w:val="bullet"/>
+      <w:lvlText w:val=""/>
+      <w:lvlJc w:val="left"/>
+      <w:pPr>
+        <w:ind w:left="720" w:hanging="360"/>
+      </w:pPr>
+      <w:rPr>
+        <w:rFonts w:ascii="Symbol" w:hAnsi="Symbol" w:hint="default"/>
+      </w:rPr>
+    </w:lvl>
+    <w:lvl w:ilvl="1" w:tplc="08090003" w:tentative="1">
+      <w:start w:val="1"/>
+      <w:numFmt w:val="bullet"/>
+      <w:lvlText w:val="o"/>
+      <w:lvlJc w:val="left"/>
+      <w:pPr>
+        <w:ind w:left="1440" w:hanging="360"/>
+      </w:pPr>
+      <w:rPr>
+        <w:rFonts w:ascii="Courier New" w:hAnsi="Courier New" w:cs="Courier New" w:hint="default"/>
+      </w:rPr>
+    </w:lvl>
+    <w:lvl w:ilvl="2" w:tplc="08090005" w:tentative="1">
+      <w:start w:val="1"/>
+      <w:numFmt w:val="bullet"/>
+      <w:lvlText w:val=""/>
+      <w:lvlJc w:val="left"/>
+      <w:pPr>
+        <w:ind w:left="2160" w:hanging="360"/>
+      </w:pPr>
+      <w:rPr>
+        <w:rFonts w:ascii="Wingdings" w:hAnsi="Wingdings" w:hint="default"/>
+      </w:rPr>
+    </w:lvl>
+    <w:lvl w:ilvl="3" w:tplc="08090001" w:tentative="1">
+      <w:start w:val="1"/>
+      <w:numFmt w:val="bullet"/>
+      <w:lvlText w:val=""/>
+      <w:lvlJc w:val="left"/>
+      <w:pPr>
+        <w:ind w:left="2880" w:hanging="360"/>
+      </w:pPr>
+      <w:rPr>
+        <w:rFonts w:ascii="Symbol" w:hAnsi="Symbol" w:hint="default"/>
+      </w:rPr>
+    </w:lvl>
+    <w:lvl w:ilvl="4" w:tplc="08090003" w:tentative="1">
+      <w:start w:val="1"/>
+      <w:numFmt w:val="bullet"/>
+      <w:lvlText w:val="o"/>
+      <w:lvlJc w:val="left"/>
+      <w:pPr>
+        <w:ind w:left="3600" w:hanging="360"/>
+      </w:pPr>
+      <w:rPr>
+        <w:rFonts w:ascii="Courier New" w:hAnsi="Courier New" w:cs="Courier New" w:hint="default"/>
+      </w:rPr>
+    </w:lvl>
+    <w:lvl w:ilvl="5" w:tplc="08090005" w:tentative="1">
+      <w:start w:val="1"/>
+      <w:numFmt w:val="bullet"/>
+      <w:lvlText w:val=""/>
+      <w:lvlJc w:val="left"/>
+      <w:pPr>
+        <w:ind w:left="4320" w:hanging="360"/>
+      </w:pPr>
+      <w:rPr>
+        <w:rFonts w:ascii="Wingdings" w:hAnsi="Wingdings" w:hint="default"/>
+      </w:rPr>
+    </w:lvl>
+    <w:lvl w:ilvl="6" w:tplc="08090001" w:tentative="1">
+      <w:start w:val="1"/>
+      <w:numFmt w:val="bullet"/>
+      <w:lvlText w:val=""/>
+      <w:lvlJc w:val="left"/>
+      <w:pPr>
+        <w:ind w:left="5040" w:hanging="360"/>
+      </w:pPr>
+      <w:rPr>
+        <w:rFonts w:ascii="Symbol" w:hAnsi="Symbol" w:hint="default"/>
+      </w:rPr>
+    </w:lvl>
+    <w:lvl w:ilvl="7" w:tplc="08090003" w:tentative="1">
+      <w:start w:val="1"/>
+      <w:numFmt w:val="bullet"/>
+      <w:lvlText w:val="o"/>
+      <w:lvlJc w:val="left"/>
+      <w:pPr>
+        <w:ind w:left="5760" w:hanging="360"/>
+      </w:pPr>
+      <w:rPr>
+        <w:rFonts w:ascii="Courier New" w:hAnsi="Courier New" w:cs="Courier New" w:hint="default"/>
+      </w:rPr>
+    </w:lvl>
+    <w:lvl w:ilvl="8" w:tplc="08090005" w:tentative="1">
+      <w:start w:val="1"/>
+      <w:numFmt w:val="bullet"/>
+      <w:lvlText w:val=""/>
+      <w:lvlJc w:val="left"/>
+      <w:pPr>
+        <w:ind w:left="6480" w:hanging="360"/>
+      </w:pPr>
+      <w:rPr>
+        <w:rFonts w:ascii="Wingdings" w:hAnsi="Wingdings" w:hint="default"/>
+      </w:rPr>
+    </w:lvl>
+  </w:abstractNum>
+  <w:abstractNum w:abstractNumId="14" w15:restartNumberingAfterBreak="0">
+    <w:nsid w:val="6DFF1014"/>
+    <w:multiLevelType w:val="hybridMultilevel"/>
+    <w:tmpl w:val="F5B4A4D8"/>
+    <w:lvl w:ilvl="0" w:tplc="08090001">
+      <w:start w:val="1"/>
+      <w:numFmt w:val="bullet"/>
+      <w:lvlText w:val=""/>
+      <w:lvlJc w:val="left"/>
+      <w:pPr>
+        <w:ind w:left="720" w:hanging="360"/>
+      </w:pPr>
+      <w:rPr>
+        <w:rFonts w:ascii="Symbol" w:hAnsi="Symbol" w:hint="default"/>
+      </w:rPr>
+    </w:lvl>
+    <w:lvl w:ilvl="1" w:tplc="08090003" w:tentative="1">
+      <w:start w:val="1"/>
+      <w:numFmt w:val="bullet"/>
+      <w:lvlText w:val="o"/>
+      <w:lvlJc w:val="left"/>
+      <w:pPr>
+        <w:ind w:left="1440" w:hanging="360"/>
+      </w:pPr>
+      <w:rPr>
+        <w:rFonts w:ascii="Courier New" w:hAnsi="Courier New" w:cs="Courier New" w:hint="default"/>
+      </w:rPr>
+    </w:lvl>
+    <w:lvl w:ilvl="2" w:tplc="08090005" w:tentative="1">
+      <w:start w:val="1"/>
+      <w:numFmt w:val="bullet"/>
+      <w:lvlText w:val=""/>
+      <w:lvlJc w:val="left"/>
+      <w:pPr>
+        <w:ind w:left="2160" w:hanging="360"/>
+      </w:pPr>
+      <w:rPr>
+        <w:rFonts w:ascii="Wingdings" w:hAnsi="Wingdings" w:hint="default"/>
+      </w:rPr>
+    </w:lvl>
+    <w:lvl w:ilvl="3" w:tplc="08090001" w:tentative="1">
+      <w:start w:val="1"/>
+      <w:numFmt w:val="bullet"/>
+      <w:lvlText w:val=""/>
+      <w:lvlJc w:val="left"/>
+      <w:pPr>
+        <w:ind w:left="2880" w:hanging="360"/>
+      </w:pPr>
+      <w:rPr>
+        <w:rFonts w:ascii="Symbol" w:hAnsi="Symbol" w:hint="default"/>
+      </w:rPr>
+    </w:lvl>
+    <w:lvl w:ilvl="4" w:tplc="08090003" w:tentative="1">
+      <w:start w:val="1"/>
+      <w:numFmt w:val="bullet"/>
+      <w:lvlText w:val="o"/>
+      <w:lvlJc w:val="left"/>
+      <w:pPr>
+        <w:ind w:left="3600" w:hanging="360"/>
+      </w:pPr>
+      <w:rPr>
+        <w:rFonts w:ascii="Courier New" w:hAnsi="Courier New" w:cs="Courier New" w:hint="default"/>
+      </w:rPr>
+    </w:lvl>
+    <w:lvl w:ilvl="5" w:tplc="08090005" w:tentative="1">
+      <w:start w:val="1"/>
+      <w:numFmt w:val="bullet"/>
+      <w:lvlText w:val=""/>
+      <w:lvlJc w:val="left"/>
+      <w:pPr>
+        <w:ind w:left="4320" w:hanging="360"/>
+      </w:pPr>
+      <w:rPr>
+        <w:rFonts w:ascii="Wingdings" w:hAnsi="Wingdings" w:hint="default"/>
+      </w:rPr>
+    </w:lvl>
+    <w:lvl w:ilvl="6" w:tplc="08090001" w:tentative="1">
+      <w:start w:val="1"/>
+      <w:numFmt w:val="bullet"/>
+      <w:lvlText w:val=""/>
+      <w:lvlJc w:val="left"/>
+      <w:pPr>
+        <w:ind w:left="5040" w:hanging="360"/>
+      </w:pPr>
+      <w:rPr>
+        <w:rFonts w:ascii="Symbol" w:hAnsi="Symbol" w:hint="default"/>
+      </w:rPr>
+    </w:lvl>
+    <w:lvl w:ilvl="7" w:tplc="08090003" w:tentative="1">
+      <w:start w:val="1"/>
+      <w:numFmt w:val="bullet"/>
+      <w:lvlText w:val="o"/>
+      <w:lvlJc w:val="left"/>
+      <w:pPr>
+        <w:ind w:left="5760" w:hanging="360"/>
+      </w:pPr>
+      <w:rPr>
+        <w:rFonts w:ascii="Courier New" w:hAnsi="Courier New" w:cs="Courier New" w:hint="default"/>
+      </w:rPr>
+    </w:lvl>
+    <w:lvl w:ilvl="8" w:tplc="08090005" w:tentative="1">
+      <w:start w:val="1"/>
+      <w:numFmt w:val="bullet"/>
+      <w:lvlText w:val=""/>
+      <w:lvlJc w:val="left"/>
+      <w:pPr>
+        <w:ind w:left="6480" w:hanging="360"/>
+      </w:pPr>
+      <w:rPr>
+        <w:rFonts w:ascii="Wingdings" w:hAnsi="Wingdings" w:hint="default"/>
+      </w:rPr>
+    </w:lvl>
+  </w:abstractNum>
+  <w:abstractNum w:abstractNumId="15" w15:restartNumberingAfterBreak="0">
     <w:nsid w:val="73544086"/>
     <w:multiLevelType w:val="hybridMultilevel"/>
     <w:tmpl w:val="3A3EC374"/>
@@ -1478,20 +4331,142 @@
       </w:rPr>
     </w:lvl>
   </w:abstractNum>
+  <w:abstractNum w:abstractNumId="16" w15:restartNumberingAfterBreak="0">
+    <w:nsid w:val="7E196842"/>
+    <w:multiLevelType w:val="hybridMultilevel"/>
+    <w:tmpl w:val="CF3CC654"/>
+    <w:lvl w:ilvl="0" w:tplc="0809000F">
+      <w:start w:val="1"/>
+      <w:numFmt w:val="decimal"/>
+      <w:lvlText w:val="%1."/>
+      <w:lvlJc w:val="left"/>
+      <w:pPr>
+        <w:ind w:left="720" w:hanging="360"/>
+      </w:pPr>
+    </w:lvl>
+    <w:lvl w:ilvl="1" w:tplc="08090019" w:tentative="1">
+      <w:start w:val="1"/>
+      <w:numFmt w:val="lowerLetter"/>
+      <w:lvlText w:val="%2."/>
+      <w:lvlJc w:val="left"/>
+      <w:pPr>
+        <w:ind w:left="1440" w:hanging="360"/>
+      </w:pPr>
+    </w:lvl>
+    <w:lvl w:ilvl="2" w:tplc="0809001B" w:tentative="1">
+      <w:start w:val="1"/>
+      <w:numFmt w:val="lowerRoman"/>
+      <w:lvlText w:val="%3."/>
+      <w:lvlJc w:val="right"/>
+      <w:pPr>
+        <w:ind w:left="2160" w:hanging="180"/>
+      </w:pPr>
+    </w:lvl>
+    <w:lvl w:ilvl="3" w:tplc="0809000F" w:tentative="1">
+      <w:start w:val="1"/>
+      <w:numFmt w:val="decimal"/>
+      <w:lvlText w:val="%4."/>
+      <w:lvlJc w:val="left"/>
+      <w:pPr>
+        <w:ind w:left="2880" w:hanging="360"/>
+      </w:pPr>
+    </w:lvl>
+    <w:lvl w:ilvl="4" w:tplc="08090019" w:tentative="1">
+      <w:start w:val="1"/>
+      <w:numFmt w:val="lowerLetter"/>
+      <w:lvlText w:val="%5."/>
+      <w:lvlJc w:val="left"/>
+      <w:pPr>
+        <w:ind w:left="3600" w:hanging="360"/>
+      </w:pPr>
+    </w:lvl>
+    <w:lvl w:ilvl="5" w:tplc="0809001B" w:tentative="1">
+      <w:start w:val="1"/>
+      <w:numFmt w:val="lowerRoman"/>
+      <w:lvlText w:val="%6."/>
+      <w:lvlJc w:val="right"/>
+      <w:pPr>
+        <w:ind w:left="4320" w:hanging="180"/>
+      </w:pPr>
+    </w:lvl>
+    <w:lvl w:ilvl="6" w:tplc="0809000F" w:tentative="1">
+      <w:start w:val="1"/>
+      <w:numFmt w:val="decimal"/>
+      <w:lvlText w:val="%7."/>
+      <w:lvlJc w:val="left"/>
+      <w:pPr>
+        <w:ind w:left="5040" w:hanging="360"/>
+      </w:pPr>
+    </w:lvl>
+    <w:lvl w:ilvl="7" w:tplc="08090019" w:tentative="1">
+      <w:start w:val="1"/>
+      <w:numFmt w:val="lowerLetter"/>
+      <w:lvlText w:val="%8."/>
+      <w:lvlJc w:val="left"/>
+      <w:pPr>
+        <w:ind w:left="5760" w:hanging="360"/>
+      </w:pPr>
+    </w:lvl>
+    <w:lvl w:ilvl="8" w:tplc="0809001B" w:tentative="1">
+      <w:start w:val="1"/>
+      <w:numFmt w:val="lowerRoman"/>
+      <w:lvlText w:val="%9."/>
+      <w:lvlJc w:val="right"/>
+      <w:pPr>
+        <w:ind w:left="6480" w:hanging="180"/>
+      </w:pPr>
+    </w:lvl>
+  </w:abstractNum>
   <w:num w:numId="1" w16cid:durableId="464857354">
-    <w:abstractNumId w:val="1"/>
+    <w:abstractNumId w:val="4"/>
   </w:num>
   <w:num w:numId="2" w16cid:durableId="2132094706">
+    <w:abstractNumId w:val="7"/>
+  </w:num>
+  <w:num w:numId="3" w16cid:durableId="1120807208">
     <w:abstractNumId w:val="2"/>
   </w:num>
-  <w:num w:numId="3" w16cid:durableId="1120807208">
+  <w:num w:numId="4" w16cid:durableId="1420760374">
+    <w:abstractNumId w:val="15"/>
+  </w:num>
+  <w:num w:numId="5" w16cid:durableId="797988434">
+    <w:abstractNumId w:val="9"/>
+  </w:num>
+  <w:num w:numId="6" w16cid:durableId="793989419">
+    <w:abstractNumId w:val="8"/>
+  </w:num>
+  <w:num w:numId="7" w16cid:durableId="1222250185">
+    <w:abstractNumId w:val="12"/>
+  </w:num>
+  <w:num w:numId="8" w16cid:durableId="2103984881">
+    <w:abstractNumId w:val="10"/>
+  </w:num>
+  <w:num w:numId="9" w16cid:durableId="1830444509">
+    <w:abstractNumId w:val="5"/>
+  </w:num>
+  <w:num w:numId="10" w16cid:durableId="2032996542">
+    <w:abstractNumId w:val="13"/>
+  </w:num>
+  <w:num w:numId="11" w16cid:durableId="1687517679">
+    <w:abstractNumId w:val="6"/>
+  </w:num>
+  <w:num w:numId="12" w16cid:durableId="1926574193">
     <w:abstractNumId w:val="0"/>
   </w:num>
-  <w:num w:numId="4" w16cid:durableId="1420760374">
-    <w:abstractNumId w:val="4"/>
+  <w:num w:numId="13" w16cid:durableId="1207912775">
+    <w:abstractNumId w:val="16"/>
   </w:num>
-  <w:num w:numId="5" w16cid:durableId="797988434">
+  <w:num w:numId="14" w16cid:durableId="552429642">
     <w:abstractNumId w:val="3"/>
+  </w:num>
+  <w:num w:numId="15" w16cid:durableId="473185906">
+    <w:abstractNumId w:val="14"/>
+  </w:num>
+  <w:num w:numId="16" w16cid:durableId="941036230">
+    <w:abstractNumId w:val="11"/>
+  </w:num>
+  <w:num w:numId="17" w16cid:durableId="1867252939">
+    <w:abstractNumId w:val="1"/>
   </w:num>
 </w:numbering>
 </file>
@@ -1924,7 +4899,6 @@
     <w:next w:val="Normal"/>
     <w:link w:val="Heading2Char"/>
     <w:uiPriority w:val="9"/>
-    <w:semiHidden/>
     <w:unhideWhenUsed/>
     <w:qFormat/>
     <w:rsid w:val="00E40BD1"/>
@@ -1947,7 +4921,6 @@
     <w:next w:val="Normal"/>
     <w:link w:val="Heading3Char"/>
     <w:uiPriority w:val="9"/>
-    <w:semiHidden/>
     <w:unhideWhenUsed/>
     <w:qFormat/>
     <w:rsid w:val="00E40BD1"/>
@@ -2099,6 +5072,7 @@
   <w:style w:type="character" w:default="1" w:styleId="DefaultParagraphFont">
     <w:name w:val="Default Paragraph Font"/>
     <w:uiPriority w:val="1"/>
+    <w:semiHidden/>
     <w:unhideWhenUsed/>
   </w:style>
   <w:style w:type="table" w:default="1" w:styleId="TableNormal">
@@ -2140,7 +5114,6 @@
     <w:basedOn w:val="DefaultParagraphFont"/>
     <w:link w:val="Heading2"/>
     <w:uiPriority w:val="9"/>
-    <w:semiHidden/>
     <w:rsid w:val="00E40BD1"/>
     <w:rPr>
       <w:rFonts w:asciiTheme="majorHAnsi" w:eastAsiaTheme="majorEastAsia" w:hAnsiTheme="majorHAnsi" w:cstheme="majorBidi"/>
@@ -2154,7 +5127,6 @@
     <w:basedOn w:val="DefaultParagraphFont"/>
     <w:link w:val="Heading3"/>
     <w:uiPriority w:val="9"/>
-    <w:semiHidden/>
     <w:rsid w:val="00E40BD1"/>
     <w:rPr>
       <w:rFonts w:eastAsiaTheme="majorEastAsia" w:cstheme="majorBidi"/>

</xml_diff>

<commit_message>
docs: updated design notes with UI sketch
</commit_message>
<xml_diff>
--- a/docs/Design notes.docx
+++ b/docs/Design notes.docx
@@ -1371,13 +1371,7 @@
       </w:r>
       <w:proofErr w:type="spellEnd"/>
       <w:r>
-        <w:t xml:space="preserve">: list of </w:t>
-      </w:r>
-      <w:r>
-        <w:t xml:space="preserve">workflow </w:t>
-      </w:r>
-      <w:r>
-        <w:t>input</w:t>
+        <w:t>: list of workflow input</w:t>
       </w:r>
       <w:r>
         <w:t xml:space="preserve"> data</w:t>
@@ -1400,13 +1394,7 @@
       </w:r>
       <w:proofErr w:type="spellEnd"/>
       <w:r>
-        <w:t xml:space="preserve"> – list of </w:t>
-      </w:r>
-      <w:r>
-        <w:t xml:space="preserve">workflow </w:t>
-      </w:r>
-      <w:r>
-        <w:t xml:space="preserve">input </w:t>
+        <w:t xml:space="preserve"> – list of workflow input </w:t>
       </w:r>
       <w:r>
         <w:rPr>
@@ -2676,25 +2664,22 @@
         </w:numPr>
       </w:pPr>
       <w:r>
+        <w:t xml:space="preserve">ports – dictionary of all </w:t>
+      </w:r>
+      <w:r>
+        <w:t>extant</w:t>
+      </w:r>
+      <w:r>
+        <w:t xml:space="preserve"> </w:t>
+      </w:r>
+      <w:r>
+        <w:rPr>
+          <w:b/>
+          <w:bCs/>
+        </w:rPr>
         <w:t>ports</w:t>
       </w:r>
       <w:r>
-        <w:t xml:space="preserve"> – dictionary of all </w:t>
-      </w:r>
-      <w:r>
-        <w:t>extant</w:t>
-      </w:r>
-      <w:r>
-        <w:t xml:space="preserve"> </w:t>
-      </w:r>
-      <w:r>
-        <w:rPr>
-          <w:b/>
-          <w:bCs/>
-        </w:rPr>
-        <w:t>ports</w:t>
-      </w:r>
-      <w:r>
         <w:t xml:space="preserve"> by unique ID</w:t>
       </w:r>
     </w:p>
@@ -2707,10 +2692,7 @@
         </w:numPr>
       </w:pPr>
       <w:r>
-        <w:t>connections</w:t>
-      </w:r>
-      <w:r>
-        <w:t xml:space="preserve"> – dictionary of all </w:t>
+        <w:t xml:space="preserve">connections – dictionary of all </w:t>
       </w:r>
       <w:r>
         <w:rPr>
@@ -3004,11 +2986,286 @@
       </w:r>
     </w:p>
     <w:p>
+      <w:r>
+        <w:rPr>
+          <w:noProof/>
+        </w:rPr>
+        <w:drawing>
+          <wp:inline distT="0" distB="0" distL="0" distR="0" wp14:anchorId="738C6933" wp14:editId="034EE082">
+            <wp:extent cx="5731510" cy="1742303"/>
+            <wp:effectExtent l="0" t="0" r="2540" b="0"/>
+            <wp:docPr id="2052823018" name="Picture 2"/>
+            <wp:cNvGraphicFramePr>
+              <a:graphicFrameLocks xmlns:a="http://schemas.openxmlformats.org/drawingml/2006/main" noChangeAspect="1"/>
+            </wp:cNvGraphicFramePr>
+            <a:graphic xmlns:a="http://schemas.openxmlformats.org/drawingml/2006/main">
+              <a:graphicData uri="http://schemas.openxmlformats.org/drawingml/2006/picture">
+                <pic:pic xmlns:pic="http://schemas.openxmlformats.org/drawingml/2006/picture">
+                  <pic:nvPicPr>
+                    <pic:cNvPr id="0" name="Picture 2"/>
+                    <pic:cNvPicPr>
+                      <a:picLocks noChangeAspect="1" noChangeArrowheads="1"/>
+                    </pic:cNvPicPr>
+                  </pic:nvPicPr>
+                  <pic:blipFill>
+                    <a:blip r:embed="rId6">
+                      <a:extLst>
+                        <a:ext uri="{28A0092B-C50C-407E-A947-70E740481C1C}">
+                          <a14:useLocalDpi xmlns:a14="http://schemas.microsoft.com/office/drawing/2010/main" val="0"/>
+                        </a:ext>
+                      </a:extLst>
+                    </a:blip>
+                    <a:srcRect/>
+                    <a:stretch>
+                      <a:fillRect/>
+                    </a:stretch>
+                  </pic:blipFill>
+                  <pic:spPr bwMode="auto">
+                    <a:xfrm>
+                      <a:off x="0" y="0"/>
+                      <a:ext cx="5731510" cy="1742303"/>
+                    </a:xfrm>
+                    <a:prstGeom prst="rect">
+                      <a:avLst/>
+                    </a:prstGeom>
+                    <a:noFill/>
+                    <a:ln>
+                      <a:noFill/>
+                    </a:ln>
+                  </pic:spPr>
+                </pic:pic>
+              </a:graphicData>
+            </a:graphic>
+          </wp:inline>
+        </w:drawing>
+      </w:r>
+    </w:p>
+    <w:p>
+      <w:pPr>
+        <w:pStyle w:val="ListParagraph"/>
+        <w:numPr>
+          <w:ilvl w:val="0"/>
+          <w:numId w:val="26"/>
+        </w:numPr>
+      </w:pPr>
+      <w:r>
+        <w:t>Input* image view</w:t>
+      </w:r>
+    </w:p>
+    <w:p>
+      <w:pPr>
+        <w:pStyle w:val="ListParagraph"/>
+        <w:numPr>
+          <w:ilvl w:val="0"/>
+          <w:numId w:val="26"/>
+        </w:numPr>
+      </w:pPr>
+      <w:r>
+        <w:t>Output* image view</w:t>
+      </w:r>
+    </w:p>
+    <w:p>
+      <w:pPr>
+        <w:pStyle w:val="ListParagraph"/>
+        <w:numPr>
+          <w:ilvl w:val="0"/>
+          <w:numId w:val="26"/>
+        </w:numPr>
+      </w:pPr>
+      <w:r>
+        <w:t>Workflow view</w:t>
+      </w:r>
+    </w:p>
+    <w:p>
+      <w:pPr>
+        <w:pStyle w:val="ListParagraph"/>
+        <w:numPr>
+          <w:ilvl w:val="0"/>
+          <w:numId w:val="26"/>
+        </w:numPr>
+      </w:pPr>
+      <w:r>
+        <w:t>Z-slice selector if Z-stack and mouse-over</w:t>
+      </w:r>
+    </w:p>
+    <w:p>
+      <w:pPr>
+        <w:pStyle w:val="ListParagraph"/>
+        <w:numPr>
+          <w:ilvl w:val="0"/>
+          <w:numId w:val="26"/>
+        </w:numPr>
+      </w:pPr>
+      <w:r>
+        <w:t xml:space="preserve">Lock the windows – if windows are locked, changes to zoom/pan on one </w:t>
+      </w:r>
+      <w:proofErr w:type="gramStart"/>
+      <w:r>
+        <w:t>effects</w:t>
+      </w:r>
+      <w:proofErr w:type="gramEnd"/>
+      <w:r>
+        <w:t xml:space="preserve"> the other – otherwise, can move and zoom independently.</w:t>
+      </w:r>
+    </w:p>
+    <w:p>
+      <w:pPr>
+        <w:pStyle w:val="ListParagraph"/>
+        <w:numPr>
+          <w:ilvl w:val="0"/>
+          <w:numId w:val="26"/>
+        </w:numPr>
+      </w:pPr>
+      <w:r>
+        <w:t>View node toggle</w:t>
+      </w:r>
+    </w:p>
+    <w:p>
+      <w:pPr>
+        <w:pStyle w:val="ListParagraph"/>
+        <w:numPr>
+          <w:ilvl w:val="0"/>
+          <w:numId w:val="26"/>
+        </w:numPr>
+      </w:pPr>
+      <w:r>
+        <w:t>Add connector button</w:t>
+      </w:r>
+    </w:p>
+    <w:p>
+      <w:pPr>
+        <w:pStyle w:val="ListParagraph"/>
+        <w:numPr>
+          <w:ilvl w:val="0"/>
+          <w:numId w:val="26"/>
+        </w:numPr>
+      </w:pPr>
+      <w:r>
+        <w:t>Node view, categorised by tabs</w:t>
+      </w:r>
+    </w:p>
+    <w:p>
+      <w:pPr>
+        <w:pStyle w:val="ListParagraph"/>
+        <w:numPr>
+          <w:ilvl w:val="0"/>
+          <w:numId w:val="26"/>
+        </w:numPr>
+      </w:pPr>
+      <w:r>
+        <w:t>Menu bar</w:t>
+      </w:r>
+    </w:p>
+    <w:p>
+      <w:pPr>
+        <w:pStyle w:val="ListParagraph"/>
+        <w:numPr>
+          <w:ilvl w:val="0"/>
+          <w:numId w:val="26"/>
+        </w:numPr>
+      </w:pPr>
+      <w:r>
+        <w:t>Channel options view toggle (allows selection of LUTs, what channels are visible etc)</w:t>
+      </w:r>
+    </w:p>
+    <w:p>
+      <w:r>
+        <w:t>*</w:t>
+      </w:r>
+      <w:proofErr w:type="gramStart"/>
+      <w:r>
+        <w:t>both</w:t>
+      </w:r>
+      <w:proofErr w:type="gramEnd"/>
+      <w:r>
+        <w:t xml:space="preserve"> views can be toggled to view the outputs of other nodes by clicking the node (for the output view) or shift-clicking the node (for the input view). Zoom using mouse wheel, double right clicking/left clicking. Pan by dragging and/or scroll bars. </w:t>
+      </w:r>
+    </w:p>
+    <w:p>
+      <w:pPr>
+        <w:pStyle w:val="Heading1"/>
+      </w:pPr>
+      <w:r>
+        <w:t>Development Plan</w:t>
+      </w:r>
+    </w:p>
+    <w:p>
       <w:pPr>
         <w:pStyle w:val="Heading2"/>
       </w:pPr>
       <w:r>
-        <w:t>Development Plan</w:t>
+        <w:t>Stage</w:t>
+      </w:r>
+      <w:r>
+        <w:t xml:space="preserve"> 0 - Planning</w:t>
+      </w:r>
+    </w:p>
+    <w:p>
+      <w:pPr>
+        <w:pStyle w:val="ListParagraph"/>
+        <w:numPr>
+          <w:ilvl w:val="0"/>
+          <w:numId w:val="14"/>
+        </w:numPr>
+      </w:pPr>
+      <w:r>
+        <w:t>Plan overall design.</w:t>
+      </w:r>
+    </w:p>
+    <w:p>
+      <w:pPr>
+        <w:pStyle w:val="ListParagraph"/>
+        <w:numPr>
+          <w:ilvl w:val="0"/>
+          <w:numId w:val="14"/>
+        </w:numPr>
+      </w:pPr>
+      <w:r>
+        <w:t>Plan class structure.</w:t>
+      </w:r>
+    </w:p>
+    <w:p>
+      <w:pPr>
+        <w:pStyle w:val="ListParagraph"/>
+        <w:numPr>
+          <w:ilvl w:val="0"/>
+          <w:numId w:val="14"/>
+        </w:numPr>
+      </w:pPr>
+      <w:r>
+        <w:t>Plan graph flow.</w:t>
+      </w:r>
+    </w:p>
+    <w:p>
+      <w:pPr>
+        <w:pStyle w:val="ListParagraph"/>
+        <w:numPr>
+          <w:ilvl w:val="0"/>
+          <w:numId w:val="14"/>
+        </w:numPr>
+      </w:pPr>
+      <w:r>
+        <w:t>Plan main UI elements.</w:t>
+      </w:r>
+    </w:p>
+    <w:p>
+      <w:pPr>
+        <w:pStyle w:val="ListParagraph"/>
+        <w:numPr>
+          <w:ilvl w:val="0"/>
+          <w:numId w:val="14"/>
+        </w:numPr>
+      </w:pPr>
+      <w:r>
+        <w:t>Set up project and directory structure for development and testing.</w:t>
+      </w:r>
+    </w:p>
+    <w:p>
+      <w:pPr>
+        <w:pStyle w:val="Heading2"/>
+      </w:pPr>
+      <w:r>
+        <w:t>Stage 1 - Backend</w:t>
       </w:r>
     </w:p>
     <w:p>
@@ -3016,67 +3273,146 @@
         <w:pStyle w:val="Heading3"/>
       </w:pPr>
       <w:r>
-        <w:t>Stage 0</w:t>
-      </w:r>
-    </w:p>
-    <w:p>
-      <w:pPr>
-        <w:pStyle w:val="ListParagraph"/>
-        <w:numPr>
-          <w:ilvl w:val="0"/>
-          <w:numId w:val="14"/>
-        </w:numPr>
-      </w:pPr>
-      <w:r>
-        <w:t>Plan overall design.</w:t>
-      </w:r>
-    </w:p>
-    <w:p>
-      <w:pPr>
-        <w:pStyle w:val="ListParagraph"/>
-        <w:numPr>
-          <w:ilvl w:val="0"/>
-          <w:numId w:val="14"/>
-        </w:numPr>
-      </w:pPr>
-      <w:r>
-        <w:t>Plan class structure.</w:t>
-      </w:r>
-    </w:p>
-    <w:p>
-      <w:pPr>
-        <w:pStyle w:val="ListParagraph"/>
-        <w:numPr>
-          <w:ilvl w:val="0"/>
-          <w:numId w:val="14"/>
-        </w:numPr>
-      </w:pPr>
-      <w:r>
-        <w:t>Plan graph flow.</w:t>
-      </w:r>
-    </w:p>
-    <w:p>
-      <w:pPr>
-        <w:pStyle w:val="ListParagraph"/>
-        <w:numPr>
-          <w:ilvl w:val="0"/>
-          <w:numId w:val="14"/>
-        </w:numPr>
-      </w:pPr>
-      <w:r>
-        <w:t>Plan main UI elements.</w:t>
-      </w:r>
-    </w:p>
-    <w:p>
-      <w:pPr>
-        <w:pStyle w:val="ListParagraph"/>
-        <w:numPr>
-          <w:ilvl w:val="0"/>
-          <w:numId w:val="14"/>
-        </w:numPr>
-      </w:pPr>
-      <w:r>
-        <w:t>Set up project and directory structure for development and testing.</w:t>
+        <w:t>Stage 1</w:t>
+      </w:r>
+      <w:r>
+        <w:t>.1</w:t>
+      </w:r>
+      <w:r>
+        <w:t xml:space="preserve"> – Backend Image Classes</w:t>
+      </w:r>
+    </w:p>
+    <w:p>
+      <w:pPr>
+        <w:pStyle w:val="ListParagraph"/>
+        <w:numPr>
+          <w:ilvl w:val="0"/>
+          <w:numId w:val="12"/>
+        </w:numPr>
+      </w:pPr>
+      <w:r>
+        <w:t xml:space="preserve">Plan unit testing for </w:t>
+      </w:r>
+      <w:proofErr w:type="spellStart"/>
+      <w:r>
+        <w:rPr>
+          <w:b/>
+          <w:bCs/>
+        </w:rPr>
+        <w:t>DataType</w:t>
+      </w:r>
+      <w:proofErr w:type="spellEnd"/>
+      <w:r>
+        <w:t xml:space="preserve">, </w:t>
+      </w:r>
+      <w:r>
+        <w:rPr>
+          <w:b/>
+          <w:bCs/>
+        </w:rPr>
+        <w:t>Shape</w:t>
+      </w:r>
+      <w:r>
+        <w:t xml:space="preserve"> and </w:t>
+      </w:r>
+      <w:r>
+        <w:rPr>
+          <w:b/>
+          <w:bCs/>
+        </w:rPr>
+        <w:t>Image</w:t>
+      </w:r>
+      <w:r>
+        <w:t xml:space="preserve"> classes.</w:t>
+      </w:r>
+    </w:p>
+    <w:p>
+      <w:pPr>
+        <w:pStyle w:val="ListParagraph"/>
+        <w:numPr>
+          <w:ilvl w:val="0"/>
+          <w:numId w:val="12"/>
+        </w:numPr>
+      </w:pPr>
+      <w:r>
+        <w:lastRenderedPageBreak/>
+        <w:t xml:space="preserve">Implement </w:t>
+      </w:r>
+      <w:proofErr w:type="spellStart"/>
+      <w:r>
+        <w:rPr>
+          <w:b/>
+          <w:bCs/>
+        </w:rPr>
+        <w:t>DataType</w:t>
+      </w:r>
+      <w:proofErr w:type="spellEnd"/>
+      <w:r>
+        <w:t xml:space="preserve">, </w:t>
+      </w:r>
+      <w:r>
+        <w:rPr>
+          <w:b/>
+          <w:bCs/>
+        </w:rPr>
+        <w:t>Shape</w:t>
+      </w:r>
+      <w:r>
+        <w:t xml:space="preserve"> and </w:t>
+      </w:r>
+      <w:r>
+        <w:rPr>
+          <w:b/>
+          <w:bCs/>
+        </w:rPr>
+        <w:t>Image</w:t>
+      </w:r>
+      <w:r>
+        <w:t xml:space="preserve"> classes.</w:t>
+      </w:r>
+    </w:p>
+    <w:p>
+      <w:pPr>
+        <w:pStyle w:val="ListParagraph"/>
+        <w:numPr>
+          <w:ilvl w:val="0"/>
+          <w:numId w:val="12"/>
+        </w:numPr>
+      </w:pPr>
+      <w:r>
+        <w:t xml:space="preserve">Test </w:t>
+      </w:r>
+      <w:proofErr w:type="spellStart"/>
+      <w:r>
+        <w:rPr>
+          <w:b/>
+          <w:bCs/>
+        </w:rPr>
+        <w:t>DataType</w:t>
+      </w:r>
+      <w:proofErr w:type="spellEnd"/>
+      <w:r>
+        <w:t xml:space="preserve">, </w:t>
+      </w:r>
+      <w:r>
+        <w:rPr>
+          <w:b/>
+          <w:bCs/>
+        </w:rPr>
+        <w:t>Shape</w:t>
+      </w:r>
+      <w:r>
+        <w:t xml:space="preserve"> and </w:t>
+      </w:r>
+      <w:r>
+        <w:rPr>
+          <w:b/>
+          <w:bCs/>
+        </w:rPr>
+        <w:t>Image</w:t>
+      </w:r>
+      <w:r>
+        <w:t xml:space="preserve"> classes.</w:t>
       </w:r>
     </w:p>
     <w:p>
@@ -3084,49 +3420,45 @@
         <w:pStyle w:val="Heading3"/>
       </w:pPr>
       <w:r>
-        <w:t>Stage 1 – Backend Image Classes</w:t>
-      </w:r>
-    </w:p>
-    <w:p>
-      <w:pPr>
-        <w:pStyle w:val="ListParagraph"/>
-        <w:numPr>
-          <w:ilvl w:val="0"/>
-          <w:numId w:val="12"/>
+        <w:t xml:space="preserve">Stage </w:t>
+      </w:r>
+      <w:r>
+        <w:t>1.2</w:t>
+      </w:r>
+      <w:r>
+        <w:t xml:space="preserve"> – Backend Image Operation Classes</w:t>
+      </w:r>
+    </w:p>
+    <w:p>
+      <w:pPr>
+        <w:pStyle w:val="ListParagraph"/>
+        <w:numPr>
+          <w:ilvl w:val="0"/>
+          <w:numId w:val="15"/>
         </w:numPr>
       </w:pPr>
       <w:r>
         <w:t xml:space="preserve">Plan unit testing for </w:t>
       </w:r>
-      <w:proofErr w:type="spellStart"/>
-      <w:r>
-        <w:rPr>
-          <w:b/>
-          <w:bCs/>
-        </w:rPr>
-        <w:t>DataType</w:t>
-      </w:r>
-      <w:proofErr w:type="spellEnd"/>
+      <w:r>
+        <w:t>Parameters</w:t>
+      </w:r>
       <w:r>
         <w:t xml:space="preserve">, </w:t>
       </w:r>
-      <w:r>
-        <w:rPr>
-          <w:b/>
-          <w:bCs/>
-        </w:rPr>
-        <w:t>Shape</w:t>
-      </w:r>
+      <w:proofErr w:type="spellStart"/>
+      <w:r>
+        <w:t>ImageOperation</w:t>
+      </w:r>
+      <w:proofErr w:type="spellEnd"/>
       <w:r>
         <w:t xml:space="preserve"> and </w:t>
       </w:r>
-      <w:r>
-        <w:rPr>
-          <w:b/>
-          <w:bCs/>
-        </w:rPr>
-        <w:t>Image</w:t>
-      </w:r>
+      <w:proofErr w:type="spellStart"/>
+      <w:r>
+        <w:t>ImageOperationDirectory</w:t>
+      </w:r>
+      <w:proofErr w:type="spellEnd"/>
       <w:r>
         <w:t xml:space="preserve"> classes.</w:t>
       </w:r>
@@ -3136,41 +3468,31 @@
         <w:pStyle w:val="ListParagraph"/>
         <w:numPr>
           <w:ilvl w:val="0"/>
-          <w:numId w:val="12"/>
+          <w:numId w:val="15"/>
         </w:numPr>
       </w:pPr>
       <w:r>
         <w:t xml:space="preserve">Implement </w:t>
       </w:r>
-      <w:proofErr w:type="spellStart"/>
-      <w:r>
-        <w:rPr>
-          <w:b/>
-          <w:bCs/>
-        </w:rPr>
-        <w:t>DataType</w:t>
-      </w:r>
-      <w:proofErr w:type="spellEnd"/>
+      <w:r>
+        <w:t>Parameters</w:t>
+      </w:r>
       <w:r>
         <w:t xml:space="preserve">, </w:t>
       </w:r>
-      <w:r>
-        <w:rPr>
-          <w:b/>
-          <w:bCs/>
-        </w:rPr>
-        <w:t>Shape</w:t>
-      </w:r>
+      <w:proofErr w:type="spellStart"/>
+      <w:r>
+        <w:t>ImageOperation</w:t>
+      </w:r>
+      <w:proofErr w:type="spellEnd"/>
       <w:r>
         <w:t xml:space="preserve"> and </w:t>
       </w:r>
-      <w:r>
-        <w:rPr>
-          <w:b/>
-          <w:bCs/>
-        </w:rPr>
-        <w:t>Image</w:t>
-      </w:r>
+      <w:proofErr w:type="spellStart"/>
+      <w:r>
+        <w:t>ImageOperationDirectory</w:t>
+      </w:r>
+      <w:proofErr w:type="spellEnd"/>
       <w:r>
         <w:t xml:space="preserve"> classes.</w:t>
       </w:r>
@@ -3180,41 +3502,31 @@
         <w:pStyle w:val="ListParagraph"/>
         <w:numPr>
           <w:ilvl w:val="0"/>
-          <w:numId w:val="12"/>
+          <w:numId w:val="15"/>
         </w:numPr>
       </w:pPr>
       <w:r>
         <w:t xml:space="preserve">Test </w:t>
       </w:r>
-      <w:proofErr w:type="spellStart"/>
-      <w:r>
-        <w:rPr>
-          <w:b/>
-          <w:bCs/>
-        </w:rPr>
-        <w:t>DataType</w:t>
-      </w:r>
-      <w:proofErr w:type="spellEnd"/>
+      <w:r>
+        <w:t>Parameters</w:t>
+      </w:r>
       <w:r>
         <w:t xml:space="preserve">, </w:t>
       </w:r>
-      <w:r>
-        <w:rPr>
-          <w:b/>
-          <w:bCs/>
-        </w:rPr>
-        <w:t>Shape</w:t>
-      </w:r>
+      <w:proofErr w:type="spellStart"/>
+      <w:r>
+        <w:t>ImageOperation</w:t>
+      </w:r>
+      <w:proofErr w:type="spellEnd"/>
       <w:r>
         <w:t xml:space="preserve"> and </w:t>
       </w:r>
-      <w:r>
-        <w:rPr>
-          <w:b/>
-          <w:bCs/>
-        </w:rPr>
-        <w:t>Image</w:t>
-      </w:r>
+      <w:proofErr w:type="spellStart"/>
+      <w:r>
+        <w:t>ImageOperationDirectory</w:t>
+      </w:r>
+      <w:proofErr w:type="spellEnd"/>
       <w:r>
         <w:t xml:space="preserve"> classes.</w:t>
       </w:r>
@@ -3224,39 +3536,53 @@
         <w:pStyle w:val="Heading3"/>
       </w:pPr>
       <w:r>
-        <w:t>Stage 2 – Backend Image Operation Classes</w:t>
-      </w:r>
-    </w:p>
-    <w:p>
-      <w:pPr>
-        <w:pStyle w:val="ListParagraph"/>
-        <w:numPr>
-          <w:ilvl w:val="0"/>
-          <w:numId w:val="15"/>
+        <w:t xml:space="preserve">Stage </w:t>
+      </w:r>
+      <w:r>
+        <w:t>1.</w:t>
+      </w:r>
+      <w:r>
+        <w:t>3 – Backend Workflow Sub-classes</w:t>
+      </w:r>
+    </w:p>
+    <w:p>
+      <w:pPr>
+        <w:pStyle w:val="ListParagraph"/>
+        <w:numPr>
+          <w:ilvl w:val="0"/>
+          <w:numId w:val="16"/>
         </w:numPr>
       </w:pPr>
       <w:r>
         <w:t xml:space="preserve">Plan unit testing for </w:t>
       </w:r>
       <w:r>
-        <w:t>Parameters</w:t>
+        <w:rPr>
+          <w:b/>
+          <w:bCs/>
+        </w:rPr>
+        <w:t>Port</w:t>
       </w:r>
       <w:r>
         <w:t xml:space="preserve">, </w:t>
       </w:r>
-      <w:proofErr w:type="spellStart"/>
-      <w:r>
-        <w:t>ImageOperation</w:t>
-      </w:r>
-      <w:proofErr w:type="spellEnd"/>
+      <w:r>
+        <w:rPr>
+          <w:b/>
+          <w:bCs/>
+        </w:rPr>
+        <w:t>Node</w:t>
+      </w:r>
       <w:r>
         <w:t xml:space="preserve"> and </w:t>
       </w:r>
-      <w:proofErr w:type="spellStart"/>
-      <w:r>
-        <w:t>ImageOperationDirectory</w:t>
-      </w:r>
-      <w:proofErr w:type="spellEnd"/>
+      <w:r>
+        <w:rPr>
+          <w:b/>
+          <w:bCs/>
+        </w:rPr>
+        <w:t>Connection</w:t>
+      </w:r>
       <w:r>
         <w:t xml:space="preserve"> classes.</w:t>
       </w:r>
@@ -3266,31 +3592,39 @@
         <w:pStyle w:val="ListParagraph"/>
         <w:numPr>
           <w:ilvl w:val="0"/>
-          <w:numId w:val="15"/>
+          <w:numId w:val="16"/>
         </w:numPr>
       </w:pPr>
       <w:r>
         <w:t xml:space="preserve">Implement </w:t>
       </w:r>
       <w:r>
-        <w:t>Parameters</w:t>
+        <w:rPr>
+          <w:b/>
+          <w:bCs/>
+        </w:rPr>
+        <w:t>Port</w:t>
       </w:r>
       <w:r>
         <w:t xml:space="preserve">, </w:t>
       </w:r>
-      <w:proofErr w:type="spellStart"/>
-      <w:r>
-        <w:t>ImageOperation</w:t>
-      </w:r>
-      <w:proofErr w:type="spellEnd"/>
+      <w:r>
+        <w:rPr>
+          <w:b/>
+          <w:bCs/>
+        </w:rPr>
+        <w:t>Node</w:t>
+      </w:r>
       <w:r>
         <w:t xml:space="preserve"> and </w:t>
       </w:r>
-      <w:proofErr w:type="spellStart"/>
-      <w:r>
-        <w:t>ImageOperationDirectory</w:t>
-      </w:r>
-      <w:proofErr w:type="spellEnd"/>
+      <w:r>
+        <w:rPr>
+          <w:b/>
+          <w:bCs/>
+        </w:rPr>
+        <w:t>Connection</w:t>
+      </w:r>
       <w:r>
         <w:t xml:space="preserve"> classes.</w:t>
       </w:r>
@@ -3300,31 +3634,39 @@
         <w:pStyle w:val="ListParagraph"/>
         <w:numPr>
           <w:ilvl w:val="0"/>
-          <w:numId w:val="15"/>
+          <w:numId w:val="16"/>
         </w:numPr>
       </w:pPr>
       <w:r>
         <w:t xml:space="preserve">Test </w:t>
       </w:r>
       <w:r>
-        <w:t>Parameters</w:t>
+        <w:rPr>
+          <w:b/>
+          <w:bCs/>
+        </w:rPr>
+        <w:t>Port</w:t>
       </w:r>
       <w:r>
         <w:t xml:space="preserve">, </w:t>
       </w:r>
-      <w:proofErr w:type="spellStart"/>
-      <w:r>
-        <w:t>ImageOperation</w:t>
-      </w:r>
-      <w:proofErr w:type="spellEnd"/>
+      <w:r>
+        <w:rPr>
+          <w:b/>
+          <w:bCs/>
+        </w:rPr>
+        <w:t>Node</w:t>
+      </w:r>
       <w:r>
         <w:t xml:space="preserve"> and </w:t>
       </w:r>
-      <w:proofErr w:type="spellStart"/>
-      <w:r>
-        <w:t>ImageOperationDirectory</w:t>
-      </w:r>
-      <w:proofErr w:type="spellEnd"/>
+      <w:r>
+        <w:rPr>
+          <w:b/>
+          <w:bCs/>
+        </w:rPr>
+        <w:t>Connection</w:t>
+      </w:r>
       <w:r>
         <w:t xml:space="preserve"> classes.</w:t>
       </w:r>
@@ -3334,7 +3676,13 @@
         <w:pStyle w:val="Heading3"/>
       </w:pPr>
       <w:r>
-        <w:t>Stage 3 – Backend Workflow Sub-classes</w:t>
+        <w:t xml:space="preserve">Stage </w:t>
+      </w:r>
+      <w:r>
+        <w:t>1.4</w:t>
+      </w:r>
+      <w:r>
+        <w:t xml:space="preserve"> – Backend Workflow Class</w:t>
       </w:r>
     </w:p>
     <w:p>
@@ -3353,30 +3701,10 @@
           <w:b/>
           <w:bCs/>
         </w:rPr>
-        <w:t>Port</w:t>
-      </w:r>
-      <w:r>
-        <w:t xml:space="preserve">, </w:t>
-      </w:r>
-      <w:r>
-        <w:rPr>
-          <w:b/>
-          <w:bCs/>
-        </w:rPr>
-        <w:t>Node</w:t>
-      </w:r>
-      <w:r>
-        <w:t xml:space="preserve"> and </w:t>
-      </w:r>
-      <w:r>
-        <w:rPr>
-          <w:b/>
-          <w:bCs/>
-        </w:rPr>
-        <w:t>Connection</w:t>
-      </w:r>
-      <w:r>
-        <w:t xml:space="preserve"> classes.</w:t>
+        <w:t>Workflow</w:t>
+      </w:r>
+      <w:r>
+        <w:t xml:space="preserve"> class.</w:t>
       </w:r>
     </w:p>
     <w:p>
@@ -3395,30 +3723,10 @@
           <w:b/>
           <w:bCs/>
         </w:rPr>
-        <w:t>Port</w:t>
-      </w:r>
-      <w:r>
-        <w:t xml:space="preserve">, </w:t>
-      </w:r>
-      <w:r>
-        <w:rPr>
-          <w:b/>
-          <w:bCs/>
-        </w:rPr>
-        <w:t>Node</w:t>
-      </w:r>
-      <w:r>
-        <w:t xml:space="preserve"> and </w:t>
-      </w:r>
-      <w:r>
-        <w:rPr>
-          <w:b/>
-          <w:bCs/>
-        </w:rPr>
-        <w:t>Connection</w:t>
-      </w:r>
-      <w:r>
-        <w:t xml:space="preserve"> classes.</w:t>
+        <w:t>Workflow</w:t>
+      </w:r>
+      <w:r>
+        <w:t xml:space="preserve"> class.</w:t>
       </w:r>
     </w:p>
     <w:p>
@@ -3437,30 +3745,18 @@
           <w:b/>
           <w:bCs/>
         </w:rPr>
-        <w:t>Port</w:t>
-      </w:r>
-      <w:r>
-        <w:t xml:space="preserve">, </w:t>
-      </w:r>
-      <w:r>
-        <w:rPr>
-          <w:b/>
-          <w:bCs/>
-        </w:rPr>
-        <w:t>Node</w:t>
-      </w:r>
-      <w:r>
-        <w:t xml:space="preserve"> and </w:t>
-      </w:r>
-      <w:r>
-        <w:rPr>
-          <w:b/>
-          <w:bCs/>
-        </w:rPr>
-        <w:t>Connection</w:t>
-      </w:r>
-      <w:r>
-        <w:t xml:space="preserve"> classes.</w:t>
+        <w:t>Workflow</w:t>
+      </w:r>
+      <w:r>
+        <w:t xml:space="preserve"> class.</w:t>
+      </w:r>
+    </w:p>
+    <w:p>
+      <w:pPr>
+        <w:pStyle w:val="Heading2"/>
+      </w:pPr>
+      <w:r>
+        <w:t>Stage 2 - Frontend</w:t>
       </w:r>
     </w:p>
     <w:p>
@@ -3468,81 +3764,10 @@
         <w:pStyle w:val="Heading3"/>
       </w:pPr>
       <w:r>
-        <w:t>Stage 4 – Backend Workflow Class</w:t>
-      </w:r>
-    </w:p>
-    <w:p>
-      <w:pPr>
-        <w:pStyle w:val="ListParagraph"/>
-        <w:numPr>
-          <w:ilvl w:val="0"/>
-          <w:numId w:val="16"/>
-        </w:numPr>
-      </w:pPr>
-      <w:r>
-        <w:t xml:space="preserve">Plan unit testing for </w:t>
-      </w:r>
-      <w:r>
-        <w:rPr>
-          <w:b/>
-          <w:bCs/>
-        </w:rPr>
-        <w:t>Workflow</w:t>
-      </w:r>
-      <w:r>
-        <w:t xml:space="preserve"> class.</w:t>
-      </w:r>
-    </w:p>
-    <w:p>
-      <w:pPr>
-        <w:pStyle w:val="ListParagraph"/>
-        <w:numPr>
-          <w:ilvl w:val="0"/>
-          <w:numId w:val="16"/>
-        </w:numPr>
-      </w:pPr>
-      <w:r>
-        <w:t xml:space="preserve">Implement </w:t>
-      </w:r>
-      <w:r>
-        <w:rPr>
-          <w:b/>
-          <w:bCs/>
-        </w:rPr>
-        <w:t>Workflow</w:t>
-      </w:r>
-      <w:r>
-        <w:t xml:space="preserve"> class.</w:t>
-      </w:r>
-    </w:p>
-    <w:p>
-      <w:pPr>
-        <w:pStyle w:val="ListParagraph"/>
-        <w:numPr>
-          <w:ilvl w:val="0"/>
-          <w:numId w:val="16"/>
-        </w:numPr>
-      </w:pPr>
-      <w:r>
-        <w:t xml:space="preserve">Test </w:t>
-      </w:r>
-      <w:r>
-        <w:rPr>
-          <w:b/>
-          <w:bCs/>
-        </w:rPr>
-        <w:t>Workflow</w:t>
-      </w:r>
-      <w:r>
-        <w:t xml:space="preserve"> class.</w:t>
-      </w:r>
-    </w:p>
-    <w:p>
-      <w:pPr>
-        <w:pStyle w:val="Heading3"/>
-      </w:pPr>
-      <w:r>
-        <w:t>Stage 5</w:t>
+        <w:t xml:space="preserve">Stage </w:t>
+      </w:r>
+      <w:r>
+        <w:t>2.1</w:t>
       </w:r>
       <w:r>
         <w:t xml:space="preserve"> – Frontend Planning</w:t>
@@ -3572,12 +3797,96 @@
         <w:t>Plan implementation of frontend.</w:t>
       </w:r>
     </w:p>
-    <w:p/>
-    <w:p/>
-    <w:p>
+    <w:p>
+      <w:pPr>
+        <w:pStyle w:val="Heading2"/>
+      </w:pPr>
+      <w:r>
+        <w:t>Design Notes</w:t>
+      </w:r>
+    </w:p>
+    <w:p>
+      <w:pPr>
+        <w:pStyle w:val="ListParagraph"/>
+        <w:numPr>
+          <w:ilvl w:val="0"/>
+          <w:numId w:val="1"/>
+        </w:numPr>
+      </w:pPr>
+      <w:r>
+        <w:t xml:space="preserve">Changes to image shape should always be explicit, never incidental. For example, z-projection will reduce z dimension to 1 because that’s what z projection does, but thresholding a </w:t>
+      </w:r>
+      <w:proofErr w:type="gramStart"/>
+      <w:r>
+        <w:t>5 slice</w:t>
+      </w:r>
+      <w:proofErr w:type="gramEnd"/>
+      <w:r>
+        <w:t xml:space="preserve"> z-stack will output 5 thresholds, not just 1.</w:t>
+      </w:r>
+    </w:p>
+    <w:p>
+      <w:pPr>
+        <w:pStyle w:val="ListParagraph"/>
+        <w:numPr>
+          <w:ilvl w:val="0"/>
+          <w:numId w:val="1"/>
+        </w:numPr>
+      </w:pPr>
+      <w:r>
+        <w:t>Function code does not deal with type changes, checking of types, displaying images, UI input. The role of each function is purely to take its defined input</w:t>
+      </w:r>
+      <w:r>
+        <w:t>,</w:t>
+      </w:r>
+      <w:r>
+        <w:t xml:space="preserve"> process </w:t>
+      </w:r>
+      <w:r>
+        <w:t>it according to the supplied parameters</w:t>
+      </w:r>
+      <w:r>
+        <w:t>, and produce an output in defined shape. As part of this role, it should include error handling to minimi</w:t>
+      </w:r>
+      <w:r>
+        <w:t>s</w:t>
+      </w:r>
+      <w:r>
+        <w:t>e/deal with possible errors (with the assumption that the input is of the required format)</w:t>
+      </w:r>
+      <w:r>
+        <w:t xml:space="preserve">. </w:t>
+      </w:r>
+    </w:p>
+    <w:p>
+      <w:pPr>
+        <w:pStyle w:val="ListParagraph"/>
+        <w:numPr>
+          <w:ilvl w:val="0"/>
+          <w:numId w:val="1"/>
+        </w:numPr>
+      </w:pPr>
+      <w:r>
+        <w:t xml:space="preserve">To allow for simple additions of new functions without affecting the base code, each function will be in a separate module. Along with the code itself, this module should include other data required to integrate into the software (definitions of parameters required, input and output data types, input and output image shape) and documentation (what the </w:t>
+      </w:r>
+      <w:r>
+        <w:t>function does, how it affects the image shape, how changes to parameters affect output, any other points of interest).</w:t>
+      </w:r>
+      <w:r>
+        <w:t xml:space="preserve"> </w:t>
+      </w:r>
+    </w:p>
+    <w:p>
+      <w:pPr>
+        <w:pStyle w:val="ListParagraph"/>
+        <w:numPr>
+          <w:ilvl w:val="0"/>
+          <w:numId w:val="1"/>
+        </w:numPr>
+      </w:pPr>
       <w:r>
         <w:lastRenderedPageBreak/>
-        <w:t>Design Notes</w:t>
+        <w:t>Type checking etc will be carried out by the pipeline functions, along with checking that the input and output image shapes are as expected.</w:t>
       </w:r>
     </w:p>
     <w:p>
@@ -3589,15 +3898,15 @@
         </w:numPr>
       </w:pPr>
       <w:r>
-        <w:t xml:space="preserve">Changes to image shape should always be explicit, never incidental. For example, z-projection will reduce z dimension to 1 because that’s what z projection does, but thresholding a </w:t>
-      </w:r>
-      <w:proofErr w:type="gramStart"/>
-      <w:r>
-        <w:t>5 slice</w:t>
-      </w:r>
-      <w:proofErr w:type="gramEnd"/>
-      <w:r>
-        <w:t xml:space="preserve"> z-stack will output 5 thresholds, not just 1.</w:t>
+        <w:t xml:space="preserve">Functions can have multiple outputs, but defined inputs. For example, a z-stack could have one output getting z-projected, another getting processes slice by slice etc, but two images could not enter the same z-projection function. Some functions may require multiple inputs, </w:t>
+      </w:r>
+      <w:proofErr w:type="spellStart"/>
+      <w:r>
+        <w:t>eg</w:t>
+      </w:r>
+      <w:proofErr w:type="spellEnd"/>
+      <w:r>
+        <w:t xml:space="preserve"> applying a threshold will require thresholds and an image to apply thresholds to.</w:t>
       </w:r>
     </w:p>
     <w:p>
@@ -3609,28 +3918,7 @@
         </w:numPr>
       </w:pPr>
       <w:r>
-        <w:t>Function code does not deal with type changes, checking of types, displaying images, UI input. The role of each function is purely to take its defined input</w:t>
-      </w:r>
-      <w:r>
-        <w:t>,</w:t>
-      </w:r>
-      <w:r>
-        <w:t xml:space="preserve"> process </w:t>
-      </w:r>
-      <w:r>
-        <w:t>it according to the supplied parameters</w:t>
-      </w:r>
-      <w:r>
-        <w:t>, and produce an output in defined shape. As part of this role, it should include error handling to minimi</w:t>
-      </w:r>
-      <w:r>
-        <w:t>s</w:t>
-      </w:r>
-      <w:r>
-        <w:t>e/deal with possible errors (with the assumption that the input is of the required format)</w:t>
-      </w:r>
-      <w:r>
-        <w:t xml:space="preserve">. </w:t>
+        <w:t>Some thought is going to have to be given to how to deal with segmented images. Are segments treated as an image of size y * x with integer values defining segment locations? Is each segment treated like its own sub-image (like channels or z-slices)? Is a segmented image treated as the original image with an added layer defining the segments? Leaning towards the first option, but the other options may have advantages in specific situations.</w:t>
       </w:r>
     </w:p>
     <w:p>
@@ -3642,13 +3930,23 @@
         </w:numPr>
       </w:pPr>
       <w:r>
-        <w:t xml:space="preserve">To allow for simple additions of new functions without affecting the base code, each function will be in a separate module. Along with the code itself, this module should include other data required to integrate into the software (definitions of parameters required, input and output data types, input and output image shape) and documentation (what the </w:t>
-      </w:r>
-      <w:r>
-        <w:t>function does, how it affects the image shape, how changes to parameters affect output, any other points of interest).</w:t>
-      </w:r>
-      <w:r>
-        <w:t xml:space="preserve"> </w:t>
+        <w:t>Some type changes should be dealt with automatically (</w:t>
+      </w:r>
+      <w:proofErr w:type="spellStart"/>
+      <w:r>
+        <w:t>ie</w:t>
+      </w:r>
+      <w:proofErr w:type="spellEnd"/>
+      <w:r>
+        <w:t>, int to float). Some type changes should be highlighted to user as a flaw in the workflow (</w:t>
+      </w:r>
+      <w:proofErr w:type="spellStart"/>
+      <w:r>
+        <w:t>ie</w:t>
+      </w:r>
+      <w:proofErr w:type="spellEnd"/>
+      <w:r>
+        <w:t>, trying to carry out a binary process on a non-binarised image) with pointers on how to fix the issue).</w:t>
       </w:r>
     </w:p>
     <w:p>
@@ -3660,7 +3958,7 @@
         </w:numPr>
       </w:pPr>
       <w:r>
-        <w:t>Type checking etc will be carried out by the pipeline functions, along with checking that the input and output image shapes are as expected.</w:t>
+        <w:t>It should be possible to add new functions without programming new UI elements. The data included with a function must be sufficient to automatically generate a UI element for the user to enter the required parameters.</w:t>
       </w:r>
     </w:p>
     <w:p>
@@ -3672,15 +3970,10 @@
         </w:numPr>
       </w:pPr>
       <w:r>
-        <w:t xml:space="preserve">Functions can have multiple outputs, but defined inputs. For example, a z-stack could have one output getting z-projected, another getting processes slice by slice etc, but two images could not enter the same z-projection function. Some functions may require multiple inputs, </w:t>
-      </w:r>
-      <w:proofErr w:type="spellStart"/>
-      <w:r>
-        <w:t>eg</w:t>
-      </w:r>
-      <w:proofErr w:type="spellEnd"/>
-      <w:r>
-        <w:t xml:space="preserve"> applying a threshold will require thresholds and an image to apply thresholds to.</w:t>
+        <w:t>If its educational, it needs documentation. Consider whether this should be included as a string within any new function or as a separate file</w:t>
+      </w:r>
+      <w:r>
+        <w:t>.</w:t>
       </w:r>
     </w:p>
     <w:p>
@@ -3692,7 +3985,7 @@
         </w:numPr>
       </w:pPr>
       <w:r>
-        <w:t>Some thought is going to have to be given to how to deal with segmented images. Are segments treated as an image of size y * x with integer values defining segment locations? Is each segment treated like its own sub-image (like channels or z-slices)? Is a segmented image treated as the original image with an added layer defining the segments? Leaning towards the first option, but the other options may have advantages in specific situations.</w:t>
+        <w:t>The UI should be unintimidating. Consider what is necessary to see (input image, output image for comparison, channel and slice controls, current workflow diagram) and what can be hidden except when needed (LUTs, adding functions, changing function parameters, defining channel image parameters (channel names etc)).</w:t>
       </w:r>
     </w:p>
     <w:p>
@@ -3704,74 +3997,6 @@
         </w:numPr>
       </w:pPr>
       <w:r>
-        <w:t>Some type changes should be dealt with automatically (</w:t>
-      </w:r>
-      <w:proofErr w:type="spellStart"/>
-      <w:r>
-        <w:t>ie</w:t>
-      </w:r>
-      <w:proofErr w:type="spellEnd"/>
-      <w:r>
-        <w:t>, int to float). Some type changes should be highlighted to user as a flaw in the workflow (</w:t>
-      </w:r>
-      <w:proofErr w:type="spellStart"/>
-      <w:r>
-        <w:t>ie</w:t>
-      </w:r>
-      <w:proofErr w:type="spellEnd"/>
-      <w:r>
-        <w:t>, trying to carry out a binary process on a non-binarised image) with pointers on how to fix the issue).</w:t>
-      </w:r>
-    </w:p>
-    <w:p>
-      <w:pPr>
-        <w:pStyle w:val="ListParagraph"/>
-        <w:numPr>
-          <w:ilvl w:val="0"/>
-          <w:numId w:val="1"/>
-        </w:numPr>
-      </w:pPr>
-      <w:r>
-        <w:t>It should be possible to add new functions without programming new UI elements. The data included with a function must be sufficient to automatically generate a UI element for the user to enter the required parameters.</w:t>
-      </w:r>
-    </w:p>
-    <w:p>
-      <w:pPr>
-        <w:pStyle w:val="ListParagraph"/>
-        <w:numPr>
-          <w:ilvl w:val="0"/>
-          <w:numId w:val="1"/>
-        </w:numPr>
-      </w:pPr>
-      <w:r>
-        <w:t>If its educational, it needs documentation. Consider whether this should be included as a string within any new function or as a separate file</w:t>
-      </w:r>
-      <w:r>
-        <w:t>.</w:t>
-      </w:r>
-    </w:p>
-    <w:p>
-      <w:pPr>
-        <w:pStyle w:val="ListParagraph"/>
-        <w:numPr>
-          <w:ilvl w:val="0"/>
-          <w:numId w:val="1"/>
-        </w:numPr>
-      </w:pPr>
-      <w:r>
-        <w:t>The UI should be unintimidating. Consider what is necessary to see (input image, output image for comparison, channel and slice controls, current workflow diagram) and what can be hidden except when needed (LUTs, adding functions, changing function parameters, defining channel image parameters (channel names etc)).</w:t>
-      </w:r>
-    </w:p>
-    <w:p>
-      <w:pPr>
-        <w:pStyle w:val="ListParagraph"/>
-        <w:numPr>
-          <w:ilvl w:val="0"/>
-          <w:numId w:val="1"/>
-        </w:numPr>
-      </w:pPr>
-      <w:r>
-        <w:lastRenderedPageBreak/>
         <w:t>One of the challenges of image analysis I would like to simplify here is making sure an input image to a function is in the right format. Transposition of shape (</w:t>
       </w:r>
       <w:proofErr w:type="spellStart"/>
@@ -4111,11 +4336,7 @@
         <w:t xml:space="preserve">e.g., </w:t>
       </w:r>
       <w:r>
-        <w:t xml:space="preserve">node 2) would be dragged into </w:t>
-      </w:r>
-      <w:r>
-        <w:lastRenderedPageBreak/>
-        <w:t xml:space="preserve">the workflow; this would add the node to the workflow class as a workflow element, but with no input or output connections specified. Next, the user would connect the node to the preceding node (node 1). At this point a function would be called within the workflow class to check what type conversions might be needed (in pseudo code, node2 input = </w:t>
+        <w:t xml:space="preserve">node 2) would be dragged into the workflow; this would add the node to the workflow class as a workflow element, but with no input or output connections specified. Next, the user would connect the node to the preceding node (node 1). At this point a function would be called within the workflow class to check what type conversions might be needed (in pseudo code, node2 input = </w:t>
       </w:r>
       <w:proofErr w:type="gramStart"/>
       <w:r>
@@ -4556,6 +4777,92 @@
     </w:lvl>
   </w:abstractNum>
   <w:abstractNum w:abstractNumId="2" w15:restartNumberingAfterBreak="0">
+    <w:nsid w:val="13AB3983"/>
+    <w:multiLevelType w:val="hybridMultilevel"/>
+    <w:tmpl w:val="4AF89EE2"/>
+    <w:lvl w:ilvl="0" w:tplc="0809000F">
+      <w:start w:val="1"/>
+      <w:numFmt w:val="decimal"/>
+      <w:lvlText w:val="%1."/>
+      <w:lvlJc w:val="left"/>
+      <w:pPr>
+        <w:ind w:left="720" w:hanging="360"/>
+      </w:pPr>
+    </w:lvl>
+    <w:lvl w:ilvl="1" w:tplc="08090019" w:tentative="1">
+      <w:start w:val="1"/>
+      <w:numFmt w:val="lowerLetter"/>
+      <w:lvlText w:val="%2."/>
+      <w:lvlJc w:val="left"/>
+      <w:pPr>
+        <w:ind w:left="1440" w:hanging="360"/>
+      </w:pPr>
+    </w:lvl>
+    <w:lvl w:ilvl="2" w:tplc="0809001B" w:tentative="1">
+      <w:start w:val="1"/>
+      <w:numFmt w:val="lowerRoman"/>
+      <w:lvlText w:val="%3."/>
+      <w:lvlJc w:val="right"/>
+      <w:pPr>
+        <w:ind w:left="2160" w:hanging="180"/>
+      </w:pPr>
+    </w:lvl>
+    <w:lvl w:ilvl="3" w:tplc="0809000F" w:tentative="1">
+      <w:start w:val="1"/>
+      <w:numFmt w:val="decimal"/>
+      <w:lvlText w:val="%4."/>
+      <w:lvlJc w:val="left"/>
+      <w:pPr>
+        <w:ind w:left="2880" w:hanging="360"/>
+      </w:pPr>
+    </w:lvl>
+    <w:lvl w:ilvl="4" w:tplc="08090019" w:tentative="1">
+      <w:start w:val="1"/>
+      <w:numFmt w:val="lowerLetter"/>
+      <w:lvlText w:val="%5."/>
+      <w:lvlJc w:val="left"/>
+      <w:pPr>
+        <w:ind w:left="3600" w:hanging="360"/>
+      </w:pPr>
+    </w:lvl>
+    <w:lvl w:ilvl="5" w:tplc="0809001B" w:tentative="1">
+      <w:start w:val="1"/>
+      <w:numFmt w:val="lowerRoman"/>
+      <w:lvlText w:val="%6."/>
+      <w:lvlJc w:val="right"/>
+      <w:pPr>
+        <w:ind w:left="4320" w:hanging="180"/>
+      </w:pPr>
+    </w:lvl>
+    <w:lvl w:ilvl="6" w:tplc="0809000F" w:tentative="1">
+      <w:start w:val="1"/>
+      <w:numFmt w:val="decimal"/>
+      <w:lvlText w:val="%7."/>
+      <w:lvlJc w:val="left"/>
+      <w:pPr>
+        <w:ind w:left="5040" w:hanging="360"/>
+      </w:pPr>
+    </w:lvl>
+    <w:lvl w:ilvl="7" w:tplc="08090019" w:tentative="1">
+      <w:start w:val="1"/>
+      <w:numFmt w:val="lowerLetter"/>
+      <w:lvlText w:val="%8."/>
+      <w:lvlJc w:val="left"/>
+      <w:pPr>
+        <w:ind w:left="5760" w:hanging="360"/>
+      </w:pPr>
+    </w:lvl>
+    <w:lvl w:ilvl="8" w:tplc="0809001B" w:tentative="1">
+      <w:start w:val="1"/>
+      <w:numFmt w:val="lowerRoman"/>
+      <w:lvlText w:val="%9."/>
+      <w:lvlJc w:val="right"/>
+      <w:pPr>
+        <w:ind w:left="6480" w:hanging="180"/>
+      </w:pPr>
+    </w:lvl>
+  </w:abstractNum>
+  <w:abstractNum w:abstractNumId="3" w15:restartNumberingAfterBreak="0">
     <w:nsid w:val="140F42DB"/>
     <w:multiLevelType w:val="hybridMultilevel"/>
     <w:tmpl w:val="2A76514E"/>
@@ -4668,7 +4975,7 @@
       </w:rPr>
     </w:lvl>
   </w:abstractNum>
-  <w:abstractNum w:abstractNumId="3" w15:restartNumberingAfterBreak="0">
+  <w:abstractNum w:abstractNumId="4" w15:restartNumberingAfterBreak="0">
     <w:nsid w:val="16B25DDF"/>
     <w:multiLevelType w:val="hybridMultilevel"/>
     <w:tmpl w:val="F11EB088"/>
@@ -4754,7 +5061,7 @@
       </w:pPr>
     </w:lvl>
   </w:abstractNum>
-  <w:abstractNum w:abstractNumId="4" w15:restartNumberingAfterBreak="0">
+  <w:abstractNum w:abstractNumId="5" w15:restartNumberingAfterBreak="0">
     <w:nsid w:val="179857BE"/>
     <w:multiLevelType w:val="hybridMultilevel"/>
     <w:tmpl w:val="AB7081D0"/>
@@ -4867,7 +5174,7 @@
       </w:rPr>
     </w:lvl>
   </w:abstractNum>
-  <w:abstractNum w:abstractNumId="5" w15:restartNumberingAfterBreak="0">
+  <w:abstractNum w:abstractNumId="6" w15:restartNumberingAfterBreak="0">
     <w:nsid w:val="18BE6E9E"/>
     <w:multiLevelType w:val="hybridMultilevel"/>
     <w:tmpl w:val="D3F2AB56"/>
@@ -4980,7 +5287,7 @@
       </w:rPr>
     </w:lvl>
   </w:abstractNum>
-  <w:abstractNum w:abstractNumId="6" w15:restartNumberingAfterBreak="0">
+  <w:abstractNum w:abstractNumId="7" w15:restartNumberingAfterBreak="0">
     <w:nsid w:val="1A2237DF"/>
     <w:multiLevelType w:val="hybridMultilevel"/>
     <w:tmpl w:val="2A986194"/>
@@ -5093,7 +5400,7 @@
       </w:rPr>
     </w:lvl>
   </w:abstractNum>
-  <w:abstractNum w:abstractNumId="7" w15:restartNumberingAfterBreak="0">
+  <w:abstractNum w:abstractNumId="8" w15:restartNumberingAfterBreak="0">
     <w:nsid w:val="258F0C3B"/>
     <w:multiLevelType w:val="hybridMultilevel"/>
     <w:tmpl w:val="B35EB432"/>
@@ -5206,7 +5513,7 @@
       </w:rPr>
     </w:lvl>
   </w:abstractNum>
-  <w:abstractNum w:abstractNumId="8" w15:restartNumberingAfterBreak="0">
+  <w:abstractNum w:abstractNumId="9" w15:restartNumberingAfterBreak="0">
     <w:nsid w:val="263F76CF"/>
     <w:multiLevelType w:val="hybridMultilevel"/>
     <w:tmpl w:val="5B8A548C"/>
@@ -5292,7 +5599,7 @@
       </w:pPr>
     </w:lvl>
   </w:abstractNum>
-  <w:abstractNum w:abstractNumId="9" w15:restartNumberingAfterBreak="0">
+  <w:abstractNum w:abstractNumId="10" w15:restartNumberingAfterBreak="0">
     <w:nsid w:val="287421FE"/>
     <w:multiLevelType w:val="hybridMultilevel"/>
     <w:tmpl w:val="A71C4578"/>
@@ -5405,7 +5712,7 @@
       </w:rPr>
     </w:lvl>
   </w:abstractNum>
-  <w:abstractNum w:abstractNumId="10" w15:restartNumberingAfterBreak="0">
+  <w:abstractNum w:abstractNumId="11" w15:restartNumberingAfterBreak="0">
     <w:nsid w:val="2B115959"/>
     <w:multiLevelType w:val="hybridMultilevel"/>
     <w:tmpl w:val="DD3E1A96"/>
@@ -5491,7 +5798,7 @@
       </w:pPr>
     </w:lvl>
   </w:abstractNum>
-  <w:abstractNum w:abstractNumId="11" w15:restartNumberingAfterBreak="0">
+  <w:abstractNum w:abstractNumId="12" w15:restartNumberingAfterBreak="0">
     <w:nsid w:val="2B521BFD"/>
     <w:multiLevelType w:val="hybridMultilevel"/>
     <w:tmpl w:val="EB56FB14"/>
@@ -5604,7 +5911,7 @@
       </w:rPr>
     </w:lvl>
   </w:abstractNum>
-  <w:abstractNum w:abstractNumId="12" w15:restartNumberingAfterBreak="0">
+  <w:abstractNum w:abstractNumId="13" w15:restartNumberingAfterBreak="0">
     <w:nsid w:val="2DAF4496"/>
     <w:multiLevelType w:val="hybridMultilevel"/>
     <w:tmpl w:val="FF16ADDC"/>
@@ -5717,7 +6024,7 @@
       </w:rPr>
     </w:lvl>
   </w:abstractNum>
-  <w:abstractNum w:abstractNumId="13" w15:restartNumberingAfterBreak="0">
+  <w:abstractNum w:abstractNumId="14" w15:restartNumberingAfterBreak="0">
     <w:nsid w:val="2EB63A4A"/>
     <w:multiLevelType w:val="hybridMultilevel"/>
     <w:tmpl w:val="C88E8454"/>
@@ -5803,7 +6110,7 @@
       </w:pPr>
     </w:lvl>
   </w:abstractNum>
-  <w:abstractNum w:abstractNumId="14" w15:restartNumberingAfterBreak="0">
+  <w:abstractNum w:abstractNumId="15" w15:restartNumberingAfterBreak="0">
     <w:nsid w:val="34CA5660"/>
     <w:multiLevelType w:val="hybridMultilevel"/>
     <w:tmpl w:val="BB8ED3BC"/>
@@ -5916,7 +6223,7 @@
       </w:rPr>
     </w:lvl>
   </w:abstractNum>
-  <w:abstractNum w:abstractNumId="15" w15:restartNumberingAfterBreak="0">
+  <w:abstractNum w:abstractNumId="16" w15:restartNumberingAfterBreak="0">
     <w:nsid w:val="44D73ADD"/>
     <w:multiLevelType w:val="hybridMultilevel"/>
     <w:tmpl w:val="CE263032"/>
@@ -6002,7 +6309,7 @@
       </w:pPr>
     </w:lvl>
   </w:abstractNum>
-  <w:abstractNum w:abstractNumId="16" w15:restartNumberingAfterBreak="0">
+  <w:abstractNum w:abstractNumId="17" w15:restartNumberingAfterBreak="0">
     <w:nsid w:val="45325AC2"/>
     <w:multiLevelType w:val="hybridMultilevel"/>
     <w:tmpl w:val="068EE9DE"/>
@@ -6115,7 +6422,7 @@
       </w:rPr>
     </w:lvl>
   </w:abstractNum>
-  <w:abstractNum w:abstractNumId="17" w15:restartNumberingAfterBreak="0">
+  <w:abstractNum w:abstractNumId="18" w15:restartNumberingAfterBreak="0">
     <w:nsid w:val="586C6A0D"/>
     <w:multiLevelType w:val="hybridMultilevel"/>
     <w:tmpl w:val="A4CCD790"/>
@@ -6228,7 +6535,7 @@
       </w:rPr>
     </w:lvl>
   </w:abstractNum>
-  <w:abstractNum w:abstractNumId="18" w15:restartNumberingAfterBreak="0">
+  <w:abstractNum w:abstractNumId="19" w15:restartNumberingAfterBreak="0">
     <w:nsid w:val="598F7B6D"/>
     <w:multiLevelType w:val="hybridMultilevel"/>
     <w:tmpl w:val="CF603B22"/>
@@ -6341,7 +6648,7 @@
       </w:rPr>
     </w:lvl>
   </w:abstractNum>
-  <w:abstractNum w:abstractNumId="19" w15:restartNumberingAfterBreak="0">
+  <w:abstractNum w:abstractNumId="20" w15:restartNumberingAfterBreak="0">
     <w:nsid w:val="5ADB39E7"/>
     <w:multiLevelType w:val="hybridMultilevel"/>
     <w:tmpl w:val="7576CF0C"/>
@@ -6433,7 +6740,7 @@
       </w:pPr>
     </w:lvl>
   </w:abstractNum>
-  <w:abstractNum w:abstractNumId="20" w15:restartNumberingAfterBreak="0">
+  <w:abstractNum w:abstractNumId="21" w15:restartNumberingAfterBreak="0">
     <w:nsid w:val="694373A2"/>
     <w:multiLevelType w:val="hybridMultilevel"/>
     <w:tmpl w:val="A8EA8652"/>
@@ -6546,7 +6853,7 @@
       </w:rPr>
     </w:lvl>
   </w:abstractNum>
-  <w:abstractNum w:abstractNumId="21" w15:restartNumberingAfterBreak="0">
+  <w:abstractNum w:abstractNumId="22" w15:restartNumberingAfterBreak="0">
     <w:nsid w:val="6DFF1014"/>
     <w:multiLevelType w:val="hybridMultilevel"/>
     <w:tmpl w:val="F5B4A4D8"/>
@@ -6659,7 +6966,7 @@
       </w:rPr>
     </w:lvl>
   </w:abstractNum>
-  <w:abstractNum w:abstractNumId="22" w15:restartNumberingAfterBreak="0">
+  <w:abstractNum w:abstractNumId="23" w15:restartNumberingAfterBreak="0">
     <w:nsid w:val="73544086"/>
     <w:multiLevelType w:val="hybridMultilevel"/>
     <w:tmpl w:val="3A3EC374"/>
@@ -6772,7 +7079,7 @@
       </w:rPr>
     </w:lvl>
   </w:abstractNum>
-  <w:abstractNum w:abstractNumId="23" w15:restartNumberingAfterBreak="0">
+  <w:abstractNum w:abstractNumId="24" w15:restartNumberingAfterBreak="0">
     <w:nsid w:val="7B025826"/>
     <w:multiLevelType w:val="hybridMultilevel"/>
     <w:tmpl w:val="E1D2BFBA"/>
@@ -6885,7 +7192,7 @@
       </w:rPr>
     </w:lvl>
   </w:abstractNum>
-  <w:abstractNum w:abstractNumId="24" w15:restartNumberingAfterBreak="0">
+  <w:abstractNum w:abstractNumId="25" w15:restartNumberingAfterBreak="0">
     <w:nsid w:val="7E196842"/>
     <w:multiLevelType w:val="hybridMultilevel"/>
     <w:tmpl w:val="CF3CC654"/>
@@ -6972,79 +7279,82 @@
     </w:lvl>
   </w:abstractNum>
   <w:num w:numId="1" w16cid:durableId="464857354">
-    <w:abstractNumId w:val="7"/>
+    <w:abstractNumId w:val="8"/>
   </w:num>
   <w:num w:numId="2" w16cid:durableId="2132094706">
-    <w:abstractNumId w:val="11"/>
+    <w:abstractNumId w:val="12"/>
   </w:num>
   <w:num w:numId="3" w16cid:durableId="1120807208">
-    <w:abstractNumId w:val="3"/>
+    <w:abstractNumId w:val="4"/>
   </w:num>
   <w:num w:numId="4" w16cid:durableId="1420760374">
-    <w:abstractNumId w:val="22"/>
+    <w:abstractNumId w:val="23"/>
   </w:num>
   <w:num w:numId="5" w16cid:durableId="797988434">
-    <w:abstractNumId w:val="15"/>
+    <w:abstractNumId w:val="16"/>
   </w:num>
   <w:num w:numId="6" w16cid:durableId="793989419">
-    <w:abstractNumId w:val="13"/>
+    <w:abstractNumId w:val="14"/>
   </w:num>
   <w:num w:numId="7" w16cid:durableId="1222250185">
-    <w:abstractNumId w:val="19"/>
+    <w:abstractNumId w:val="20"/>
   </w:num>
   <w:num w:numId="8" w16cid:durableId="2103984881">
-    <w:abstractNumId w:val="17"/>
+    <w:abstractNumId w:val="18"/>
   </w:num>
   <w:num w:numId="9" w16cid:durableId="1830444509">
-    <w:abstractNumId w:val="8"/>
+    <w:abstractNumId w:val="9"/>
   </w:num>
   <w:num w:numId="10" w16cid:durableId="2032996542">
-    <w:abstractNumId w:val="20"/>
+    <w:abstractNumId w:val="21"/>
   </w:num>
   <w:num w:numId="11" w16cid:durableId="1687517679">
-    <w:abstractNumId w:val="10"/>
+    <w:abstractNumId w:val="11"/>
   </w:num>
   <w:num w:numId="12" w16cid:durableId="1926574193">
     <w:abstractNumId w:val="1"/>
   </w:num>
   <w:num w:numId="13" w16cid:durableId="1207912775">
-    <w:abstractNumId w:val="24"/>
+    <w:abstractNumId w:val="25"/>
   </w:num>
   <w:num w:numId="14" w16cid:durableId="552429642">
+    <w:abstractNumId w:val="7"/>
+  </w:num>
+  <w:num w:numId="15" w16cid:durableId="473185906">
+    <w:abstractNumId w:val="22"/>
+  </w:num>
+  <w:num w:numId="16" w16cid:durableId="941036230">
+    <w:abstractNumId w:val="19"/>
+  </w:num>
+  <w:num w:numId="17" w16cid:durableId="1867252939">
+    <w:abstractNumId w:val="3"/>
+  </w:num>
+  <w:num w:numId="18" w16cid:durableId="921916503">
+    <w:abstractNumId w:val="17"/>
+  </w:num>
+  <w:num w:numId="19" w16cid:durableId="1884714066">
+    <w:abstractNumId w:val="15"/>
+  </w:num>
+  <w:num w:numId="20" w16cid:durableId="1992170471">
     <w:abstractNumId w:val="6"/>
   </w:num>
-  <w:num w:numId="15" w16cid:durableId="473185906">
-    <w:abstractNumId w:val="21"/>
+  <w:num w:numId="21" w16cid:durableId="439110421">
+    <w:abstractNumId w:val="13"/>
   </w:num>
-  <w:num w:numId="16" w16cid:durableId="941036230">
-    <w:abstractNumId w:val="18"/>
-  </w:num>
-  <w:num w:numId="17" w16cid:durableId="1867252939">
-    <w:abstractNumId w:val="2"/>
-  </w:num>
-  <w:num w:numId="18" w16cid:durableId="921916503">
-    <w:abstractNumId w:val="16"/>
-  </w:num>
-  <w:num w:numId="19" w16cid:durableId="1884714066">
-    <w:abstractNumId w:val="14"/>
-  </w:num>
-  <w:num w:numId="20" w16cid:durableId="1992170471">
+  <w:num w:numId="22" w16cid:durableId="1329364920">
     <w:abstractNumId w:val="5"/>
   </w:num>
-  <w:num w:numId="21" w16cid:durableId="439110421">
-    <w:abstractNumId w:val="12"/>
-  </w:num>
-  <w:num w:numId="22" w16cid:durableId="1329364920">
-    <w:abstractNumId w:val="4"/>
-  </w:num>
   <w:num w:numId="23" w16cid:durableId="584220299">
-    <w:abstractNumId w:val="23"/>
+    <w:abstractNumId w:val="24"/>
   </w:num>
   <w:num w:numId="24" w16cid:durableId="834800313">
     <w:abstractNumId w:val="0"/>
   </w:num>
   <w:num w:numId="25" w16cid:durableId="50080554">
-    <w:abstractNumId w:val="9"/>
+    <w:abstractNumId w:val="10"/>
+  </w:num>
+  <w:num w:numId="26" w16cid:durableId="1493990501">
+    <w:abstractNumId w:val="2"/>
   </w:num>
 </w:numbering>
 </file>

</xml_diff>